<commit_message>
Slides: compact 2-column grid, all 10 slides on one page in docx
Co-Authored-By: Claude Sonnet 4.6 <noreply@anthropic.com>
</commit_message>
<xml_diff>
--- a/CENG479_Sub2_Final_Report.docx
+++ b/CENG479_Sub2_Final_Report.docx
@@ -10349,1613 +10349,1790 @@
     </w:p>
     <w:p>
       <w:pPr>
-        <w:spacing w:after="80" w:before="0"/>
+        <w:spacing w:after="40" w:before="0"/>
       </w:pPr>
     </w:p>
-    <w:p>
-      <w:pPr>
-        <w:spacing w:before="120" w:after="0"/>
-        <w:shd w:val="clear" w:color="auto" w:fill="1a3a6b"/>
-      </w:pPr>
-      <w:r>
-        <w:rPr>
-          <w:b/>
-          <w:i w:val="0"/>
-          <w:color w:val="F0C040"/>
-          <w:sz w:val="18"/>
-        </w:rPr>
-        <w:t xml:space="preserve">  1  </w:t>
-      </w:r>
-      <w:r>
-        <w:rPr>
-          <w:b/>
-          <w:i w:val="0"/>
-          <w:color w:val="FFFFFF"/>
-          <w:sz w:val="24"/>
-        </w:rPr>
-        <w:t xml:space="preserve">  Parallel Image Processing Engine</w:t>
-      </w:r>
-    </w:p>
-    <w:p>
-      <w:pPr>
-        <w:spacing w:before="0" w:after="60"/>
-        <w:shd w:val="clear" w:color="auto" w:fill="1e4070"/>
-      </w:pPr>
-    </w:p>
-    <w:p>
-      <w:pPr>
-        <w:spacing w:before="0" w:after="20"/>
-        <w:shd w:val="clear" w:color="auto" w:fill="1e4070"/>
+    <w:tbl>
+      <w:tblPr>
+        <w:tblStyle w:val="TableGrid"/>
+        <w:tblW w:type="auto" w:w="0"/>
         <w:jc w:val="center"/>
-      </w:pPr>
-      <w:r>
-        <w:rPr>
-          <w:b w:val="0"/>
-          <w:i/>
-          <w:color w:val="AACCEE"/>
-          <w:sz w:val="18"/>
-        </w:rPr>
-        <w:t>CENG 479 — Parallel Computing  |  Gazi University  |  Spring 2026</w:t>
-      </w:r>
-    </w:p>
-    <w:p>
-      <w:pPr>
-        <w:spacing w:before="0" w:after="20"/>
-        <w:shd w:val="clear" w:color="auto" w:fill="1e4070"/>
-        <w:jc w:val="center"/>
-      </w:pPr>
-      <w:r>
-        <w:rPr>
-          <w:b w:val="0"/>
-          <w:i/>
-          <w:color w:val="AACCEE"/>
-          <w:sz w:val="18"/>
-        </w:rPr>
-        <w:t>Muhammed Cakiagoz   ·   Musa Bilal Yaz</w:t>
-      </w:r>
-    </w:p>
-    <w:p>
-      <w:pPr>
-        <w:spacing w:before="0" w:after="60"/>
-        <w:shd w:val="clear" w:color="auto" w:fill="1e4070"/>
-      </w:pPr>
-    </w:p>
-    <w:p>
-      <w:pPr>
-        <w:spacing w:before="0" w:after="20"/>
-        <w:shd w:val="clear" w:color="auto" w:fill="1e4070"/>
-        <w:jc w:val="center"/>
-      </w:pPr>
-      <w:r>
-        <w:rPr>
-          <w:b w:val="0"/>
-          <w:i/>
-          <w:color w:val="AACCEE"/>
-          <w:sz w:val="18"/>
-        </w:rPr>
-        <w:t>https://github.com/Muhammedcakirgoz/parallel-image-processing</w:t>
-      </w:r>
-    </w:p>
-    <w:p>
-      <w:pPr>
-        <w:spacing w:before="0" w:after="160"/>
-        <w:jc w:val="center"/>
-        <w:shd w:val="clear" w:color="auto" w:fill="0d2244"/>
-      </w:pPr>
-      <w:r>
-        <w:rPr>
-          <w:b w:val="0"/>
-          <w:i/>
-          <w:color w:val="F0C040"/>
-          <w:sz w:val="15"/>
-        </w:rPr>
-        <w:t xml:space="preserve">  Java Threads | ExecutorService | ForkJoinPool | JMH Benchmark  </w:t>
-      </w:r>
-    </w:p>
-    <w:p>
-      <w:pPr>
-        <w:spacing w:before="120" w:after="0"/>
-        <w:shd w:val="clear" w:color="auto" w:fill="1a3a6b"/>
-      </w:pPr>
-      <w:r>
-        <w:rPr>
-          <w:b/>
-          <w:i w:val="0"/>
-          <w:color w:val="F0C040"/>
-          <w:sz w:val="18"/>
-        </w:rPr>
-        <w:t xml:space="preserve">  2  </w:t>
-      </w:r>
-      <w:r>
-        <w:rPr>
-          <w:b/>
-          <w:i w:val="0"/>
-          <w:color w:val="FFFFFF"/>
-          <w:sz w:val="24"/>
-        </w:rPr>
-        <w:t xml:space="preserve">  Problem &amp; Motivation</w:t>
-      </w:r>
-    </w:p>
-    <w:p>
-      <w:pPr>
-        <w:spacing w:before="0" w:after="20"/>
-        <w:shd w:val="clear" w:color="auto" w:fill="1e4070"/>
-        <w:ind w:left="454"/>
-      </w:pPr>
-      <w:r>
-        <w:rPr>
-          <w:b w:val="0"/>
-          <w:i w:val="0"/>
-          <w:color w:val="F0C040"/>
-          <w:sz w:val="18"/>
-        </w:rPr>
-        <w:t xml:space="preserve">  •  </w:t>
-      </w:r>
-      <w:r>
-        <w:rPr>
-          <w:b w:val="0"/>
-          <w:i w:val="0"/>
-          <w:color w:val="FFFFFF"/>
-          <w:sz w:val="18"/>
-        </w:rPr>
-        <w:t>High-resolution image filtering (4K+) is slow on a single thread</w:t>
-      </w:r>
-    </w:p>
-    <w:p>
-      <w:pPr>
-        <w:spacing w:before="0" w:after="20"/>
-        <w:shd w:val="clear" w:color="auto" w:fill="1e4070"/>
-        <w:ind w:left="454"/>
-      </w:pPr>
-      <w:r>
-        <w:rPr>
-          <w:b w:val="0"/>
-          <w:i w:val="0"/>
-          <w:color w:val="F0C040"/>
-          <w:sz w:val="18"/>
-        </w:rPr>
-        <w:t xml:space="preserve">  •  </w:t>
-      </w:r>
-      <w:r>
-        <w:rPr>
-          <w:b w:val="0"/>
-          <w:i w:val="0"/>
-          <w:color w:val="FFFFFF"/>
-          <w:sz w:val="18"/>
-        </w:rPr>
-        <w:t>Convolution cost: O(W x H x K^2) per filter — bottleneck at scale</w:t>
-      </w:r>
-    </w:p>
-    <w:p>
-      <w:pPr>
-        <w:spacing w:before="0" w:after="20"/>
-        <w:shd w:val="clear" w:color="auto" w:fill="1e4070"/>
-        <w:ind w:left="454"/>
-      </w:pPr>
-      <w:r>
-        <w:rPr>
-          <w:b w:val="0"/>
-          <w:i w:val="0"/>
-          <w:color w:val="F0C040"/>
-          <w:sz w:val="18"/>
-        </w:rPr>
-        <w:t xml:space="preserve">  •  </w:t>
-      </w:r>
-      <w:r>
-        <w:rPr>
-          <w:b w:val="0"/>
-          <w:i w:val="0"/>
-          <w:color w:val="FFFFFF"/>
-          <w:sz w:val="18"/>
-        </w:rPr>
-        <w:t>Each output pixel is INDEPENDENT — embarrassingly parallel</w:t>
-      </w:r>
-    </w:p>
-    <w:p>
-      <w:pPr>
-        <w:spacing w:before="0" w:after="20"/>
-        <w:shd w:val="clear" w:color="auto" w:fill="1e4070"/>
-        <w:ind w:left="454"/>
-      </w:pPr>
-      <w:r>
-        <w:rPr>
-          <w:b w:val="0"/>
-          <w:i w:val="0"/>
-          <w:color w:val="F0C040"/>
-          <w:sz w:val="18"/>
-        </w:rPr>
-        <w:t xml:space="preserve">  •  </w:t>
-      </w:r>
-      <w:r>
-        <w:rPr>
-          <w:b w:val="0"/>
-          <w:i w:val="0"/>
-          <w:color w:val="FFFFFF"/>
-          <w:sz w:val="18"/>
-        </w:rPr>
-        <w:t>Goal: multi-threaded speedup with zero correctness compromise</w:t>
-      </w:r>
-    </w:p>
-    <w:p>
-      <w:pPr>
-        <w:spacing w:before="0" w:after="60"/>
-        <w:shd w:val="clear" w:color="auto" w:fill="1e4070"/>
-      </w:pPr>
-    </w:p>
-    <w:p>
-      <w:pPr>
-        <w:spacing w:before="0" w:after="20"/>
-        <w:shd w:val="clear" w:color="auto" w:fill="1e4070"/>
-        <w:jc w:val="center"/>
-      </w:pPr>
-      <w:r>
-        <w:rPr>
-          <w:b w:val="0"/>
-          <w:i/>
-          <w:color w:val="AACCEE"/>
-          <w:sz w:val="18"/>
-        </w:rPr>
-        <w:t>Amdahl's Law: S = 1/(1-p)  —  p ~ 0.95 for Gaussian Blur</w:t>
-      </w:r>
-    </w:p>
-    <w:p>
-      <w:pPr>
-        <w:spacing w:before="0" w:after="160"/>
-        <w:jc w:val="center"/>
-        <w:shd w:val="clear" w:color="auto" w:fill="0d2244"/>
-      </w:pPr>
-      <w:r>
-        <w:rPr>
-          <w:b w:val="0"/>
-          <w:i/>
-          <w:color w:val="F0C040"/>
-          <w:sz w:val="15"/>
-        </w:rPr>
-        <w:t xml:space="preserve">  Theoretical max speedup ~20x at p=0.95  </w:t>
-      </w:r>
-    </w:p>
-    <w:p>
-      <w:pPr>
-        <w:spacing w:before="120" w:after="0"/>
-        <w:shd w:val="clear" w:color="auto" w:fill="1a3a6b"/>
-      </w:pPr>
-      <w:r>
-        <w:rPr>
-          <w:b/>
-          <w:i w:val="0"/>
-          <w:color w:val="F0C040"/>
-          <w:sz w:val="18"/>
-        </w:rPr>
-        <w:t xml:space="preserve">  3  </w:t>
-      </w:r>
-      <w:r>
-        <w:rPr>
-          <w:b/>
-          <w:i w:val="0"/>
-          <w:color w:val="FFFFFF"/>
-          <w:sz w:val="24"/>
-        </w:rPr>
-        <w:t xml:space="preserve">  Architecture Overview</w:t>
-      </w:r>
-    </w:p>
-    <w:p>
-      <w:pPr>
-        <w:spacing w:before="0" w:after="20"/>
-        <w:shd w:val="clear" w:color="auto" w:fill="1e4070"/>
-        <w:ind w:left="227"/>
-      </w:pPr>
-      <w:r>
-        <w:rPr>
-          <w:b/>
-          <w:i w:val="0"/>
-          <w:color w:val="F0C040"/>
-          <w:sz w:val="18"/>
-        </w:rPr>
-        <w:t xml:space="preserve">  Filters:</w:t>
-      </w:r>
-    </w:p>
-    <w:p>
-      <w:pPr>
-        <w:spacing w:before="0" w:after="20"/>
-        <w:shd w:val="clear" w:color="auto" w:fill="1e4070"/>
-        <w:ind w:left="454"/>
-      </w:pPr>
-      <w:r>
-        <w:rPr>
-          <w:b w:val="0"/>
-          <w:i w:val="0"/>
-          <w:color w:val="F0C040"/>
-          <w:sz w:val="18"/>
-        </w:rPr>
-        <w:t xml:space="preserve">  •  </w:t>
-      </w:r>
-      <w:r>
-        <w:rPr>
-          <w:b w:val="0"/>
-          <w:i w:val="0"/>
-          <w:color w:val="FFFFFF"/>
-          <w:sz w:val="18"/>
-        </w:rPr>
-        <w:t>Grayscale (point-wise), Gaussian Blur 5x5, Sobel 3x3</w:t>
-      </w:r>
-    </w:p>
-    <w:p>
-      <w:pPr>
-        <w:spacing w:before="0" w:after="20"/>
-        <w:shd w:val="clear" w:color="auto" w:fill="1e4070"/>
-        <w:ind w:left="227"/>
-      </w:pPr>
-      <w:r>
-        <w:rPr>
-          <w:b/>
-          <w:i w:val="0"/>
-          <w:color w:val="F0C040"/>
-          <w:sz w:val="18"/>
-        </w:rPr>
-        <w:t xml:space="preserve">  Implementations:</w:t>
-      </w:r>
-    </w:p>
-    <w:p>
-      <w:pPr>
-        <w:spacing w:before="0" w:after="20"/>
-        <w:shd w:val="clear" w:color="auto" w:fill="1e4070"/>
-        <w:ind w:left="454"/>
-      </w:pPr>
-      <w:r>
-        <w:rPr>
-          <w:b w:val="0"/>
-          <w:i w:val="0"/>
-          <w:color w:val="F0C040"/>
-          <w:sz w:val="18"/>
-        </w:rPr>
-        <w:t xml:space="preserve">  •  </w:t>
-      </w:r>
-      <w:r>
-        <w:rPr>
-          <w:b w:val="0"/>
-          <w:i w:val="0"/>
-          <w:color w:val="FFFFFF"/>
-          <w:sz w:val="18"/>
-        </w:rPr>
-        <w:t>SequentialProcessor — single-thread baseline</w:t>
-      </w:r>
-    </w:p>
-    <w:p>
-      <w:pPr>
-        <w:spacing w:before="0" w:after="20"/>
-        <w:shd w:val="clear" w:color="auto" w:fill="1e4070"/>
-        <w:ind w:left="454"/>
-      </w:pPr>
-      <w:r>
-        <w:rPr>
-          <w:b w:val="0"/>
-          <w:i w:val="0"/>
-          <w:color w:val="F0C040"/>
-          <w:sz w:val="18"/>
-        </w:rPr>
-        <w:t xml:space="preserve">  •  </w:t>
-      </w:r>
-      <w:r>
-        <w:rPr>
-          <w:b w:val="0"/>
-          <w:i w:val="0"/>
-          <w:color w:val="FFFFFF"/>
-          <w:sz w:val="18"/>
-        </w:rPr>
-        <w:t>ExecutorParallelProcessor — fixed pool + horizontal strips</w:t>
-      </w:r>
-    </w:p>
-    <w:p>
-      <w:pPr>
-        <w:spacing w:before="0" w:after="20"/>
-        <w:shd w:val="clear" w:color="auto" w:fill="1e4070"/>
-        <w:ind w:left="454"/>
-      </w:pPr>
-      <w:r>
-        <w:rPr>
-          <w:b w:val="0"/>
-          <w:i w:val="0"/>
-          <w:color w:val="F0C040"/>
-          <w:sz w:val="18"/>
-        </w:rPr>
-        <w:t xml:space="preserve">  •  </w:t>
-      </w:r>
-      <w:r>
-        <w:rPr>
-          <w:b w:val="0"/>
-          <w:i w:val="0"/>
-          <w:color w:val="FFFFFF"/>
-          <w:sz w:val="18"/>
-        </w:rPr>
-        <w:t>ForkJoinParallelProcessor — RecursiveAction + work-stealing</w:t>
-      </w:r>
-    </w:p>
-    <w:p>
-      <w:pPr>
-        <w:spacing w:before="0" w:after="20"/>
-        <w:shd w:val="clear" w:color="auto" w:fill="1e4070"/>
-        <w:ind w:left="227"/>
-      </w:pPr>
-      <w:r>
-        <w:rPr>
-          <w:b/>
-          <w:i w:val="0"/>
-          <w:color w:val="F0C040"/>
-          <w:sz w:val="18"/>
-        </w:rPr>
-        <w:t xml:space="preserve">  Tools:</w:t>
-      </w:r>
-    </w:p>
-    <w:p>
-      <w:pPr>
-        <w:spacing w:before="0" w:after="20"/>
-        <w:shd w:val="clear" w:color="auto" w:fill="1e4070"/>
-        <w:ind w:left="454"/>
-      </w:pPr>
-      <w:r>
-        <w:rPr>
-          <w:b w:val="0"/>
-          <w:i w:val="0"/>
-          <w:color w:val="F0C040"/>
-          <w:sz w:val="18"/>
-        </w:rPr>
-        <w:t xml:space="preserve">  •  </w:t>
-      </w:r>
-      <w:r>
-        <w:rPr>
-          <w:b w:val="0"/>
-          <w:i w:val="0"/>
-          <w:color w:val="FFFFFF"/>
-          <w:sz w:val="18"/>
-        </w:rPr>
-        <w:t>CorrectnessVerifier + JMH Benchmark</w:t>
-      </w:r>
-    </w:p>
-    <w:p>
-      <w:pPr>
-        <w:spacing w:before="0" w:after="160"/>
-        <w:jc w:val="center"/>
-        <w:shd w:val="clear" w:color="auto" w:fill="0d2244"/>
-      </w:pPr>
-      <w:r>
-        <w:rPr>
-          <w:b w:val="0"/>
-          <w:i/>
-          <w:color w:val="F0C040"/>
-          <w:sz w:val="15"/>
-        </w:rPr>
-        <w:t xml:space="preserve">  All source code publicly available on GitHub  </w:t>
-      </w:r>
-    </w:p>
-    <w:p>
-      <w:pPr>
-        <w:spacing w:before="120" w:after="0"/>
-        <w:shd w:val="clear" w:color="auto" w:fill="1a3a6b"/>
-      </w:pPr>
-      <w:r>
-        <w:rPr>
-          <w:b/>
-          <w:i w:val="0"/>
-          <w:color w:val="F0C040"/>
-          <w:sz w:val="18"/>
-        </w:rPr>
-        <w:t xml:space="preserve">  4  </w:t>
-      </w:r>
-      <w:r>
-        <w:rPr>
-          <w:b/>
-          <w:i w:val="0"/>
-          <w:color w:val="FFFFFF"/>
-          <w:sz w:val="24"/>
-        </w:rPr>
-        <w:t xml:space="preserve">  ExecutorService Design</w:t>
-      </w:r>
-    </w:p>
-    <w:p>
-      <w:pPr>
-        <w:spacing w:before="0" w:after="20"/>
-        <w:shd w:val="clear" w:color="auto" w:fill="1e4070"/>
-        <w:ind w:left="454"/>
-      </w:pPr>
-      <w:r>
-        <w:rPr>
-          <w:b w:val="0"/>
-          <w:i w:val="0"/>
-          <w:color w:val="F0C040"/>
-          <w:sz w:val="18"/>
-        </w:rPr>
-        <w:t xml:space="preserve">  •  </w:t>
-      </w:r>
-      <w:r>
-        <w:rPr>
-          <w:b w:val="0"/>
-          <w:i w:val="0"/>
-          <w:color w:val="FFFFFF"/>
-          <w:sz w:val="18"/>
-        </w:rPr>
-        <w:t>Image split into N equal horizontal strips (N = thread count)</w:t>
-      </w:r>
-    </w:p>
-    <w:p>
-      <w:pPr>
-        <w:spacing w:before="0" w:after="20"/>
-        <w:shd w:val="clear" w:color="auto" w:fill="1e4070"/>
-        <w:ind w:left="454"/>
-      </w:pPr>
-      <w:r>
-        <w:rPr>
-          <w:b w:val="0"/>
-          <w:i w:val="0"/>
-          <w:color w:val="F0C040"/>
-          <w:sz w:val="18"/>
-        </w:rPr>
-        <w:t xml:space="preserve">  •  </w:t>
-      </w:r>
-      <w:r>
-        <w:rPr>
-          <w:b w:val="0"/>
-          <w:i w:val="0"/>
-          <w:color w:val="FFFFFF"/>
-          <w:sz w:val="18"/>
-        </w:rPr>
-        <w:t>Each Callable processes rows [start, end) with no locking</w:t>
-      </w:r>
-    </w:p>
-    <w:p>
-      <w:pPr>
-        <w:spacing w:before="0" w:after="20"/>
-        <w:shd w:val="clear" w:color="auto" w:fill="1e4070"/>
-        <w:ind w:left="454"/>
-      </w:pPr>
-      <w:r>
-        <w:rPr>
-          <w:b w:val="0"/>
-          <w:i w:val="0"/>
-          <w:color w:val="F0C040"/>
-          <w:sz w:val="18"/>
-        </w:rPr>
-        <w:t xml:space="preserve">  •  </w:t>
-      </w:r>
-      <w:r>
-        <w:rPr>
-          <w:b w:val="0"/>
-          <w:i w:val="0"/>
-          <w:color w:val="FFFFFF"/>
-          <w:sz w:val="18"/>
-        </w:rPr>
-        <w:t>Source array is READ-ONLY — zero synchronisation overhead</w:t>
-      </w:r>
-    </w:p>
-    <w:p>
-      <w:pPr>
-        <w:spacing w:before="0" w:after="20"/>
-        <w:shd w:val="clear" w:color="auto" w:fill="1e4070"/>
-        <w:ind w:left="454"/>
-      </w:pPr>
-      <w:r>
-        <w:rPr>
-          <w:b w:val="0"/>
-          <w:i w:val="0"/>
-          <w:color w:val="F0C040"/>
-          <w:sz w:val="18"/>
-        </w:rPr>
-        <w:t xml:space="preserve">  •  </w:t>
-      </w:r>
-      <w:r>
-        <w:rPr>
-          <w:b w:val="0"/>
-          <w:i w:val="0"/>
-          <w:color w:val="FFFFFF"/>
-          <w:sz w:val="18"/>
-        </w:rPr>
-        <w:t>Thread pool created once, reused via try-with-resources</w:t>
-      </w:r>
-    </w:p>
-    <w:p>
-      <w:pPr>
-        <w:spacing w:before="0" w:after="60"/>
-        <w:shd w:val="clear" w:color="auto" w:fill="1e4070"/>
-      </w:pPr>
-    </w:p>
-    <w:p>
-      <w:pPr>
-        <w:spacing w:before="0" w:after="20"/>
-        <w:shd w:val="clear" w:color="auto" w:fill="1e4070"/>
-        <w:jc w:val="center"/>
-      </w:pPr>
-      <w:r>
-        <w:rPr>
-          <w:b w:val="0"/>
-          <w:i/>
-          <w:color w:val="AACCEE"/>
-          <w:sz w:val="18"/>
-        </w:rPr>
-        <w:t>Strip[i] covers rows:  i*(H/N)  to  (i+1)*(H/N)</w:t>
-      </w:r>
-    </w:p>
-    <w:p>
-      <w:pPr>
-        <w:spacing w:before="0" w:after="160"/>
-        <w:jc w:val="center"/>
-        <w:shd w:val="clear" w:color="auto" w:fill="0d2244"/>
-      </w:pPr>
-      <w:r>
-        <w:rPr>
-          <w:b w:val="0"/>
-          <w:i/>
-          <w:color w:val="F0C040"/>
-          <w:sz w:val="15"/>
-        </w:rPr>
-        <w:t xml:space="preserve">  Static decomposition — optimal for uniform workloads  </w:t>
-      </w:r>
-    </w:p>
-    <w:p>
-      <w:pPr>
-        <w:spacing w:before="120" w:after="0"/>
-        <w:shd w:val="clear" w:color="auto" w:fill="1a3a6b"/>
-      </w:pPr>
-      <w:r>
-        <w:rPr>
-          <w:b/>
-          <w:i w:val="0"/>
-          <w:color w:val="F0C040"/>
-          <w:sz w:val="18"/>
-        </w:rPr>
-        <w:t xml:space="preserve">  5  </w:t>
-      </w:r>
-      <w:r>
-        <w:rPr>
-          <w:b/>
-          <w:i w:val="0"/>
-          <w:color w:val="FFFFFF"/>
-          <w:sz w:val="24"/>
-        </w:rPr>
-        <w:t xml:space="preserve">  ForkJoinPool Design</w:t>
-      </w:r>
-    </w:p>
-    <w:p>
-      <w:pPr>
-        <w:spacing w:before="0" w:after="20"/>
-        <w:shd w:val="clear" w:color="auto" w:fill="1e4070"/>
-        <w:ind w:left="454"/>
-      </w:pPr>
-      <w:r>
-        <w:rPr>
-          <w:b w:val="0"/>
-          <w:i w:val="0"/>
-          <w:color w:val="F0C040"/>
-          <w:sz w:val="18"/>
-        </w:rPr>
-        <w:t xml:space="preserve">  •  </w:t>
-      </w:r>
-      <w:r>
-        <w:rPr>
-          <w:b w:val="0"/>
-          <w:i w:val="0"/>
-          <w:color w:val="FFFFFF"/>
-          <w:sz w:val="18"/>
-        </w:rPr>
-        <w:t>RecursiveAction splits row range in half recursively</w:t>
-      </w:r>
-    </w:p>
-    <w:p>
-      <w:pPr>
-        <w:spacing w:before="0" w:after="20"/>
-        <w:shd w:val="clear" w:color="auto" w:fill="1e4070"/>
-        <w:ind w:left="454"/>
-      </w:pPr>
-      <w:r>
-        <w:rPr>
-          <w:b w:val="0"/>
-          <w:i w:val="0"/>
-          <w:color w:val="F0C040"/>
-          <w:sz w:val="18"/>
-        </w:rPr>
-        <w:t xml:space="preserve">  •  </w:t>
-      </w:r>
-      <w:r>
-        <w:rPr>
-          <w:b w:val="0"/>
-          <w:i w:val="0"/>
-          <w:color w:val="FFFFFF"/>
-          <w:sz w:val="18"/>
-        </w:rPr>
-        <w:t>Base case: range &lt;= 64 rows — process sequentially</w:t>
-      </w:r>
-    </w:p>
-    <w:p>
-      <w:pPr>
-        <w:spacing w:before="0" w:after="20"/>
-        <w:shd w:val="clear" w:color="auto" w:fill="1e4070"/>
-        <w:ind w:left="454"/>
-      </w:pPr>
-      <w:r>
-        <w:rPr>
-          <w:b w:val="0"/>
-          <w:i w:val="0"/>
-          <w:color w:val="F0C040"/>
-          <w:sz w:val="18"/>
-        </w:rPr>
-        <w:t xml:space="preserve">  •  </w:t>
-      </w:r>
-      <w:r>
-        <w:rPr>
-          <w:b w:val="0"/>
-          <w:i w:val="0"/>
-          <w:color w:val="FFFFFF"/>
-          <w:sz w:val="18"/>
-        </w:rPr>
-        <w:t>Work-stealing: idle threads steal tasks from busy queues</w:t>
-      </w:r>
-    </w:p>
-    <w:p>
-      <w:pPr>
-        <w:spacing w:before="0" w:after="20"/>
-        <w:shd w:val="clear" w:color="auto" w:fill="1e4070"/>
-        <w:ind w:left="454"/>
-      </w:pPr>
-      <w:r>
-        <w:rPr>
-          <w:b w:val="0"/>
-          <w:i w:val="0"/>
-          <w:color w:val="F0C040"/>
-          <w:sz w:val="18"/>
-        </w:rPr>
-        <w:t xml:space="preserve">  •  </w:t>
-      </w:r>
-      <w:r>
-        <w:rPr>
-          <w:b w:val="0"/>
-          <w:i w:val="0"/>
-          <w:color w:val="FFFFFF"/>
-          <w:sz w:val="18"/>
-        </w:rPr>
-        <w:t>Better dynamic load balance than static strips for large images</w:t>
-      </w:r>
-    </w:p>
-    <w:p>
-      <w:pPr>
-        <w:spacing w:before="0" w:after="60"/>
-        <w:shd w:val="clear" w:color="auto" w:fill="1e4070"/>
-      </w:pPr>
-    </w:p>
-    <w:p>
-      <w:pPr>
-        <w:spacing w:before="0" w:after="20"/>
-        <w:shd w:val="clear" w:color="auto" w:fill="1e4070"/>
-        <w:ind w:left="454"/>
-      </w:pPr>
-      <w:r>
-        <w:rPr>
-          <w:b w:val="0"/>
-          <w:i w:val="0"/>
-          <w:color w:val="F0C040"/>
-          <w:sz w:val="18"/>
-        </w:rPr>
-        <w:t xml:space="preserve">  •  </w:t>
-      </w:r>
-      <w:r>
-        <w:rPr>
-          <w:b w:val="0"/>
-          <w:i w:val="0"/>
-          <w:color w:val="FFFFFF"/>
-          <w:sz w:val="18"/>
-        </w:rPr>
-        <w:t>ForkJoin outperforms Executor on 2048x2048 (Gaussian: 4.81x vs 4.30x)</w:t>
-      </w:r>
-    </w:p>
-    <w:p>
-      <w:pPr>
-        <w:spacing w:before="0" w:after="160"/>
-        <w:jc w:val="center"/>
-        <w:shd w:val="clear" w:color="auto" w:fill="0d2244"/>
-      </w:pPr>
-      <w:r>
-        <w:rPr>
-          <w:b w:val="0"/>
-          <w:i/>
-          <w:color w:val="F0C040"/>
-          <w:sz w:val="15"/>
-        </w:rPr>
-        <w:t xml:space="preserve">  Dynamic decomposition — adapts to runtime load imbalance  </w:t>
-      </w:r>
-    </w:p>
-    <w:p>
-      <w:pPr>
-        <w:spacing w:before="120" w:after="0"/>
-        <w:shd w:val="clear" w:color="auto" w:fill="1a3a6b"/>
-      </w:pPr>
-      <w:r>
-        <w:rPr>
-          <w:b/>
-          <w:i w:val="0"/>
-          <w:color w:val="F0C040"/>
-          <w:sz w:val="18"/>
-        </w:rPr>
-        <w:t xml:space="preserve">  6  </w:t>
-      </w:r>
-      <w:r>
-        <w:rPr>
-          <w:b/>
-          <w:i w:val="0"/>
-          <w:color w:val="FFFFFF"/>
-          <w:sz w:val="24"/>
-        </w:rPr>
-        <w:t xml:space="preserve">  Correctness Verification</w:t>
-      </w:r>
-    </w:p>
-    <w:p>
-      <w:pPr>
-        <w:spacing w:before="0" w:after="20"/>
-        <w:shd w:val="clear" w:color="auto" w:fill="1e4070"/>
-        <w:jc w:val="center"/>
-      </w:pPr>
-      <w:r>
-        <w:rPr>
-          <w:b w:val="0"/>
-          <w:i/>
-          <w:color w:val="AACCEE"/>
-          <w:sz w:val="18"/>
-        </w:rPr>
-        <w:t>CorrectnessVerifier.firstDifference() — pixel-by-pixel scan</w:t>
-      </w:r>
-    </w:p>
-    <w:p>
-      <w:pPr>
-        <w:spacing w:before="0" w:after="60"/>
-        <w:shd w:val="clear" w:color="auto" w:fill="1e4070"/>
-      </w:pPr>
-    </w:p>
-    <w:p>
-      <w:pPr>
-        <w:spacing w:before="0" w:after="20"/>
-        <w:shd w:val="clear" w:color="auto" w:fill="1e4070"/>
-        <w:jc w:val="center"/>
-      </w:pPr>
-      <w:r>
-        <w:rPr>
-          <w:b w:val="0"/>
-          <w:i/>
-          <w:color w:val="AACCEE"/>
-          <w:sz w:val="18"/>
-        </w:rPr>
-        <w:t>Tested on 2048x2048 synthetic image — ALL 6 combinations PASS</w:t>
-      </w:r>
-    </w:p>
-    <w:p>
-      <w:pPr>
-        <w:spacing w:before="0" w:after="60"/>
-        <w:shd w:val="clear" w:color="auto" w:fill="1e4070"/>
-      </w:pPr>
-    </w:p>
-    <w:p>
-      <w:pPr>
-        <w:spacing w:before="0" w:after="20"/>
-        <w:shd w:val="clear" w:color="auto" w:fill="1e4070"/>
-        <w:ind w:left="454"/>
-      </w:pPr>
-      <w:r>
-        <w:rPr>
-          <w:b w:val="0"/>
-          <w:i w:val="0"/>
-          <w:color w:val="F0C040"/>
-          <w:sz w:val="18"/>
-        </w:rPr>
-        <w:t xml:space="preserve">  •  </w:t>
-      </w:r>
-      <w:r>
-        <w:rPr>
-          <w:b w:val="0"/>
-          <w:i w:val="0"/>
-          <w:color w:val="FFFFFF"/>
-          <w:sz w:val="18"/>
-        </w:rPr>
-        <w:t>Grayscale:       Executor PASS  |  ForkJoin PASS</w:t>
-      </w:r>
-    </w:p>
-    <w:p>
-      <w:pPr>
-        <w:spacing w:before="0" w:after="20"/>
-        <w:shd w:val="clear" w:color="auto" w:fill="1e4070"/>
-        <w:ind w:left="454"/>
-      </w:pPr>
-      <w:r>
-        <w:rPr>
-          <w:b w:val="0"/>
-          <w:i w:val="0"/>
-          <w:color w:val="F0C040"/>
-          <w:sz w:val="18"/>
-        </w:rPr>
-        <w:t xml:space="preserve">  •  </w:t>
-      </w:r>
-      <w:r>
-        <w:rPr>
-          <w:b w:val="0"/>
-          <w:i w:val="0"/>
-          <w:color w:val="FFFFFF"/>
-          <w:sz w:val="18"/>
-        </w:rPr>
-        <w:t>GaussianBlur5x5: Executor PASS  |  ForkJoin PASS</w:t>
-      </w:r>
-    </w:p>
-    <w:p>
-      <w:pPr>
-        <w:spacing w:before="0" w:after="20"/>
-        <w:shd w:val="clear" w:color="auto" w:fill="1e4070"/>
-        <w:ind w:left="454"/>
-      </w:pPr>
-      <w:r>
-        <w:rPr>
-          <w:b w:val="0"/>
-          <w:i w:val="0"/>
-          <w:color w:val="F0C040"/>
-          <w:sz w:val="18"/>
-        </w:rPr>
-        <w:t xml:space="preserve">  •  </w:t>
-      </w:r>
-      <w:r>
-        <w:rPr>
-          <w:b w:val="0"/>
-          <w:i w:val="0"/>
-          <w:color w:val="FFFFFF"/>
-          <w:sz w:val="18"/>
-        </w:rPr>
-        <w:t>Sobel3x3:        Executor PASS  |  ForkJoin PASS</w:t>
-      </w:r>
-    </w:p>
-    <w:p>
-      <w:pPr>
-        <w:spacing w:before="0" w:after="160"/>
-        <w:jc w:val="center"/>
-        <w:shd w:val="clear" w:color="auto" w:fill="0d2244"/>
-      </w:pPr>
-      <w:r>
-        <w:rPr>
-          <w:b w:val="0"/>
-          <w:i/>
-          <w:color w:val="F0C040"/>
-          <w:sz w:val="15"/>
-        </w:rPr>
-        <w:t xml:space="preserve">  Bit-identical output to sequential baseline in all cases  </w:t>
-      </w:r>
-    </w:p>
-    <w:p>
-      <w:pPr>
-        <w:spacing w:before="120" w:after="0"/>
-        <w:shd w:val="clear" w:color="auto" w:fill="1a3a6b"/>
-      </w:pPr>
-      <w:r>
-        <w:rPr>
-          <w:b/>
-          <w:i w:val="0"/>
-          <w:color w:val="F0C040"/>
-          <w:sz w:val="18"/>
-        </w:rPr>
-        <w:t xml:space="preserve">  7  </w:t>
-      </w:r>
-      <w:r>
-        <w:rPr>
-          <w:b/>
-          <w:i w:val="0"/>
-          <w:color w:val="FFFFFF"/>
-          <w:sz w:val="24"/>
-        </w:rPr>
-        <w:t xml:space="preserve">  Performance Results (8 threads, 2048x2048)</w:t>
-      </w:r>
-    </w:p>
-    <w:p>
-      <w:pPr>
-        <w:spacing w:before="0" w:after="20"/>
-        <w:shd w:val="clear" w:color="auto" w:fill="1e4070"/>
-        <w:ind w:left="227"/>
-      </w:pPr>
-      <w:r>
-        <w:rPr>
-          <w:b/>
-          <w:i w:val="0"/>
-          <w:color w:val="F0C040"/>
-          <w:sz w:val="18"/>
-        </w:rPr>
-        <w:t xml:space="preserve">  Compute-bound (scales well):</w:t>
-      </w:r>
-    </w:p>
-    <w:p>
-      <w:pPr>
-        <w:spacing w:before="0" w:after="20"/>
-        <w:shd w:val="clear" w:color="auto" w:fill="1e4070"/>
-        <w:ind w:left="454"/>
-      </w:pPr>
-      <w:r>
-        <w:rPr>
-          <w:b w:val="0"/>
-          <w:i w:val="0"/>
-          <w:color w:val="F0C040"/>
-          <w:sz w:val="18"/>
-        </w:rPr>
-        <w:t xml:space="preserve">  •  </w:t>
-      </w:r>
-      <w:r>
-        <w:rPr>
-          <w:b w:val="0"/>
-          <w:i w:val="0"/>
-          <w:color w:val="FFFFFF"/>
-          <w:sz w:val="18"/>
-        </w:rPr>
-        <w:t>Gaussian Blur:  Executor 4.30x  |  ForkJoin 4.81x</w:t>
-      </w:r>
-    </w:p>
-    <w:p>
-      <w:pPr>
-        <w:spacing w:before="0" w:after="20"/>
-        <w:shd w:val="clear" w:color="auto" w:fill="1e4070"/>
-        <w:ind w:left="454"/>
-      </w:pPr>
-      <w:r>
-        <w:rPr>
-          <w:b w:val="0"/>
-          <w:i w:val="0"/>
-          <w:color w:val="F0C040"/>
-          <w:sz w:val="18"/>
-        </w:rPr>
-        <w:t xml:space="preserve">  •  </w:t>
-      </w:r>
-      <w:r>
-        <w:rPr>
-          <w:b w:val="0"/>
-          <w:i w:val="0"/>
-          <w:color w:val="FFFFFF"/>
-          <w:sz w:val="18"/>
-        </w:rPr>
-        <w:t>Sobel 3x3:      Executor 4.49x  |  ForkJoin 5.10x</w:t>
-      </w:r>
-    </w:p>
-    <w:p>
-      <w:pPr>
-        <w:spacing w:before="0" w:after="60"/>
-        <w:shd w:val="clear" w:color="auto" w:fill="1e4070"/>
-      </w:pPr>
-    </w:p>
-    <w:p>
-      <w:pPr>
-        <w:spacing w:before="0" w:after="20"/>
-        <w:shd w:val="clear" w:color="auto" w:fill="1e4070"/>
-        <w:ind w:left="227"/>
-      </w:pPr>
-      <w:r>
-        <w:rPr>
-          <w:b/>
-          <w:i w:val="0"/>
-          <w:color w:val="F0C040"/>
-          <w:sz w:val="18"/>
-        </w:rPr>
-        <w:t xml:space="preserve">  Memory-bound (bandwidth limited):</w:t>
-      </w:r>
-    </w:p>
-    <w:p>
-      <w:pPr>
-        <w:spacing w:before="0" w:after="20"/>
-        <w:shd w:val="clear" w:color="auto" w:fill="1e4070"/>
-        <w:ind w:left="454"/>
-      </w:pPr>
-      <w:r>
-        <w:rPr>
-          <w:b w:val="0"/>
-          <w:i w:val="0"/>
-          <w:color w:val="F0C040"/>
-          <w:sz w:val="18"/>
-        </w:rPr>
-        <w:t xml:space="preserve">  •  </w:t>
-      </w:r>
-      <w:r>
-        <w:rPr>
-          <w:b w:val="0"/>
-          <w:i w:val="0"/>
-          <w:color w:val="FFFFFF"/>
-          <w:sz w:val="18"/>
-        </w:rPr>
-        <w:t>Grayscale:      Executor 1.55x  |  ForkJoin 1.54x</w:t>
-      </w:r>
-    </w:p>
-    <w:p>
-      <w:pPr>
-        <w:spacing w:before="0" w:after="160"/>
-        <w:jc w:val="center"/>
-        <w:shd w:val="clear" w:color="auto" w:fill="0d2244"/>
-      </w:pPr>
-      <w:r>
-        <w:rPr>
-          <w:b w:val="0"/>
-          <w:i/>
-          <w:color w:val="F0C040"/>
-          <w:sz w:val="15"/>
-        </w:rPr>
-        <w:t xml:space="preserve">  JMH | 10 warm-up + 10 measurement iterations | AverageTime ms/op  </w:t>
-      </w:r>
-    </w:p>
-    <w:p>
-      <w:pPr>
-        <w:spacing w:before="120" w:after="0"/>
-        <w:shd w:val="clear" w:color="auto" w:fill="1a3a6b"/>
-      </w:pPr>
-      <w:r>
-        <w:rPr>
-          <w:b/>
-          <w:i w:val="0"/>
-          <w:color w:val="F0C040"/>
-          <w:sz w:val="18"/>
-        </w:rPr>
-        <w:t xml:space="preserve">  8  </w:t>
-      </w:r>
-      <w:r>
-        <w:rPr>
-          <w:b/>
-          <w:i w:val="0"/>
-          <w:color w:val="FFFFFF"/>
-          <w:sz w:val="24"/>
-        </w:rPr>
-        <w:t xml:space="preserve">  Speedup Charts</w:t>
-      </w:r>
-    </w:p>
-    <w:p>
-      <w:pPr>
-        <w:spacing w:before="0" w:after="60"/>
-        <w:shd w:val="clear" w:color="auto" w:fill="1e4070"/>
-      </w:pPr>
-    </w:p>
-    <w:p>
-      <w:pPr>
-        <w:spacing w:before="0" w:after="20"/>
-        <w:shd w:val="clear" w:color="auto" w:fill="1e4070"/>
-        <w:jc w:val="center"/>
-      </w:pPr>
-      <w:r>
-        <w:rPr>
-          <w:b w:val="0"/>
-          <w:i/>
-          <w:color w:val="AACCEE"/>
-          <w:sz w:val="18"/>
-        </w:rPr>
-        <w:t>GaussianBlur5x5 &amp; Sobel — near-linear scaling up to 4-5x at 8 threads</w:t>
-      </w:r>
-    </w:p>
-    <w:p>
-      <w:pPr>
-        <w:spacing w:before="0" w:after="20"/>
-        <w:shd w:val="clear" w:color="auto" w:fill="1e4070"/>
-        <w:jc w:val="center"/>
-      </w:pPr>
-      <w:r>
-        <w:rPr>
-          <w:b w:val="0"/>
-          <w:i/>
-          <w:color w:val="AACCEE"/>
-          <w:sz w:val="18"/>
-        </w:rPr>
-        <w:t>Grayscale — memory bandwidth saturation caps speedup at ~1.5x</w:t>
-      </w:r>
-    </w:p>
-    <w:p>
-      <w:pPr>
-        <w:spacing w:before="0" w:after="20"/>
-        <w:shd w:val="clear" w:color="auto" w:fill="1e4070"/>
-        <w:jc w:val="center"/>
-      </w:pPr>
-      <w:r>
-        <w:rPr>
-          <w:b w:val="0"/>
-          <w:i/>
-          <w:color w:val="AACCEE"/>
-          <w:sz w:val="18"/>
-        </w:rPr>
-        <w:t>ForkJoin advantage grows with image size (work-stealing benefit)</w:t>
-      </w:r>
-    </w:p>
-    <w:p>
-      <w:pPr>
-        <w:spacing w:before="0" w:after="60"/>
-        <w:shd w:val="clear" w:color="auto" w:fill="1e4070"/>
-      </w:pPr>
-    </w:p>
-    <w:p>
-      <w:pPr>
-        <w:spacing w:before="0" w:after="20"/>
-        <w:shd w:val="clear" w:color="auto" w:fill="1e4070"/>
-        <w:jc w:val="center"/>
-      </w:pPr>
-      <w:r>
-        <w:rPr>
-          <w:b w:val="0"/>
-          <w:i/>
-          <w:color w:val="AACCEE"/>
-          <w:sz w:val="18"/>
-        </w:rPr>
-        <w:t>[See Figures 1-4 in the report section for full charts]</w:t>
-      </w:r>
-    </w:p>
-    <w:p>
-      <w:pPr>
-        <w:spacing w:before="0" w:after="160"/>
-        <w:jc w:val="center"/>
-        <w:shd w:val="clear" w:color="auto" w:fill="0d2244"/>
-      </w:pPr>
-      <w:r>
-        <w:rPr>
-          <w:b w:val="0"/>
-          <w:i/>
-          <w:color w:val="F0C040"/>
-          <w:sz w:val="15"/>
-        </w:rPr>
-        <w:t xml:space="preserve">  Roofline Model: compute-bound = scales | memory-bound = does not  </w:t>
-      </w:r>
-    </w:p>
-    <w:p>
-      <w:pPr>
-        <w:spacing w:before="120" w:after="0"/>
-        <w:shd w:val="clear" w:color="auto" w:fill="1a3a6b"/>
-      </w:pPr>
-      <w:r>
-        <w:rPr>
-          <w:b/>
-          <w:i w:val="0"/>
-          <w:color w:val="F0C040"/>
-          <w:sz w:val="18"/>
-        </w:rPr>
-        <w:t xml:space="preserve">  9  </w:t>
-      </w:r>
-      <w:r>
-        <w:rPr>
-          <w:b/>
-          <w:i w:val="0"/>
-          <w:color w:val="FFFFFF"/>
-          <w:sz w:val="24"/>
-        </w:rPr>
-        <w:t xml:space="preserve">  Challenges &amp; Key Findings</w:t>
-      </w:r>
-    </w:p>
-    <w:p>
-      <w:pPr>
-        <w:spacing w:before="0" w:after="20"/>
-        <w:shd w:val="clear" w:color="auto" w:fill="1e4070"/>
-        <w:ind w:left="454"/>
-      </w:pPr>
-      <w:r>
-        <w:rPr>
-          <w:b w:val="0"/>
-          <w:i w:val="0"/>
-          <w:color w:val="F0C040"/>
-          <w:sz w:val="18"/>
-        </w:rPr>
-        <w:t xml:space="preserve">  •  </w:t>
-      </w:r>
-      <w:r>
-        <w:rPr>
-          <w:b w:val="0"/>
-          <w:i w:val="0"/>
-          <w:color w:val="FFFFFF"/>
-          <w:sz w:val="18"/>
-        </w:rPr>
-        <w:t>JIT warm-up noise — solved with JMH (fork-per-config, 10 warm-up iters)</w:t>
-      </w:r>
-    </w:p>
-    <w:p>
-      <w:pPr>
-        <w:spacing w:before="0" w:after="20"/>
-        <w:shd w:val="clear" w:color="auto" w:fill="1e4070"/>
-        <w:ind w:left="454"/>
-      </w:pPr>
-      <w:r>
-        <w:rPr>
-          <w:b w:val="0"/>
-          <w:i w:val="0"/>
-          <w:color w:val="F0C040"/>
-          <w:sz w:val="18"/>
-        </w:rPr>
-        <w:t xml:space="preserve">  •  </w:t>
-      </w:r>
-      <w:r>
-        <w:rPr>
-          <w:b w:val="0"/>
-          <w:i w:val="0"/>
-          <w:color w:val="FFFFFF"/>
-          <w:sz w:val="18"/>
-        </w:rPr>
-        <w:t>Correctness — clamped edges + pixel-for-pixel CorrectnessVerifier</w:t>
-      </w:r>
-    </w:p>
-    <w:p>
-      <w:pPr>
-        <w:spacing w:before="0" w:after="20"/>
-        <w:shd w:val="clear" w:color="auto" w:fill="1e4070"/>
-        <w:ind w:left="454"/>
-      </w:pPr>
-      <w:r>
-        <w:rPr>
-          <w:b w:val="0"/>
-          <w:i w:val="0"/>
-          <w:color w:val="F0C040"/>
-          <w:sz w:val="18"/>
-        </w:rPr>
-        <w:t xml:space="preserve">  •  </w:t>
-      </w:r>
-      <w:r>
-        <w:rPr>
-          <w:b w:val="0"/>
-          <w:i w:val="0"/>
-          <w:color w:val="FFFFFF"/>
-          <w:sz w:val="18"/>
-        </w:rPr>
-        <w:t>Grayscale bottleneck — memory bandwidth saturated (Roofline Model)</w:t>
-      </w:r>
-    </w:p>
-    <w:p>
-      <w:pPr>
-        <w:spacing w:before="0" w:after="20"/>
-        <w:shd w:val="clear" w:color="auto" w:fill="1e4070"/>
-        <w:ind w:left="454"/>
-      </w:pPr>
-      <w:r>
-        <w:rPr>
-          <w:b w:val="0"/>
-          <w:i w:val="0"/>
-          <w:color w:val="F0C040"/>
-          <w:sz w:val="18"/>
-        </w:rPr>
-        <w:t xml:space="preserve">  •  </w:t>
-      </w:r>
-      <w:r>
-        <w:rPr>
-          <w:b w:val="0"/>
-          <w:i w:val="0"/>
-          <w:color w:val="FFFFFF"/>
-          <w:sz w:val="18"/>
-        </w:rPr>
-        <w:t>ForkJoin overhead on small images — tuned threshold to 64 rows</w:t>
-      </w:r>
-    </w:p>
-    <w:p>
-      <w:pPr>
-        <w:spacing w:before="0" w:after="60"/>
-        <w:shd w:val="clear" w:color="auto" w:fill="1e4070"/>
-      </w:pPr>
-    </w:p>
-    <w:p>
-      <w:pPr>
-        <w:spacing w:before="0" w:after="20"/>
-        <w:shd w:val="clear" w:color="auto" w:fill="1e4070"/>
-        <w:jc w:val="center"/>
-      </w:pPr>
-      <w:r>
-        <w:rPr>
-          <w:b w:val="0"/>
-          <w:i/>
-          <w:color w:val="AACCEE"/>
-          <w:sz w:val="18"/>
-        </w:rPr>
-        <w:t>Key insight: speedup is FILTER-DEPENDENT — arithmetic intensity determines scalability</w:t>
-      </w:r>
-    </w:p>
-    <w:p>
-      <w:pPr>
-        <w:spacing w:before="0" w:after="160"/>
-        <w:jc w:val="center"/>
-        <w:shd w:val="clear" w:color="auto" w:fill="0d2244"/>
-      </w:pPr>
-      <w:r>
-        <w:rPr>
-          <w:b w:val="0"/>
-          <w:i/>
-          <w:color w:val="F0C040"/>
-          <w:sz w:val="15"/>
-        </w:rPr>
-        <w:t xml:space="preserve">  Benchmark: 12 logical cores, JDK 17, Maven 3.6  </w:t>
-      </w:r>
-    </w:p>
-    <w:p>
-      <w:pPr>
-        <w:spacing w:before="120" w:after="0"/>
-        <w:shd w:val="clear" w:color="auto" w:fill="1a3a6b"/>
-      </w:pPr>
-      <w:r>
-        <w:rPr>
-          <w:b/>
-          <w:i w:val="0"/>
-          <w:color w:val="F0C040"/>
-          <w:sz w:val="18"/>
-        </w:rPr>
-        <w:t xml:space="preserve">  10  </w:t>
-      </w:r>
-      <w:r>
-        <w:rPr>
-          <w:b/>
-          <w:i w:val="0"/>
-          <w:color w:val="FFFFFF"/>
-          <w:sz w:val="24"/>
-        </w:rPr>
-        <w:t xml:space="preserve">  Conclusion &amp; Future Work</w:t>
-      </w:r>
-    </w:p>
-    <w:p>
-      <w:pPr>
-        <w:spacing w:before="0" w:after="20"/>
-        <w:shd w:val="clear" w:color="auto" w:fill="1e4070"/>
-        <w:ind w:left="454"/>
-      </w:pPr>
-      <w:r>
-        <w:rPr>
-          <w:b w:val="0"/>
-          <w:i w:val="0"/>
-          <w:color w:val="F0C040"/>
-          <w:sz w:val="18"/>
-        </w:rPr>
-        <w:t xml:space="preserve">  •  </w:t>
-      </w:r>
-      <w:r>
-        <w:rPr>
-          <w:b w:val="0"/>
-          <w:i w:val="0"/>
-          <w:color w:val="FFFFFF"/>
-          <w:sz w:val="18"/>
-        </w:rPr>
-        <w:t>Parallelised 3 convolution filters with 2 Java concurrency strategies</w:t>
-      </w:r>
-    </w:p>
-    <w:p>
-      <w:pPr>
-        <w:spacing w:before="0" w:after="20"/>
-        <w:shd w:val="clear" w:color="auto" w:fill="1e4070"/>
-        <w:ind w:left="454"/>
-      </w:pPr>
-      <w:r>
-        <w:rPr>
-          <w:b w:val="0"/>
-          <w:i w:val="0"/>
-          <w:color w:val="F0C040"/>
-          <w:sz w:val="18"/>
-        </w:rPr>
-        <w:t xml:space="preserve">  •  </w:t>
-      </w:r>
-      <w:r>
-        <w:rPr>
-          <w:b w:val="0"/>
-          <w:i w:val="0"/>
-          <w:color w:val="FFFFFF"/>
-          <w:sz w:val="18"/>
-        </w:rPr>
-        <w:t>Up to 5.10x speedup (Sobel, ForkJoin, 8 threads, 2048x2048)</w:t>
-      </w:r>
-    </w:p>
-    <w:p>
-      <w:pPr>
-        <w:spacing w:before="0" w:after="20"/>
-        <w:shd w:val="clear" w:color="auto" w:fill="1e4070"/>
-        <w:ind w:left="454"/>
-      </w:pPr>
-      <w:r>
-        <w:rPr>
-          <w:b w:val="0"/>
-          <w:i w:val="0"/>
-          <w:color w:val="F0C040"/>
-          <w:sz w:val="18"/>
-        </w:rPr>
-        <w:t xml:space="preserve">  •  </w:t>
-      </w:r>
-      <w:r>
-        <w:rPr>
-          <w:b w:val="0"/>
-          <w:i w:val="0"/>
-          <w:color w:val="FFFFFF"/>
-          <w:sz w:val="18"/>
-        </w:rPr>
-        <w:t>Memory-bound filters need different strategy (not thread-level parallelism)</w:t>
-      </w:r>
-    </w:p>
-    <w:p>
-      <w:pPr>
-        <w:spacing w:before="0" w:after="20"/>
-        <w:shd w:val="clear" w:color="auto" w:fill="1e4070"/>
-        <w:ind w:left="227"/>
-      </w:pPr>
-      <w:r>
-        <w:rPr>
-          <w:b/>
-          <w:i w:val="0"/>
-          <w:color w:val="F0C040"/>
-          <w:sz w:val="18"/>
-        </w:rPr>
-        <w:t xml:space="preserve">  Future Work:</w:t>
-      </w:r>
-    </w:p>
-    <w:p>
-      <w:pPr>
-        <w:spacing w:before="0" w:after="20"/>
-        <w:shd w:val="clear" w:color="auto" w:fill="1e4070"/>
-        <w:ind w:left="454"/>
-      </w:pPr>
-      <w:r>
-        <w:rPr>
-          <w:b w:val="0"/>
-          <w:i w:val="0"/>
-          <w:color w:val="F0C040"/>
-          <w:sz w:val="18"/>
-        </w:rPr>
-        <w:t xml:space="preserve">  •  </w:t>
-      </w:r>
-      <w:r>
-        <w:rPr>
-          <w:b w:val="0"/>
-          <w:i w:val="0"/>
-          <w:color w:val="FFFFFF"/>
-          <w:sz w:val="18"/>
-        </w:rPr>
-        <w:t>GPU/CUDA — thousands of concurrent cores for pixel-independent kernels</w:t>
-      </w:r>
-    </w:p>
-    <w:p>
-      <w:pPr>
-        <w:spacing w:before="0" w:after="20"/>
-        <w:shd w:val="clear" w:color="auto" w:fill="1e4070"/>
-        <w:ind w:left="454"/>
-      </w:pPr>
-      <w:r>
-        <w:rPr>
-          <w:b w:val="0"/>
-          <w:i w:val="0"/>
-          <w:color w:val="F0C040"/>
-          <w:sz w:val="18"/>
-        </w:rPr>
-        <w:t xml:space="preserve">  •  </w:t>
-      </w:r>
-      <w:r>
-        <w:rPr>
-          <w:b w:val="0"/>
-          <w:i w:val="0"/>
-          <w:color w:val="FFFFFF"/>
-          <w:sz w:val="18"/>
-        </w:rPr>
-        <w:t>SIMD vectorisation (AVX2/AVX-512) for intra-core throughput</w:t>
-      </w:r>
-    </w:p>
-    <w:p>
-      <w:pPr>
-        <w:spacing w:before="0" w:after="20"/>
-        <w:shd w:val="clear" w:color="auto" w:fill="1e4070"/>
-        <w:ind w:left="454"/>
-      </w:pPr>
-      <w:r>
-        <w:rPr>
-          <w:b w:val="0"/>
-          <w:i w:val="0"/>
-          <w:color w:val="F0C040"/>
-          <w:sz w:val="18"/>
-        </w:rPr>
-        <w:t xml:space="preserve">  •  </w:t>
-      </w:r>
-      <w:r>
-        <w:rPr>
-          <w:b w:val="0"/>
-          <w:i w:val="0"/>
-          <w:color w:val="FFFFFF"/>
-          <w:sz w:val="18"/>
-        </w:rPr>
-        <w:t>Adaptive thread pool — dynamic tuning per image size and hardware</w:t>
-      </w:r>
-    </w:p>
-    <w:p>
-      <w:pPr>
-        <w:spacing w:before="0" w:after="160"/>
-        <w:jc w:val="center"/>
-        <w:shd w:val="clear" w:color="auto" w:fill="0d2244"/>
-      </w:pPr>
-      <w:r>
-        <w:rPr>
-          <w:b w:val="0"/>
-          <w:i/>
-          <w:color w:val="F0C040"/>
-          <w:sz w:val="15"/>
-        </w:rPr>
-        <w:t xml:space="preserve">  https://github.com/Muhammedcakirgoz/parallel-image-processing  </w:t>
-      </w:r>
-    </w:p>
+        <w:tblLook w:firstColumn="1" w:firstRow="1" w:lastColumn="0" w:lastRow="0" w:noHBand="0" w:noVBand="1" w:val="04A0"/>
+      </w:tblPr>
+      <w:tblGrid>
+        <w:gridCol w:w="4536"/>
+        <w:gridCol w:w="4536"/>
+      </w:tblGrid>
+      <w:tr>
+        <w:trPr>
+          <w:trHeight w:val="2551"/>
+        </w:trPr>
+        <w:tc>
+          <w:tcPr>
+            <w:tcW w:type="dxa" w:w="4422"/>
+            <w:shd w:val="clear" w:color="auto" w:fill="1a3a6b"/>
+            <w:tcBorders>
+              <w:top w:val="single" w:sz="4" w:space="0" w:color="2e6db4"/>
+              <w:left w:val="single" w:sz="4" w:space="0" w:color="2e6db4"/>
+              <w:bottom w:val="single" w:sz="4" w:space="0" w:color="2e6db4"/>
+              <w:right w:val="single" w:sz="4" w:space="0" w:color="2e6db4"/>
+              <w:insideH w:val="single" w:sz="4" w:space="0" w:color="2e6db4"/>
+              <w:insideV w:val="single" w:sz="4" w:space="0" w:color="2e6db4"/>
+            </w:tcBorders>
+          </w:tcPr>
+          <w:p>
+            <w:pPr>
+              <w:spacing w:before="0" w:after="0"/>
+              <w:shd w:val="clear" w:color="auto" w:fill="0d2244"/>
+            </w:pPr>
+            <w:r>
+              <w:rPr>
+                <w:b/>
+                <w:i w:val="0"/>
+                <w:color w:val="F0C040"/>
+                <w:sz w:val="14"/>
+              </w:rPr>
+              <w:t xml:space="preserve"> 1 </w:t>
+            </w:r>
+            <w:r>
+              <w:rPr>
+                <w:b/>
+                <w:i w:val="0"/>
+                <w:color w:val="FFFFFF"/>
+                <w:sz w:val="16"/>
+              </w:rPr>
+              <w:t xml:space="preserve">  Parallel Image Processing Engine</w:t>
+            </w:r>
+          </w:p>
+          <w:p>
+            <w:pPr>
+              <w:spacing w:before="0" w:after="20"/>
+              <w:shd w:val="clear" w:color="auto" w:fill="1a3a6b"/>
+            </w:pPr>
+          </w:p>
+          <w:p>
+            <w:pPr>
+              <w:spacing w:before="0" w:after="0"/>
+              <w:jc w:val="center"/>
+              <w:shd w:val="clear" w:color="auto" w:fill="1a3a6b"/>
+            </w:pPr>
+            <w:r>
+              <w:rPr>
+                <w:b w:val="0"/>
+                <w:i/>
+                <w:color w:val="AACCEE"/>
+                <w:sz w:val="14"/>
+              </w:rPr>
+              <w:t>CENG 479 — Parallel Computing  |  Gazi University  |  Spring 2026</w:t>
+            </w:r>
+          </w:p>
+          <w:p>
+            <w:pPr>
+              <w:spacing w:before="0" w:after="0"/>
+              <w:jc w:val="center"/>
+              <w:shd w:val="clear" w:color="auto" w:fill="1a3a6b"/>
+            </w:pPr>
+            <w:r>
+              <w:rPr>
+                <w:b w:val="0"/>
+                <w:i/>
+                <w:color w:val="AACCEE"/>
+                <w:sz w:val="14"/>
+              </w:rPr>
+              <w:t>Muhammed Cakiagoz   ·   Musa Bilal Yaz</w:t>
+            </w:r>
+          </w:p>
+          <w:p>
+            <w:pPr>
+              <w:spacing w:before="0" w:after="20"/>
+              <w:shd w:val="clear" w:color="auto" w:fill="1a3a6b"/>
+            </w:pPr>
+          </w:p>
+          <w:p>
+            <w:pPr>
+              <w:spacing w:before="0" w:after="0"/>
+              <w:jc w:val="center"/>
+              <w:shd w:val="clear" w:color="auto" w:fill="1a3a6b"/>
+            </w:pPr>
+            <w:r>
+              <w:rPr>
+                <w:b w:val="0"/>
+                <w:i/>
+                <w:color w:val="AACCEE"/>
+                <w:sz w:val="14"/>
+              </w:rPr>
+              <w:t>https://github.com/Muhammedcakirgoz/parallel-image-processing</w:t>
+            </w:r>
+          </w:p>
+          <w:p>
+            <w:pPr>
+              <w:spacing w:before="0" w:after="0"/>
+              <w:jc w:val="center"/>
+              <w:shd w:val="clear" w:color="auto" w:fill="0d2244"/>
+            </w:pPr>
+            <w:r>
+              <w:rPr>
+                <w:b w:val="0"/>
+                <w:i/>
+                <w:color w:val="F0C040"/>
+                <w:sz w:val="13"/>
+              </w:rPr>
+              <w:t xml:space="preserve"> Java Threads | ExecutorService | ForkJoinPool | JMH Benchmark </w:t>
+            </w:r>
+          </w:p>
+        </w:tc>
+        <w:tc>
+          <w:tcPr>
+            <w:tcW w:type="dxa" w:w="4422"/>
+            <w:shd w:val="clear" w:color="auto" w:fill="1a3a6b"/>
+            <w:tcBorders>
+              <w:top w:val="single" w:sz="4" w:space="0" w:color="2e6db4"/>
+              <w:left w:val="single" w:sz="4" w:space="0" w:color="2e6db4"/>
+              <w:bottom w:val="single" w:sz="4" w:space="0" w:color="2e6db4"/>
+              <w:right w:val="single" w:sz="4" w:space="0" w:color="2e6db4"/>
+              <w:insideH w:val="single" w:sz="4" w:space="0" w:color="2e6db4"/>
+              <w:insideV w:val="single" w:sz="4" w:space="0" w:color="2e6db4"/>
+            </w:tcBorders>
+          </w:tcPr>
+          <w:p>
+            <w:pPr>
+              <w:spacing w:before="0" w:after="0"/>
+              <w:shd w:val="clear" w:color="auto" w:fill="0d2244"/>
+            </w:pPr>
+            <w:r>
+              <w:rPr>
+                <w:b/>
+                <w:i w:val="0"/>
+                <w:color w:val="F0C040"/>
+                <w:sz w:val="14"/>
+              </w:rPr>
+              <w:t xml:space="preserve"> 2 </w:t>
+            </w:r>
+            <w:r>
+              <w:rPr>
+                <w:b/>
+                <w:i w:val="0"/>
+                <w:color w:val="FFFFFF"/>
+                <w:sz w:val="16"/>
+              </w:rPr>
+              <w:t xml:space="preserve">  Problem &amp; Motivation</w:t>
+            </w:r>
+          </w:p>
+          <w:p>
+            <w:pPr>
+              <w:spacing w:before="0" w:after="0"/>
+              <w:ind w:left="227"/>
+              <w:shd w:val="clear" w:color="auto" w:fill="1a3a6b"/>
+            </w:pPr>
+            <w:r>
+              <w:rPr>
+                <w:b w:val="0"/>
+                <w:i w:val="0"/>
+                <w:color w:val="F0C040"/>
+                <w:sz w:val="15"/>
+              </w:rPr>
+              <w:t xml:space="preserve">• </w:t>
+            </w:r>
+            <w:r>
+              <w:rPr>
+                <w:b w:val="0"/>
+                <w:i w:val="0"/>
+                <w:color w:val="FFFFFF"/>
+                <w:sz w:val="15"/>
+              </w:rPr>
+              <w:t>High-resolution image filtering (4K+) is slow on a single thread</w:t>
+            </w:r>
+          </w:p>
+          <w:p>
+            <w:pPr>
+              <w:spacing w:before="0" w:after="0"/>
+              <w:ind w:left="227"/>
+              <w:shd w:val="clear" w:color="auto" w:fill="1a3a6b"/>
+            </w:pPr>
+            <w:r>
+              <w:rPr>
+                <w:b w:val="0"/>
+                <w:i w:val="0"/>
+                <w:color w:val="F0C040"/>
+                <w:sz w:val="15"/>
+              </w:rPr>
+              <w:t xml:space="preserve">• </w:t>
+            </w:r>
+            <w:r>
+              <w:rPr>
+                <w:b w:val="0"/>
+                <w:i w:val="0"/>
+                <w:color w:val="FFFFFF"/>
+                <w:sz w:val="15"/>
+              </w:rPr>
+              <w:t>Convolution cost: O(W x H x K^2) per filter — bottleneck at scale</w:t>
+            </w:r>
+          </w:p>
+          <w:p>
+            <w:pPr>
+              <w:spacing w:before="0" w:after="0"/>
+              <w:ind w:left="227"/>
+              <w:shd w:val="clear" w:color="auto" w:fill="1a3a6b"/>
+            </w:pPr>
+            <w:r>
+              <w:rPr>
+                <w:b w:val="0"/>
+                <w:i w:val="0"/>
+                <w:color w:val="F0C040"/>
+                <w:sz w:val="15"/>
+              </w:rPr>
+              <w:t xml:space="preserve">• </w:t>
+            </w:r>
+            <w:r>
+              <w:rPr>
+                <w:b w:val="0"/>
+                <w:i w:val="0"/>
+                <w:color w:val="FFFFFF"/>
+                <w:sz w:val="15"/>
+              </w:rPr>
+              <w:t>Each output pixel is INDEPENDENT — embarrassingly parallel</w:t>
+            </w:r>
+          </w:p>
+          <w:p>
+            <w:pPr>
+              <w:spacing w:before="0" w:after="0"/>
+              <w:ind w:left="227"/>
+              <w:shd w:val="clear" w:color="auto" w:fill="1a3a6b"/>
+            </w:pPr>
+            <w:r>
+              <w:rPr>
+                <w:b w:val="0"/>
+                <w:i w:val="0"/>
+                <w:color w:val="F0C040"/>
+                <w:sz w:val="15"/>
+              </w:rPr>
+              <w:t xml:space="preserve">• </w:t>
+            </w:r>
+            <w:r>
+              <w:rPr>
+                <w:b w:val="0"/>
+                <w:i w:val="0"/>
+                <w:color w:val="FFFFFF"/>
+                <w:sz w:val="15"/>
+              </w:rPr>
+              <w:t>Goal: multi-threaded speedup with zero correctness compromise</w:t>
+            </w:r>
+          </w:p>
+          <w:p>
+            <w:pPr>
+              <w:spacing w:before="0" w:after="20"/>
+              <w:shd w:val="clear" w:color="auto" w:fill="1a3a6b"/>
+            </w:pPr>
+          </w:p>
+          <w:p>
+            <w:pPr>
+              <w:spacing w:before="0" w:after="0"/>
+              <w:jc w:val="center"/>
+              <w:shd w:val="clear" w:color="auto" w:fill="1a3a6b"/>
+            </w:pPr>
+            <w:r>
+              <w:rPr>
+                <w:b w:val="0"/>
+                <w:i/>
+                <w:color w:val="AACCEE"/>
+                <w:sz w:val="14"/>
+              </w:rPr>
+              <w:t>Amdahl's Law: S = 1/(1-p)  —  p ~ 0.95 for Gaussian Blur</w:t>
+            </w:r>
+          </w:p>
+          <w:p>
+            <w:pPr>
+              <w:spacing w:before="0" w:after="0"/>
+              <w:jc w:val="center"/>
+              <w:shd w:val="clear" w:color="auto" w:fill="0d2244"/>
+            </w:pPr>
+            <w:r>
+              <w:rPr>
+                <w:b w:val="0"/>
+                <w:i/>
+                <w:color w:val="F0C040"/>
+                <w:sz w:val="13"/>
+              </w:rPr>
+              <w:t xml:space="preserve"> Theoretical max speedup ~20x at p=0.95 </w:t>
+            </w:r>
+          </w:p>
+        </w:tc>
+      </w:tr>
+      <w:tr>
+        <w:trPr>
+          <w:trHeight w:val="2551"/>
+        </w:trPr>
+        <w:tc>
+          <w:tcPr>
+            <w:tcW w:type="dxa" w:w="4422"/>
+            <w:shd w:val="clear" w:color="auto" w:fill="1a3a6b"/>
+            <w:tcBorders>
+              <w:top w:val="single" w:sz="4" w:space="0" w:color="2e6db4"/>
+              <w:left w:val="single" w:sz="4" w:space="0" w:color="2e6db4"/>
+              <w:bottom w:val="single" w:sz="4" w:space="0" w:color="2e6db4"/>
+              <w:right w:val="single" w:sz="4" w:space="0" w:color="2e6db4"/>
+              <w:insideH w:val="single" w:sz="4" w:space="0" w:color="2e6db4"/>
+              <w:insideV w:val="single" w:sz="4" w:space="0" w:color="2e6db4"/>
+            </w:tcBorders>
+          </w:tcPr>
+          <w:p>
+            <w:pPr>
+              <w:spacing w:before="0" w:after="0"/>
+              <w:shd w:val="clear" w:color="auto" w:fill="0d2244"/>
+            </w:pPr>
+            <w:r>
+              <w:rPr>
+                <w:b/>
+                <w:i w:val="0"/>
+                <w:color w:val="F0C040"/>
+                <w:sz w:val="14"/>
+              </w:rPr>
+              <w:t xml:space="preserve"> 3 </w:t>
+            </w:r>
+            <w:r>
+              <w:rPr>
+                <w:b/>
+                <w:i w:val="0"/>
+                <w:color w:val="FFFFFF"/>
+                <w:sz w:val="16"/>
+              </w:rPr>
+              <w:t xml:space="preserve">  Architecture Overview</w:t>
+            </w:r>
+          </w:p>
+          <w:p>
+            <w:pPr>
+              <w:spacing w:before="0" w:after="0"/>
+              <w:ind w:left="113"/>
+              <w:shd w:val="clear" w:color="auto" w:fill="1a3a6b"/>
+            </w:pPr>
+            <w:r>
+              <w:rPr>
+                <w:b/>
+                <w:i w:val="0"/>
+                <w:color w:val="F0C040"/>
+                <w:sz w:val="15"/>
+              </w:rPr>
+              <w:t>Filters:</w:t>
+            </w:r>
+          </w:p>
+          <w:p>
+            <w:pPr>
+              <w:spacing w:before="0" w:after="0"/>
+              <w:ind w:left="227"/>
+              <w:shd w:val="clear" w:color="auto" w:fill="1a3a6b"/>
+            </w:pPr>
+            <w:r>
+              <w:rPr>
+                <w:b w:val="0"/>
+                <w:i w:val="0"/>
+                <w:color w:val="F0C040"/>
+                <w:sz w:val="15"/>
+              </w:rPr>
+              <w:t xml:space="preserve">• </w:t>
+            </w:r>
+            <w:r>
+              <w:rPr>
+                <w:b w:val="0"/>
+                <w:i w:val="0"/>
+                <w:color w:val="FFFFFF"/>
+                <w:sz w:val="15"/>
+              </w:rPr>
+              <w:t>Grayscale (point-wise), Gaussian Blur 5x5, Sobel 3x3</w:t>
+            </w:r>
+          </w:p>
+          <w:p>
+            <w:pPr>
+              <w:spacing w:before="0" w:after="0"/>
+              <w:ind w:left="113"/>
+              <w:shd w:val="clear" w:color="auto" w:fill="1a3a6b"/>
+            </w:pPr>
+            <w:r>
+              <w:rPr>
+                <w:b/>
+                <w:i w:val="0"/>
+                <w:color w:val="F0C040"/>
+                <w:sz w:val="15"/>
+              </w:rPr>
+              <w:t>Implementations:</w:t>
+            </w:r>
+          </w:p>
+          <w:p>
+            <w:pPr>
+              <w:spacing w:before="0" w:after="0"/>
+              <w:ind w:left="227"/>
+              <w:shd w:val="clear" w:color="auto" w:fill="1a3a6b"/>
+            </w:pPr>
+            <w:r>
+              <w:rPr>
+                <w:b w:val="0"/>
+                <w:i w:val="0"/>
+                <w:color w:val="F0C040"/>
+                <w:sz w:val="15"/>
+              </w:rPr>
+              <w:t xml:space="preserve">• </w:t>
+            </w:r>
+            <w:r>
+              <w:rPr>
+                <w:b w:val="0"/>
+                <w:i w:val="0"/>
+                <w:color w:val="FFFFFF"/>
+                <w:sz w:val="15"/>
+              </w:rPr>
+              <w:t>SequentialProcessor — single-thread baseline</w:t>
+            </w:r>
+          </w:p>
+          <w:p>
+            <w:pPr>
+              <w:spacing w:before="0" w:after="0"/>
+              <w:ind w:left="227"/>
+              <w:shd w:val="clear" w:color="auto" w:fill="1a3a6b"/>
+            </w:pPr>
+            <w:r>
+              <w:rPr>
+                <w:b w:val="0"/>
+                <w:i w:val="0"/>
+                <w:color w:val="F0C040"/>
+                <w:sz w:val="15"/>
+              </w:rPr>
+              <w:t xml:space="preserve">• </w:t>
+            </w:r>
+            <w:r>
+              <w:rPr>
+                <w:b w:val="0"/>
+                <w:i w:val="0"/>
+                <w:color w:val="FFFFFF"/>
+                <w:sz w:val="15"/>
+              </w:rPr>
+              <w:t>ExecutorParallelProcessor — fixed pool + horizontal strips</w:t>
+            </w:r>
+          </w:p>
+          <w:p>
+            <w:pPr>
+              <w:spacing w:before="0" w:after="0"/>
+              <w:ind w:left="227"/>
+              <w:shd w:val="clear" w:color="auto" w:fill="1a3a6b"/>
+            </w:pPr>
+            <w:r>
+              <w:rPr>
+                <w:b w:val="0"/>
+                <w:i w:val="0"/>
+                <w:color w:val="F0C040"/>
+                <w:sz w:val="15"/>
+              </w:rPr>
+              <w:t xml:space="preserve">• </w:t>
+            </w:r>
+            <w:r>
+              <w:rPr>
+                <w:b w:val="0"/>
+                <w:i w:val="0"/>
+                <w:color w:val="FFFFFF"/>
+                <w:sz w:val="15"/>
+              </w:rPr>
+              <w:t>ForkJoinParallelProcessor — RecursiveAction + work-stealing</w:t>
+            </w:r>
+          </w:p>
+          <w:p>
+            <w:pPr>
+              <w:spacing w:before="0" w:after="0"/>
+              <w:ind w:left="113"/>
+              <w:shd w:val="clear" w:color="auto" w:fill="1a3a6b"/>
+            </w:pPr>
+            <w:r>
+              <w:rPr>
+                <w:b/>
+                <w:i w:val="0"/>
+                <w:color w:val="F0C040"/>
+                <w:sz w:val="15"/>
+              </w:rPr>
+              <w:t>Tools:</w:t>
+            </w:r>
+          </w:p>
+          <w:p>
+            <w:pPr>
+              <w:spacing w:before="0" w:after="0"/>
+              <w:ind w:left="227"/>
+              <w:shd w:val="clear" w:color="auto" w:fill="1a3a6b"/>
+            </w:pPr>
+            <w:r>
+              <w:rPr>
+                <w:b w:val="0"/>
+                <w:i w:val="0"/>
+                <w:color w:val="F0C040"/>
+                <w:sz w:val="15"/>
+              </w:rPr>
+              <w:t xml:space="preserve">• </w:t>
+            </w:r>
+            <w:r>
+              <w:rPr>
+                <w:b w:val="0"/>
+                <w:i w:val="0"/>
+                <w:color w:val="FFFFFF"/>
+                <w:sz w:val="15"/>
+              </w:rPr>
+              <w:t>CorrectnessVerifier + JMH Benchmark</w:t>
+            </w:r>
+          </w:p>
+          <w:p>
+            <w:pPr>
+              <w:spacing w:before="0" w:after="0"/>
+              <w:jc w:val="center"/>
+              <w:shd w:val="clear" w:color="auto" w:fill="0d2244"/>
+            </w:pPr>
+            <w:r>
+              <w:rPr>
+                <w:b w:val="0"/>
+                <w:i/>
+                <w:color w:val="F0C040"/>
+                <w:sz w:val="13"/>
+              </w:rPr>
+              <w:t xml:space="preserve"> All source code publicly available on GitHub </w:t>
+            </w:r>
+          </w:p>
+        </w:tc>
+        <w:tc>
+          <w:tcPr>
+            <w:tcW w:type="dxa" w:w="4422"/>
+            <w:shd w:val="clear" w:color="auto" w:fill="1a3a6b"/>
+            <w:tcBorders>
+              <w:top w:val="single" w:sz="4" w:space="0" w:color="2e6db4"/>
+              <w:left w:val="single" w:sz="4" w:space="0" w:color="2e6db4"/>
+              <w:bottom w:val="single" w:sz="4" w:space="0" w:color="2e6db4"/>
+              <w:right w:val="single" w:sz="4" w:space="0" w:color="2e6db4"/>
+              <w:insideH w:val="single" w:sz="4" w:space="0" w:color="2e6db4"/>
+              <w:insideV w:val="single" w:sz="4" w:space="0" w:color="2e6db4"/>
+            </w:tcBorders>
+          </w:tcPr>
+          <w:p>
+            <w:pPr>
+              <w:spacing w:before="0" w:after="0"/>
+              <w:shd w:val="clear" w:color="auto" w:fill="0d2244"/>
+            </w:pPr>
+            <w:r>
+              <w:rPr>
+                <w:b/>
+                <w:i w:val="0"/>
+                <w:color w:val="F0C040"/>
+                <w:sz w:val="14"/>
+              </w:rPr>
+              <w:t xml:space="preserve"> 4 </w:t>
+            </w:r>
+            <w:r>
+              <w:rPr>
+                <w:b/>
+                <w:i w:val="0"/>
+                <w:color w:val="FFFFFF"/>
+                <w:sz w:val="16"/>
+              </w:rPr>
+              <w:t xml:space="preserve">  ExecutorService Design</w:t>
+            </w:r>
+          </w:p>
+          <w:p>
+            <w:pPr>
+              <w:spacing w:before="0" w:after="0"/>
+              <w:ind w:left="227"/>
+              <w:shd w:val="clear" w:color="auto" w:fill="1a3a6b"/>
+            </w:pPr>
+            <w:r>
+              <w:rPr>
+                <w:b w:val="0"/>
+                <w:i w:val="0"/>
+                <w:color w:val="F0C040"/>
+                <w:sz w:val="15"/>
+              </w:rPr>
+              <w:t xml:space="preserve">• </w:t>
+            </w:r>
+            <w:r>
+              <w:rPr>
+                <w:b w:val="0"/>
+                <w:i w:val="0"/>
+                <w:color w:val="FFFFFF"/>
+                <w:sz w:val="15"/>
+              </w:rPr>
+              <w:t>Image split into N equal horizontal strips (N = thread count)</w:t>
+            </w:r>
+          </w:p>
+          <w:p>
+            <w:pPr>
+              <w:spacing w:before="0" w:after="0"/>
+              <w:ind w:left="227"/>
+              <w:shd w:val="clear" w:color="auto" w:fill="1a3a6b"/>
+            </w:pPr>
+            <w:r>
+              <w:rPr>
+                <w:b w:val="0"/>
+                <w:i w:val="0"/>
+                <w:color w:val="F0C040"/>
+                <w:sz w:val="15"/>
+              </w:rPr>
+              <w:t xml:space="preserve">• </w:t>
+            </w:r>
+            <w:r>
+              <w:rPr>
+                <w:b w:val="0"/>
+                <w:i w:val="0"/>
+                <w:color w:val="FFFFFF"/>
+                <w:sz w:val="15"/>
+              </w:rPr>
+              <w:t>Each Callable processes rows [start, end) with no locking</w:t>
+            </w:r>
+          </w:p>
+          <w:p>
+            <w:pPr>
+              <w:spacing w:before="0" w:after="0"/>
+              <w:ind w:left="227"/>
+              <w:shd w:val="clear" w:color="auto" w:fill="1a3a6b"/>
+            </w:pPr>
+            <w:r>
+              <w:rPr>
+                <w:b w:val="0"/>
+                <w:i w:val="0"/>
+                <w:color w:val="F0C040"/>
+                <w:sz w:val="15"/>
+              </w:rPr>
+              <w:t xml:space="preserve">• </w:t>
+            </w:r>
+            <w:r>
+              <w:rPr>
+                <w:b w:val="0"/>
+                <w:i w:val="0"/>
+                <w:color w:val="FFFFFF"/>
+                <w:sz w:val="15"/>
+              </w:rPr>
+              <w:t>Source array is READ-ONLY — zero synchronisation overhead</w:t>
+            </w:r>
+          </w:p>
+          <w:p>
+            <w:pPr>
+              <w:spacing w:before="0" w:after="0"/>
+              <w:ind w:left="227"/>
+              <w:shd w:val="clear" w:color="auto" w:fill="1a3a6b"/>
+            </w:pPr>
+            <w:r>
+              <w:rPr>
+                <w:b w:val="0"/>
+                <w:i w:val="0"/>
+                <w:color w:val="F0C040"/>
+                <w:sz w:val="15"/>
+              </w:rPr>
+              <w:t xml:space="preserve">• </w:t>
+            </w:r>
+            <w:r>
+              <w:rPr>
+                <w:b w:val="0"/>
+                <w:i w:val="0"/>
+                <w:color w:val="FFFFFF"/>
+                <w:sz w:val="15"/>
+              </w:rPr>
+              <w:t>Thread pool created once, reused via try-with-resources</w:t>
+            </w:r>
+          </w:p>
+          <w:p>
+            <w:pPr>
+              <w:spacing w:before="0" w:after="20"/>
+              <w:shd w:val="clear" w:color="auto" w:fill="1a3a6b"/>
+            </w:pPr>
+          </w:p>
+          <w:p>
+            <w:pPr>
+              <w:spacing w:before="0" w:after="0"/>
+              <w:jc w:val="center"/>
+              <w:shd w:val="clear" w:color="auto" w:fill="1a3a6b"/>
+            </w:pPr>
+            <w:r>
+              <w:rPr>
+                <w:b w:val="0"/>
+                <w:i/>
+                <w:color w:val="AACCEE"/>
+                <w:sz w:val="14"/>
+              </w:rPr>
+              <w:t>Strip[i] covers rows:  i*(H/N)  to  (i+1)*(H/N)</w:t>
+            </w:r>
+          </w:p>
+          <w:p>
+            <w:pPr>
+              <w:spacing w:before="0" w:after="0"/>
+              <w:jc w:val="center"/>
+              <w:shd w:val="clear" w:color="auto" w:fill="0d2244"/>
+            </w:pPr>
+            <w:r>
+              <w:rPr>
+                <w:b w:val="0"/>
+                <w:i/>
+                <w:color w:val="F0C040"/>
+                <w:sz w:val="13"/>
+              </w:rPr>
+              <w:t xml:space="preserve"> Static decomposition — optimal for uniform workloads </w:t>
+            </w:r>
+          </w:p>
+        </w:tc>
+      </w:tr>
+      <w:tr>
+        <w:trPr>
+          <w:trHeight w:val="2551"/>
+        </w:trPr>
+        <w:tc>
+          <w:tcPr>
+            <w:tcW w:type="dxa" w:w="4422"/>
+            <w:shd w:val="clear" w:color="auto" w:fill="1a3a6b"/>
+            <w:tcBorders>
+              <w:top w:val="single" w:sz="4" w:space="0" w:color="2e6db4"/>
+              <w:left w:val="single" w:sz="4" w:space="0" w:color="2e6db4"/>
+              <w:bottom w:val="single" w:sz="4" w:space="0" w:color="2e6db4"/>
+              <w:right w:val="single" w:sz="4" w:space="0" w:color="2e6db4"/>
+              <w:insideH w:val="single" w:sz="4" w:space="0" w:color="2e6db4"/>
+              <w:insideV w:val="single" w:sz="4" w:space="0" w:color="2e6db4"/>
+            </w:tcBorders>
+          </w:tcPr>
+          <w:p>
+            <w:pPr>
+              <w:spacing w:before="0" w:after="0"/>
+              <w:shd w:val="clear" w:color="auto" w:fill="0d2244"/>
+            </w:pPr>
+            <w:r>
+              <w:rPr>
+                <w:b/>
+                <w:i w:val="0"/>
+                <w:color w:val="F0C040"/>
+                <w:sz w:val="14"/>
+              </w:rPr>
+              <w:t xml:space="preserve"> 5 </w:t>
+            </w:r>
+            <w:r>
+              <w:rPr>
+                <w:b/>
+                <w:i w:val="0"/>
+                <w:color w:val="FFFFFF"/>
+                <w:sz w:val="16"/>
+              </w:rPr>
+              <w:t xml:space="preserve">  ForkJoinPool Design</w:t>
+            </w:r>
+          </w:p>
+          <w:p>
+            <w:pPr>
+              <w:spacing w:before="0" w:after="0"/>
+              <w:ind w:left="227"/>
+              <w:shd w:val="clear" w:color="auto" w:fill="1a3a6b"/>
+            </w:pPr>
+            <w:r>
+              <w:rPr>
+                <w:b w:val="0"/>
+                <w:i w:val="0"/>
+                <w:color w:val="F0C040"/>
+                <w:sz w:val="15"/>
+              </w:rPr>
+              <w:t xml:space="preserve">• </w:t>
+            </w:r>
+            <w:r>
+              <w:rPr>
+                <w:b w:val="0"/>
+                <w:i w:val="0"/>
+                <w:color w:val="FFFFFF"/>
+                <w:sz w:val="15"/>
+              </w:rPr>
+              <w:t>RecursiveAction splits row range in half recursively</w:t>
+            </w:r>
+          </w:p>
+          <w:p>
+            <w:pPr>
+              <w:spacing w:before="0" w:after="0"/>
+              <w:ind w:left="227"/>
+              <w:shd w:val="clear" w:color="auto" w:fill="1a3a6b"/>
+            </w:pPr>
+            <w:r>
+              <w:rPr>
+                <w:b w:val="0"/>
+                <w:i w:val="0"/>
+                <w:color w:val="F0C040"/>
+                <w:sz w:val="15"/>
+              </w:rPr>
+              <w:t xml:space="preserve">• </w:t>
+            </w:r>
+            <w:r>
+              <w:rPr>
+                <w:b w:val="0"/>
+                <w:i w:val="0"/>
+                <w:color w:val="FFFFFF"/>
+                <w:sz w:val="15"/>
+              </w:rPr>
+              <w:t>Base case: range &lt;= 64 rows — process sequentially</w:t>
+            </w:r>
+          </w:p>
+          <w:p>
+            <w:pPr>
+              <w:spacing w:before="0" w:after="0"/>
+              <w:ind w:left="227"/>
+              <w:shd w:val="clear" w:color="auto" w:fill="1a3a6b"/>
+            </w:pPr>
+            <w:r>
+              <w:rPr>
+                <w:b w:val="0"/>
+                <w:i w:val="0"/>
+                <w:color w:val="F0C040"/>
+                <w:sz w:val="15"/>
+              </w:rPr>
+              <w:t xml:space="preserve">• </w:t>
+            </w:r>
+            <w:r>
+              <w:rPr>
+                <w:b w:val="0"/>
+                <w:i w:val="0"/>
+                <w:color w:val="FFFFFF"/>
+                <w:sz w:val="15"/>
+              </w:rPr>
+              <w:t>Work-stealing: idle threads steal tasks from busy queues</w:t>
+            </w:r>
+          </w:p>
+          <w:p>
+            <w:pPr>
+              <w:spacing w:before="0" w:after="0"/>
+              <w:ind w:left="227"/>
+              <w:shd w:val="clear" w:color="auto" w:fill="1a3a6b"/>
+            </w:pPr>
+            <w:r>
+              <w:rPr>
+                <w:b w:val="0"/>
+                <w:i w:val="0"/>
+                <w:color w:val="F0C040"/>
+                <w:sz w:val="15"/>
+              </w:rPr>
+              <w:t xml:space="preserve">• </w:t>
+            </w:r>
+            <w:r>
+              <w:rPr>
+                <w:b w:val="0"/>
+                <w:i w:val="0"/>
+                <w:color w:val="FFFFFF"/>
+                <w:sz w:val="15"/>
+              </w:rPr>
+              <w:t>Better dynamic load balance than static strips for large images</w:t>
+            </w:r>
+          </w:p>
+          <w:p>
+            <w:pPr>
+              <w:spacing w:before="0" w:after="20"/>
+              <w:shd w:val="clear" w:color="auto" w:fill="1a3a6b"/>
+            </w:pPr>
+          </w:p>
+          <w:p>
+            <w:pPr>
+              <w:spacing w:before="0" w:after="0"/>
+              <w:ind w:left="227"/>
+              <w:shd w:val="clear" w:color="auto" w:fill="1a3a6b"/>
+            </w:pPr>
+            <w:r>
+              <w:rPr>
+                <w:b w:val="0"/>
+                <w:i w:val="0"/>
+                <w:color w:val="F0C040"/>
+                <w:sz w:val="15"/>
+              </w:rPr>
+              <w:t xml:space="preserve">• </w:t>
+            </w:r>
+            <w:r>
+              <w:rPr>
+                <w:b w:val="0"/>
+                <w:i w:val="0"/>
+                <w:color w:val="FFFFFF"/>
+                <w:sz w:val="15"/>
+              </w:rPr>
+              <w:t>ForkJoin outperforms Executor on 2048x2048 (Gaussian: 4.81x vs 4.30x)</w:t>
+            </w:r>
+          </w:p>
+          <w:p>
+            <w:pPr>
+              <w:spacing w:before="0" w:after="0"/>
+              <w:jc w:val="center"/>
+              <w:shd w:val="clear" w:color="auto" w:fill="0d2244"/>
+            </w:pPr>
+            <w:r>
+              <w:rPr>
+                <w:b w:val="0"/>
+                <w:i/>
+                <w:color w:val="F0C040"/>
+                <w:sz w:val="13"/>
+              </w:rPr>
+              <w:t xml:space="preserve"> Dynamic decomposition — adapts to runtime load imbalance </w:t>
+            </w:r>
+          </w:p>
+        </w:tc>
+        <w:tc>
+          <w:tcPr>
+            <w:tcW w:type="dxa" w:w="4422"/>
+            <w:shd w:val="clear" w:color="auto" w:fill="1a3a6b"/>
+            <w:tcBorders>
+              <w:top w:val="single" w:sz="4" w:space="0" w:color="2e6db4"/>
+              <w:left w:val="single" w:sz="4" w:space="0" w:color="2e6db4"/>
+              <w:bottom w:val="single" w:sz="4" w:space="0" w:color="2e6db4"/>
+              <w:right w:val="single" w:sz="4" w:space="0" w:color="2e6db4"/>
+              <w:insideH w:val="single" w:sz="4" w:space="0" w:color="2e6db4"/>
+              <w:insideV w:val="single" w:sz="4" w:space="0" w:color="2e6db4"/>
+            </w:tcBorders>
+          </w:tcPr>
+          <w:p>
+            <w:pPr>
+              <w:spacing w:before="0" w:after="0"/>
+              <w:shd w:val="clear" w:color="auto" w:fill="0d2244"/>
+            </w:pPr>
+            <w:r>
+              <w:rPr>
+                <w:b/>
+                <w:i w:val="0"/>
+                <w:color w:val="F0C040"/>
+                <w:sz w:val="14"/>
+              </w:rPr>
+              <w:t xml:space="preserve"> 6 </w:t>
+            </w:r>
+            <w:r>
+              <w:rPr>
+                <w:b/>
+                <w:i w:val="0"/>
+                <w:color w:val="FFFFFF"/>
+                <w:sz w:val="16"/>
+              </w:rPr>
+              <w:t xml:space="preserve">  Correctness Verification</w:t>
+            </w:r>
+          </w:p>
+          <w:p>
+            <w:pPr>
+              <w:spacing w:before="0" w:after="0"/>
+              <w:jc w:val="center"/>
+              <w:shd w:val="clear" w:color="auto" w:fill="1a3a6b"/>
+            </w:pPr>
+            <w:r>
+              <w:rPr>
+                <w:b w:val="0"/>
+                <w:i/>
+                <w:color w:val="AACCEE"/>
+                <w:sz w:val="14"/>
+              </w:rPr>
+              <w:t>CorrectnessVerifier.firstDifference() — pixel-by-pixel scan</w:t>
+            </w:r>
+          </w:p>
+          <w:p>
+            <w:pPr>
+              <w:spacing w:before="0" w:after="20"/>
+              <w:shd w:val="clear" w:color="auto" w:fill="1a3a6b"/>
+            </w:pPr>
+          </w:p>
+          <w:p>
+            <w:pPr>
+              <w:spacing w:before="0" w:after="0"/>
+              <w:jc w:val="center"/>
+              <w:shd w:val="clear" w:color="auto" w:fill="1a3a6b"/>
+            </w:pPr>
+            <w:r>
+              <w:rPr>
+                <w:b w:val="0"/>
+                <w:i/>
+                <w:color w:val="AACCEE"/>
+                <w:sz w:val="14"/>
+              </w:rPr>
+              <w:t>Tested on 2048x2048 synthetic image — ALL 6 combinations PASS</w:t>
+            </w:r>
+          </w:p>
+          <w:p>
+            <w:pPr>
+              <w:spacing w:before="0" w:after="20"/>
+              <w:shd w:val="clear" w:color="auto" w:fill="1a3a6b"/>
+            </w:pPr>
+          </w:p>
+          <w:p>
+            <w:pPr>
+              <w:spacing w:before="0" w:after="0"/>
+              <w:ind w:left="227"/>
+              <w:shd w:val="clear" w:color="auto" w:fill="1a3a6b"/>
+            </w:pPr>
+            <w:r>
+              <w:rPr>
+                <w:b w:val="0"/>
+                <w:i w:val="0"/>
+                <w:color w:val="F0C040"/>
+                <w:sz w:val="15"/>
+              </w:rPr>
+              <w:t xml:space="preserve">• </w:t>
+            </w:r>
+            <w:r>
+              <w:rPr>
+                <w:b w:val="0"/>
+                <w:i w:val="0"/>
+                <w:color w:val="FFFFFF"/>
+                <w:sz w:val="15"/>
+              </w:rPr>
+              <w:t>Grayscale:       Executor PASS  |  ForkJoin PASS</w:t>
+            </w:r>
+          </w:p>
+          <w:p>
+            <w:pPr>
+              <w:spacing w:before="0" w:after="0"/>
+              <w:ind w:left="227"/>
+              <w:shd w:val="clear" w:color="auto" w:fill="1a3a6b"/>
+            </w:pPr>
+            <w:r>
+              <w:rPr>
+                <w:b w:val="0"/>
+                <w:i w:val="0"/>
+                <w:color w:val="F0C040"/>
+                <w:sz w:val="15"/>
+              </w:rPr>
+              <w:t xml:space="preserve">• </w:t>
+            </w:r>
+            <w:r>
+              <w:rPr>
+                <w:b w:val="0"/>
+                <w:i w:val="0"/>
+                <w:color w:val="FFFFFF"/>
+                <w:sz w:val="15"/>
+              </w:rPr>
+              <w:t>GaussianBlur5x5: Executor PASS  |  ForkJoin PASS</w:t>
+            </w:r>
+          </w:p>
+          <w:p>
+            <w:pPr>
+              <w:spacing w:before="0" w:after="0"/>
+              <w:ind w:left="227"/>
+              <w:shd w:val="clear" w:color="auto" w:fill="1a3a6b"/>
+            </w:pPr>
+            <w:r>
+              <w:rPr>
+                <w:b w:val="0"/>
+                <w:i w:val="0"/>
+                <w:color w:val="F0C040"/>
+                <w:sz w:val="15"/>
+              </w:rPr>
+              <w:t xml:space="preserve">• </w:t>
+            </w:r>
+            <w:r>
+              <w:rPr>
+                <w:b w:val="0"/>
+                <w:i w:val="0"/>
+                <w:color w:val="FFFFFF"/>
+                <w:sz w:val="15"/>
+              </w:rPr>
+              <w:t>Sobel3x3:        Executor PASS  |  ForkJoin PASS</w:t>
+            </w:r>
+          </w:p>
+          <w:p>
+            <w:pPr>
+              <w:spacing w:before="0" w:after="0"/>
+              <w:jc w:val="center"/>
+              <w:shd w:val="clear" w:color="auto" w:fill="0d2244"/>
+            </w:pPr>
+            <w:r>
+              <w:rPr>
+                <w:b w:val="0"/>
+                <w:i/>
+                <w:color w:val="F0C040"/>
+                <w:sz w:val="13"/>
+              </w:rPr>
+              <w:t xml:space="preserve"> Bit-identical output to sequential baseline in all cases </w:t>
+            </w:r>
+          </w:p>
+        </w:tc>
+      </w:tr>
+      <w:tr>
+        <w:trPr>
+          <w:trHeight w:val="2551"/>
+        </w:trPr>
+        <w:tc>
+          <w:tcPr>
+            <w:tcW w:type="dxa" w:w="4422"/>
+            <w:shd w:val="clear" w:color="auto" w:fill="1a3a6b"/>
+            <w:tcBorders>
+              <w:top w:val="single" w:sz="4" w:space="0" w:color="2e6db4"/>
+              <w:left w:val="single" w:sz="4" w:space="0" w:color="2e6db4"/>
+              <w:bottom w:val="single" w:sz="4" w:space="0" w:color="2e6db4"/>
+              <w:right w:val="single" w:sz="4" w:space="0" w:color="2e6db4"/>
+              <w:insideH w:val="single" w:sz="4" w:space="0" w:color="2e6db4"/>
+              <w:insideV w:val="single" w:sz="4" w:space="0" w:color="2e6db4"/>
+            </w:tcBorders>
+          </w:tcPr>
+          <w:p>
+            <w:pPr>
+              <w:spacing w:before="0" w:after="0"/>
+              <w:shd w:val="clear" w:color="auto" w:fill="0d2244"/>
+            </w:pPr>
+            <w:r>
+              <w:rPr>
+                <w:b/>
+                <w:i w:val="0"/>
+                <w:color w:val="F0C040"/>
+                <w:sz w:val="14"/>
+              </w:rPr>
+              <w:t xml:space="preserve"> 7 </w:t>
+            </w:r>
+            <w:r>
+              <w:rPr>
+                <w:b/>
+                <w:i w:val="0"/>
+                <w:color w:val="FFFFFF"/>
+                <w:sz w:val="16"/>
+              </w:rPr>
+              <w:t xml:space="preserve">  Performance Results (8 threads, 2048x2048)</w:t>
+            </w:r>
+          </w:p>
+          <w:p>
+            <w:pPr>
+              <w:spacing w:before="0" w:after="0"/>
+              <w:ind w:left="113"/>
+              <w:shd w:val="clear" w:color="auto" w:fill="1a3a6b"/>
+            </w:pPr>
+            <w:r>
+              <w:rPr>
+                <w:b/>
+                <w:i w:val="0"/>
+                <w:color w:val="F0C040"/>
+                <w:sz w:val="15"/>
+              </w:rPr>
+              <w:t>Compute-bound (scales well):</w:t>
+            </w:r>
+          </w:p>
+          <w:p>
+            <w:pPr>
+              <w:spacing w:before="0" w:after="0"/>
+              <w:ind w:left="227"/>
+              <w:shd w:val="clear" w:color="auto" w:fill="1a3a6b"/>
+            </w:pPr>
+            <w:r>
+              <w:rPr>
+                <w:b w:val="0"/>
+                <w:i w:val="0"/>
+                <w:color w:val="F0C040"/>
+                <w:sz w:val="15"/>
+              </w:rPr>
+              <w:t xml:space="preserve">• </w:t>
+            </w:r>
+            <w:r>
+              <w:rPr>
+                <w:b w:val="0"/>
+                <w:i w:val="0"/>
+                <w:color w:val="FFFFFF"/>
+                <w:sz w:val="15"/>
+              </w:rPr>
+              <w:t>Gaussian Blur:  Executor 4.30x  |  ForkJoin 4.81x</w:t>
+            </w:r>
+          </w:p>
+          <w:p>
+            <w:pPr>
+              <w:spacing w:before="0" w:after="0"/>
+              <w:ind w:left="227"/>
+              <w:shd w:val="clear" w:color="auto" w:fill="1a3a6b"/>
+            </w:pPr>
+            <w:r>
+              <w:rPr>
+                <w:b w:val="0"/>
+                <w:i w:val="0"/>
+                <w:color w:val="F0C040"/>
+                <w:sz w:val="15"/>
+              </w:rPr>
+              <w:t xml:space="preserve">• </w:t>
+            </w:r>
+            <w:r>
+              <w:rPr>
+                <w:b w:val="0"/>
+                <w:i w:val="0"/>
+                <w:color w:val="FFFFFF"/>
+                <w:sz w:val="15"/>
+              </w:rPr>
+              <w:t>Sobel 3x3:      Executor 4.49x  |  ForkJoin 5.10x</w:t>
+            </w:r>
+          </w:p>
+          <w:p>
+            <w:pPr>
+              <w:spacing w:before="0" w:after="20"/>
+              <w:shd w:val="clear" w:color="auto" w:fill="1a3a6b"/>
+            </w:pPr>
+          </w:p>
+          <w:p>
+            <w:pPr>
+              <w:spacing w:before="0" w:after="0"/>
+              <w:ind w:left="113"/>
+              <w:shd w:val="clear" w:color="auto" w:fill="1a3a6b"/>
+            </w:pPr>
+            <w:r>
+              <w:rPr>
+                <w:b/>
+                <w:i w:val="0"/>
+                <w:color w:val="F0C040"/>
+                <w:sz w:val="15"/>
+              </w:rPr>
+              <w:t>Memory-bound (bandwidth limited):</w:t>
+            </w:r>
+          </w:p>
+          <w:p>
+            <w:pPr>
+              <w:spacing w:before="0" w:after="0"/>
+              <w:ind w:left="227"/>
+              <w:shd w:val="clear" w:color="auto" w:fill="1a3a6b"/>
+            </w:pPr>
+            <w:r>
+              <w:rPr>
+                <w:b w:val="0"/>
+                <w:i w:val="0"/>
+                <w:color w:val="F0C040"/>
+                <w:sz w:val="15"/>
+              </w:rPr>
+              <w:t xml:space="preserve">• </w:t>
+            </w:r>
+            <w:r>
+              <w:rPr>
+                <w:b w:val="0"/>
+                <w:i w:val="0"/>
+                <w:color w:val="FFFFFF"/>
+                <w:sz w:val="15"/>
+              </w:rPr>
+              <w:t>Grayscale:      Executor 1.55x  |  ForkJoin 1.54x</w:t>
+            </w:r>
+          </w:p>
+          <w:p>
+            <w:pPr>
+              <w:spacing w:before="0" w:after="0"/>
+              <w:jc w:val="center"/>
+              <w:shd w:val="clear" w:color="auto" w:fill="0d2244"/>
+            </w:pPr>
+            <w:r>
+              <w:rPr>
+                <w:b w:val="0"/>
+                <w:i/>
+                <w:color w:val="F0C040"/>
+                <w:sz w:val="13"/>
+              </w:rPr>
+              <w:t xml:space="preserve"> JMH | 10 warm-up + 10 measurement iterations | AverageTime ms/op </w:t>
+            </w:r>
+          </w:p>
+        </w:tc>
+        <w:tc>
+          <w:tcPr>
+            <w:tcW w:type="dxa" w:w="4422"/>
+            <w:shd w:val="clear" w:color="auto" w:fill="1a3a6b"/>
+            <w:tcBorders>
+              <w:top w:val="single" w:sz="4" w:space="0" w:color="2e6db4"/>
+              <w:left w:val="single" w:sz="4" w:space="0" w:color="2e6db4"/>
+              <w:bottom w:val="single" w:sz="4" w:space="0" w:color="2e6db4"/>
+              <w:right w:val="single" w:sz="4" w:space="0" w:color="2e6db4"/>
+              <w:insideH w:val="single" w:sz="4" w:space="0" w:color="2e6db4"/>
+              <w:insideV w:val="single" w:sz="4" w:space="0" w:color="2e6db4"/>
+            </w:tcBorders>
+          </w:tcPr>
+          <w:p>
+            <w:pPr>
+              <w:spacing w:before="0" w:after="0"/>
+              <w:shd w:val="clear" w:color="auto" w:fill="0d2244"/>
+            </w:pPr>
+            <w:r>
+              <w:rPr>
+                <w:b/>
+                <w:i w:val="0"/>
+                <w:color w:val="F0C040"/>
+                <w:sz w:val="14"/>
+              </w:rPr>
+              <w:t xml:space="preserve"> 8 </w:t>
+            </w:r>
+            <w:r>
+              <w:rPr>
+                <w:b/>
+                <w:i w:val="0"/>
+                <w:color w:val="FFFFFF"/>
+                <w:sz w:val="16"/>
+              </w:rPr>
+              <w:t xml:space="preserve">  Speedup Charts</w:t>
+            </w:r>
+          </w:p>
+          <w:p>
+            <w:pPr>
+              <w:spacing w:before="0" w:after="20"/>
+              <w:shd w:val="clear" w:color="auto" w:fill="1a3a6b"/>
+            </w:pPr>
+          </w:p>
+          <w:p>
+            <w:pPr>
+              <w:spacing w:before="0" w:after="0"/>
+              <w:jc w:val="center"/>
+              <w:shd w:val="clear" w:color="auto" w:fill="1a3a6b"/>
+            </w:pPr>
+            <w:r>
+              <w:rPr>
+                <w:b w:val="0"/>
+                <w:i/>
+                <w:color w:val="AACCEE"/>
+                <w:sz w:val="14"/>
+              </w:rPr>
+              <w:t>GaussianBlur5x5 &amp; Sobel — near-linear scaling up to 4-5x at 8 threads</w:t>
+            </w:r>
+          </w:p>
+          <w:p>
+            <w:pPr>
+              <w:spacing w:before="0" w:after="0"/>
+              <w:jc w:val="center"/>
+              <w:shd w:val="clear" w:color="auto" w:fill="1a3a6b"/>
+            </w:pPr>
+            <w:r>
+              <w:rPr>
+                <w:b w:val="0"/>
+                <w:i/>
+                <w:color w:val="AACCEE"/>
+                <w:sz w:val="14"/>
+              </w:rPr>
+              <w:t>Grayscale — memory bandwidth saturation caps speedup at ~1.5x</w:t>
+            </w:r>
+          </w:p>
+          <w:p>
+            <w:pPr>
+              <w:spacing w:before="0" w:after="0"/>
+              <w:jc w:val="center"/>
+              <w:shd w:val="clear" w:color="auto" w:fill="1a3a6b"/>
+            </w:pPr>
+            <w:r>
+              <w:rPr>
+                <w:b w:val="0"/>
+                <w:i/>
+                <w:color w:val="AACCEE"/>
+                <w:sz w:val="14"/>
+              </w:rPr>
+              <w:t>ForkJoin advantage grows with image size (work-stealing benefit)</w:t>
+            </w:r>
+          </w:p>
+          <w:p>
+            <w:pPr>
+              <w:spacing w:before="0" w:after="20"/>
+              <w:shd w:val="clear" w:color="auto" w:fill="1a3a6b"/>
+            </w:pPr>
+          </w:p>
+          <w:p>
+            <w:pPr>
+              <w:spacing w:before="0" w:after="0"/>
+              <w:jc w:val="center"/>
+              <w:shd w:val="clear" w:color="auto" w:fill="1a3a6b"/>
+            </w:pPr>
+            <w:r>
+              <w:rPr>
+                <w:b w:val="0"/>
+                <w:i/>
+                <w:color w:val="AACCEE"/>
+                <w:sz w:val="14"/>
+              </w:rPr>
+              <w:t>[See Figures 1-4 in the report section for full charts]</w:t>
+            </w:r>
+          </w:p>
+          <w:p>
+            <w:pPr>
+              <w:spacing w:before="0" w:after="0"/>
+              <w:jc w:val="center"/>
+              <w:shd w:val="clear" w:color="auto" w:fill="0d2244"/>
+            </w:pPr>
+            <w:r>
+              <w:rPr>
+                <w:b w:val="0"/>
+                <w:i/>
+                <w:color w:val="F0C040"/>
+                <w:sz w:val="13"/>
+              </w:rPr>
+              <w:t xml:space="preserve"> Roofline Model: compute-bound = scales | memory-bound = does not </w:t>
+            </w:r>
+          </w:p>
+        </w:tc>
+      </w:tr>
+      <w:tr>
+        <w:trPr>
+          <w:trHeight w:val="2551"/>
+        </w:trPr>
+        <w:tc>
+          <w:tcPr>
+            <w:tcW w:type="dxa" w:w="4422"/>
+            <w:shd w:val="clear" w:color="auto" w:fill="1a3a6b"/>
+            <w:tcBorders>
+              <w:top w:val="single" w:sz="4" w:space="0" w:color="2e6db4"/>
+              <w:left w:val="single" w:sz="4" w:space="0" w:color="2e6db4"/>
+              <w:bottom w:val="single" w:sz="4" w:space="0" w:color="2e6db4"/>
+              <w:right w:val="single" w:sz="4" w:space="0" w:color="2e6db4"/>
+              <w:insideH w:val="single" w:sz="4" w:space="0" w:color="2e6db4"/>
+              <w:insideV w:val="single" w:sz="4" w:space="0" w:color="2e6db4"/>
+            </w:tcBorders>
+          </w:tcPr>
+          <w:p>
+            <w:pPr>
+              <w:spacing w:before="0" w:after="0"/>
+              <w:shd w:val="clear" w:color="auto" w:fill="0d2244"/>
+            </w:pPr>
+            <w:r>
+              <w:rPr>
+                <w:b/>
+                <w:i w:val="0"/>
+                <w:color w:val="F0C040"/>
+                <w:sz w:val="14"/>
+              </w:rPr>
+              <w:t xml:space="preserve"> 9 </w:t>
+            </w:r>
+            <w:r>
+              <w:rPr>
+                <w:b/>
+                <w:i w:val="0"/>
+                <w:color w:val="FFFFFF"/>
+                <w:sz w:val="16"/>
+              </w:rPr>
+              <w:t xml:space="preserve">  Challenges &amp; Key Findings</w:t>
+            </w:r>
+          </w:p>
+          <w:p>
+            <w:pPr>
+              <w:spacing w:before="0" w:after="0"/>
+              <w:ind w:left="227"/>
+              <w:shd w:val="clear" w:color="auto" w:fill="1a3a6b"/>
+            </w:pPr>
+            <w:r>
+              <w:rPr>
+                <w:b w:val="0"/>
+                <w:i w:val="0"/>
+                <w:color w:val="F0C040"/>
+                <w:sz w:val="15"/>
+              </w:rPr>
+              <w:t xml:space="preserve">• </w:t>
+            </w:r>
+            <w:r>
+              <w:rPr>
+                <w:b w:val="0"/>
+                <w:i w:val="0"/>
+                <w:color w:val="FFFFFF"/>
+                <w:sz w:val="15"/>
+              </w:rPr>
+              <w:t>JIT warm-up noise — solved with JMH (fork-per-config, 10 warm-up iters)</w:t>
+            </w:r>
+          </w:p>
+          <w:p>
+            <w:pPr>
+              <w:spacing w:before="0" w:after="0"/>
+              <w:ind w:left="227"/>
+              <w:shd w:val="clear" w:color="auto" w:fill="1a3a6b"/>
+            </w:pPr>
+            <w:r>
+              <w:rPr>
+                <w:b w:val="0"/>
+                <w:i w:val="0"/>
+                <w:color w:val="F0C040"/>
+                <w:sz w:val="15"/>
+              </w:rPr>
+              <w:t xml:space="preserve">• </w:t>
+            </w:r>
+            <w:r>
+              <w:rPr>
+                <w:b w:val="0"/>
+                <w:i w:val="0"/>
+                <w:color w:val="FFFFFF"/>
+                <w:sz w:val="15"/>
+              </w:rPr>
+              <w:t>Correctness — clamped edges + pixel-for-pixel CorrectnessVerifier</w:t>
+            </w:r>
+          </w:p>
+          <w:p>
+            <w:pPr>
+              <w:spacing w:before="0" w:after="0"/>
+              <w:ind w:left="227"/>
+              <w:shd w:val="clear" w:color="auto" w:fill="1a3a6b"/>
+            </w:pPr>
+            <w:r>
+              <w:rPr>
+                <w:b w:val="0"/>
+                <w:i w:val="0"/>
+                <w:color w:val="F0C040"/>
+                <w:sz w:val="15"/>
+              </w:rPr>
+              <w:t xml:space="preserve">• </w:t>
+            </w:r>
+            <w:r>
+              <w:rPr>
+                <w:b w:val="0"/>
+                <w:i w:val="0"/>
+                <w:color w:val="FFFFFF"/>
+                <w:sz w:val="15"/>
+              </w:rPr>
+              <w:t>Grayscale bottleneck — memory bandwidth saturated (Roofline Model)</w:t>
+            </w:r>
+          </w:p>
+          <w:p>
+            <w:pPr>
+              <w:spacing w:before="0" w:after="0"/>
+              <w:ind w:left="227"/>
+              <w:shd w:val="clear" w:color="auto" w:fill="1a3a6b"/>
+            </w:pPr>
+            <w:r>
+              <w:rPr>
+                <w:b w:val="0"/>
+                <w:i w:val="0"/>
+                <w:color w:val="F0C040"/>
+                <w:sz w:val="15"/>
+              </w:rPr>
+              <w:t xml:space="preserve">• </w:t>
+            </w:r>
+            <w:r>
+              <w:rPr>
+                <w:b w:val="0"/>
+                <w:i w:val="0"/>
+                <w:color w:val="FFFFFF"/>
+                <w:sz w:val="15"/>
+              </w:rPr>
+              <w:t>ForkJoin overhead on small images — tuned threshold to 64 rows</w:t>
+            </w:r>
+          </w:p>
+          <w:p>
+            <w:pPr>
+              <w:spacing w:before="0" w:after="20"/>
+              <w:shd w:val="clear" w:color="auto" w:fill="1a3a6b"/>
+            </w:pPr>
+          </w:p>
+          <w:p>
+            <w:pPr>
+              <w:spacing w:before="0" w:after="0"/>
+              <w:jc w:val="center"/>
+              <w:shd w:val="clear" w:color="auto" w:fill="1a3a6b"/>
+            </w:pPr>
+            <w:r>
+              <w:rPr>
+                <w:b w:val="0"/>
+                <w:i/>
+                <w:color w:val="AACCEE"/>
+                <w:sz w:val="14"/>
+              </w:rPr>
+              <w:t>Key insight: speedup is FILTER-DEPENDENT — arithmetic intensity determines scalability</w:t>
+            </w:r>
+          </w:p>
+          <w:p>
+            <w:pPr>
+              <w:spacing w:before="0" w:after="0"/>
+              <w:jc w:val="center"/>
+              <w:shd w:val="clear" w:color="auto" w:fill="0d2244"/>
+            </w:pPr>
+            <w:r>
+              <w:rPr>
+                <w:b w:val="0"/>
+                <w:i/>
+                <w:color w:val="F0C040"/>
+                <w:sz w:val="13"/>
+              </w:rPr>
+              <w:t xml:space="preserve"> Benchmark: 12 logical cores, JDK 17, Maven 3.6 </w:t>
+            </w:r>
+          </w:p>
+        </w:tc>
+        <w:tc>
+          <w:tcPr>
+            <w:tcW w:type="dxa" w:w="4422"/>
+            <w:shd w:val="clear" w:color="auto" w:fill="1a3a6b"/>
+            <w:tcBorders>
+              <w:top w:val="single" w:sz="4" w:space="0" w:color="2e6db4"/>
+              <w:left w:val="single" w:sz="4" w:space="0" w:color="2e6db4"/>
+              <w:bottom w:val="single" w:sz="4" w:space="0" w:color="2e6db4"/>
+              <w:right w:val="single" w:sz="4" w:space="0" w:color="2e6db4"/>
+              <w:insideH w:val="single" w:sz="4" w:space="0" w:color="2e6db4"/>
+              <w:insideV w:val="single" w:sz="4" w:space="0" w:color="2e6db4"/>
+            </w:tcBorders>
+          </w:tcPr>
+          <w:p>
+            <w:pPr>
+              <w:spacing w:before="0" w:after="0"/>
+              <w:shd w:val="clear" w:color="auto" w:fill="0d2244"/>
+            </w:pPr>
+            <w:r>
+              <w:rPr>
+                <w:b/>
+                <w:i w:val="0"/>
+                <w:color w:val="F0C040"/>
+                <w:sz w:val="14"/>
+              </w:rPr>
+              <w:t xml:space="preserve"> 10 </w:t>
+            </w:r>
+            <w:r>
+              <w:rPr>
+                <w:b/>
+                <w:i w:val="0"/>
+                <w:color w:val="FFFFFF"/>
+                <w:sz w:val="16"/>
+              </w:rPr>
+              <w:t xml:space="preserve">  Conclusion &amp; Future Work</w:t>
+            </w:r>
+          </w:p>
+          <w:p>
+            <w:pPr>
+              <w:spacing w:before="0" w:after="0"/>
+              <w:ind w:left="227"/>
+              <w:shd w:val="clear" w:color="auto" w:fill="1a3a6b"/>
+            </w:pPr>
+            <w:r>
+              <w:rPr>
+                <w:b w:val="0"/>
+                <w:i w:val="0"/>
+                <w:color w:val="F0C040"/>
+                <w:sz w:val="15"/>
+              </w:rPr>
+              <w:t xml:space="preserve">• </w:t>
+            </w:r>
+            <w:r>
+              <w:rPr>
+                <w:b w:val="0"/>
+                <w:i w:val="0"/>
+                <w:color w:val="FFFFFF"/>
+                <w:sz w:val="15"/>
+              </w:rPr>
+              <w:t>Parallelised 3 convolution filters with 2 Java concurrency strategies</w:t>
+            </w:r>
+          </w:p>
+          <w:p>
+            <w:pPr>
+              <w:spacing w:before="0" w:after="0"/>
+              <w:ind w:left="227"/>
+              <w:shd w:val="clear" w:color="auto" w:fill="1a3a6b"/>
+            </w:pPr>
+            <w:r>
+              <w:rPr>
+                <w:b w:val="0"/>
+                <w:i w:val="0"/>
+                <w:color w:val="F0C040"/>
+                <w:sz w:val="15"/>
+              </w:rPr>
+              <w:t xml:space="preserve">• </w:t>
+            </w:r>
+            <w:r>
+              <w:rPr>
+                <w:b w:val="0"/>
+                <w:i w:val="0"/>
+                <w:color w:val="FFFFFF"/>
+                <w:sz w:val="15"/>
+              </w:rPr>
+              <w:t>Up to 5.10x speedup (Sobel, ForkJoin, 8 threads, 2048x2048)</w:t>
+            </w:r>
+          </w:p>
+          <w:p>
+            <w:pPr>
+              <w:spacing w:before="0" w:after="0"/>
+              <w:ind w:left="227"/>
+              <w:shd w:val="clear" w:color="auto" w:fill="1a3a6b"/>
+            </w:pPr>
+            <w:r>
+              <w:rPr>
+                <w:b w:val="0"/>
+                <w:i w:val="0"/>
+                <w:color w:val="F0C040"/>
+                <w:sz w:val="15"/>
+              </w:rPr>
+              <w:t xml:space="preserve">• </w:t>
+            </w:r>
+            <w:r>
+              <w:rPr>
+                <w:b w:val="0"/>
+                <w:i w:val="0"/>
+                <w:color w:val="FFFFFF"/>
+                <w:sz w:val="15"/>
+              </w:rPr>
+              <w:t>Memory-bound filters need different strategy (not thread-level parallelism)</w:t>
+            </w:r>
+          </w:p>
+          <w:p>
+            <w:pPr>
+              <w:spacing w:before="0" w:after="0"/>
+              <w:ind w:left="113"/>
+              <w:shd w:val="clear" w:color="auto" w:fill="1a3a6b"/>
+            </w:pPr>
+            <w:r>
+              <w:rPr>
+                <w:b/>
+                <w:i w:val="0"/>
+                <w:color w:val="F0C040"/>
+                <w:sz w:val="15"/>
+              </w:rPr>
+              <w:t>Future Work:</w:t>
+            </w:r>
+          </w:p>
+          <w:p>
+            <w:pPr>
+              <w:spacing w:before="0" w:after="0"/>
+              <w:ind w:left="227"/>
+              <w:shd w:val="clear" w:color="auto" w:fill="1a3a6b"/>
+            </w:pPr>
+            <w:r>
+              <w:rPr>
+                <w:b w:val="0"/>
+                <w:i w:val="0"/>
+                <w:color w:val="F0C040"/>
+                <w:sz w:val="15"/>
+              </w:rPr>
+              <w:t xml:space="preserve">• </w:t>
+            </w:r>
+            <w:r>
+              <w:rPr>
+                <w:b w:val="0"/>
+                <w:i w:val="0"/>
+                <w:color w:val="FFFFFF"/>
+                <w:sz w:val="15"/>
+              </w:rPr>
+              <w:t>GPU/CUDA — thousands of concurrent cores for pixel-independent kernels</w:t>
+            </w:r>
+          </w:p>
+          <w:p>
+            <w:pPr>
+              <w:spacing w:before="0" w:after="0"/>
+              <w:ind w:left="227"/>
+              <w:shd w:val="clear" w:color="auto" w:fill="1a3a6b"/>
+            </w:pPr>
+            <w:r>
+              <w:rPr>
+                <w:b w:val="0"/>
+                <w:i w:val="0"/>
+                <w:color w:val="F0C040"/>
+                <w:sz w:val="15"/>
+              </w:rPr>
+              <w:t xml:space="preserve">• </w:t>
+            </w:r>
+            <w:r>
+              <w:rPr>
+                <w:b w:val="0"/>
+                <w:i w:val="0"/>
+                <w:color w:val="FFFFFF"/>
+                <w:sz w:val="15"/>
+              </w:rPr>
+              <w:t>SIMD vectorisation (AVX2/AVX-512) for intra-core throughput</w:t>
+            </w:r>
+          </w:p>
+          <w:p>
+            <w:pPr>
+              <w:spacing w:before="0" w:after="0"/>
+              <w:ind w:left="227"/>
+              <w:shd w:val="clear" w:color="auto" w:fill="1a3a6b"/>
+            </w:pPr>
+            <w:r>
+              <w:rPr>
+                <w:b w:val="0"/>
+                <w:i w:val="0"/>
+                <w:color w:val="F0C040"/>
+                <w:sz w:val="15"/>
+              </w:rPr>
+              <w:t xml:space="preserve">• </w:t>
+            </w:r>
+            <w:r>
+              <w:rPr>
+                <w:b w:val="0"/>
+                <w:i w:val="0"/>
+                <w:color w:val="FFFFFF"/>
+                <w:sz w:val="15"/>
+              </w:rPr>
+              <w:t>Adaptive thread pool — dynamic tuning per image size and hardware</w:t>
+            </w:r>
+          </w:p>
+          <w:p>
+            <w:pPr>
+              <w:spacing w:before="0" w:after="0"/>
+              <w:jc w:val="center"/>
+              <w:shd w:val="clear" w:color="auto" w:fill="0d2244"/>
+            </w:pPr>
+            <w:r>
+              <w:rPr>
+                <w:b w:val="0"/>
+                <w:i/>
+                <w:color w:val="F0C040"/>
+                <w:sz w:val="13"/>
+              </w:rPr>
+              <w:t xml:space="preserve"> https://github.com/Muhammedcakirgoz/parallel-image-processing </w:t>
+            </w:r>
+          </w:p>
+        </w:tc>
+      </w:tr>
+    </w:tbl>
     <w:sectPr>
       <w:pgSz w:w="11906" w:h="16838"/>
       <w:pgMar w:top="1134" w:right="1417" w:bottom="1134" w:left="1417" w:header="720" w:footer="720" w:gutter="0"/>

</xml_diff>

<commit_message>
Update docx: each slide on its own full page
Co-Authored-By: Claude Sonnet 4.6 <noreply@anthropic.com>
</commit_message>
<xml_diff>
--- a/CENG479_Sub2_Final_Report.docx
+++ b/CENG479_Sub2_Final_Report.docx
@@ -10360,16 +10360,12 @@
         <w:tblLook w:firstColumn="1" w:firstRow="1" w:lastColumn="0" w:lastRow="0" w:noHBand="0" w:noVBand="1" w:val="04A0"/>
       </w:tblPr>
       <w:tblGrid>
-        <w:gridCol w:w="4536"/>
-        <w:gridCol w:w="4536"/>
+        <w:gridCol w:w="9072"/>
       </w:tblGrid>
       <w:tr>
-        <w:trPr>
-          <w:trHeight w:val="2551"/>
-        </w:trPr>
         <w:tc>
           <w:tcPr>
-            <w:tcW w:type="dxa" w:w="4422"/>
+            <w:tcW w:type="dxa" w:w="9071"/>
             <w:shd w:val="clear" w:color="auto" w:fill="1a3a6b"/>
             <w:tcBorders>
               <w:top w:val="single" w:sz="4" w:space="0" w:color="2e6db4"/>
@@ -10383,6 +10379,28 @@
           <w:p>
             <w:pPr>
               <w:spacing w:before="0" w:after="0"/>
+              <w:shd w:val="clear" w:color="auto" w:fill="F0C040"/>
+            </w:pPr>
+            <w:r>
+              <w:rPr>
+                <w:b/>
+                <w:i w:val="0"/>
+                <w:color w:val="1A3A6B"/>
+                <w:sz w:val="18"/>
+              </w:rPr>
+              <w:t xml:space="preserve">  CENG 479 — Parallel Computing  |  Slide 1 / 10  </w:t>
+            </w:r>
+          </w:p>
+          <w:p>
+            <w:pPr>
+              <w:spacing w:before="0" w:after="0"/>
+              <w:jc w:val="left"/>
+              <w:shd w:val="clear" w:color="auto" w:fill="1a3a6b"/>
+            </w:pPr>
+          </w:p>
+          <w:p>
+            <w:pPr>
+              <w:spacing w:before="0" w:after="80"/>
               <w:shd w:val="clear" w:color="auto" w:fill="0d2244"/>
             </w:pPr>
             <w:r>
@@ -10390,29 +10408,39 @@
                 <w:b/>
                 <w:i w:val="0"/>
                 <w:color w:val="F0C040"/>
-                <w:sz w:val="14"/>
-              </w:rPr>
-              <w:t xml:space="preserve"> 1 </w:t>
+                <w:sz w:val="28"/>
+              </w:rPr>
+              <w:t xml:space="preserve">  1  </w:t>
             </w:r>
             <w:r>
               <w:rPr>
                 <w:b/>
                 <w:i w:val="0"/>
                 <w:color w:val="FFFFFF"/>
-                <w:sz w:val="16"/>
-              </w:rPr>
-              <w:t xml:space="preserve">  Parallel Image Processing Engine</w:t>
-            </w:r>
-          </w:p>
-          <w:p>
-            <w:pPr>
-              <w:spacing w:before="0" w:after="20"/>
+                <w:sz w:val="32"/>
+              </w:rPr>
+              <w:t xml:space="preserve">   Parallel Image Processing Engine</w:t>
+            </w:r>
+          </w:p>
+          <w:p>
+            <w:pPr>
+              <w:spacing w:before="0" w:after="120"/>
               <w:shd w:val="clear" w:color="auto" w:fill="1a3a6b"/>
-            </w:pPr>
-          </w:p>
-          <w:p>
-            <w:pPr>
-              <w:spacing w:before="0" w:after="0"/>
+              <w:pBdr>
+                <w:bottom w:val="single" w:sz="12" w:space="4" w:color="F0C040"/>
+              </w:pBdr>
+            </w:pPr>
+          </w:p>
+          <w:p>
+            <w:pPr>
+              <w:spacing w:before="0" w:after="80"/>
+              <w:jc w:val="left"/>
+              <w:shd w:val="clear" w:color="auto" w:fill="1a3a6b"/>
+            </w:pPr>
+          </w:p>
+          <w:p>
+            <w:pPr>
+              <w:spacing w:before="80" w:after="80"/>
               <w:jc w:val="center"/>
               <w:shd w:val="clear" w:color="auto" w:fill="1a3a6b"/>
             </w:pPr>
@@ -10421,14 +10449,14 @@
                 <w:b w:val="0"/>
                 <w:i/>
                 <w:color w:val="AACCEE"/>
-                <w:sz w:val="14"/>
+                <w:sz w:val="20"/>
               </w:rPr>
               <w:t>CENG 479 — Parallel Computing  |  Gazi University  |  Spring 2026</w:t>
             </w:r>
           </w:p>
           <w:p>
             <w:pPr>
-              <w:spacing w:before="0" w:after="0"/>
+              <w:spacing w:before="80" w:after="80"/>
               <w:jc w:val="center"/>
               <w:shd w:val="clear" w:color="auto" w:fill="1a3a6b"/>
             </w:pPr>
@@ -10437,20 +10465,21 @@
                 <w:b w:val="0"/>
                 <w:i/>
                 <w:color w:val="AACCEE"/>
-                <w:sz w:val="14"/>
+                <w:sz w:val="20"/>
               </w:rPr>
               <w:t>Muhammed Cakiagoz   ·   Musa Bilal Yaz</w:t>
             </w:r>
           </w:p>
           <w:p>
             <w:pPr>
-              <w:spacing w:before="0" w:after="20"/>
+              <w:spacing w:before="0" w:after="80"/>
+              <w:jc w:val="left"/>
               <w:shd w:val="clear" w:color="auto" w:fill="1a3a6b"/>
             </w:pPr>
           </w:p>
           <w:p>
             <w:pPr>
-              <w:spacing w:before="0" w:after="0"/>
+              <w:spacing w:before="80" w:after="80"/>
               <w:jc w:val="center"/>
               <w:shd w:val="clear" w:color="auto" w:fill="1a3a6b"/>
             </w:pPr>
@@ -10459,10 +10488,17 @@
                 <w:b w:val="0"/>
                 <w:i/>
                 <w:color w:val="AACCEE"/>
-                <w:sz w:val="14"/>
+                <w:sz w:val="20"/>
               </w:rPr>
               <w:t>https://github.com/Muhammedcakirgoz/parallel-image-processing</w:t>
             </w:r>
+          </w:p>
+          <w:p>
+            <w:pPr>
+              <w:spacing w:before="0" w:after="160"/>
+              <w:jc w:val="left"/>
+              <w:shd w:val="clear" w:color="auto" w:fill="1a3a6b"/>
+            </w:pPr>
           </w:p>
           <w:p>
             <w:pPr>
@@ -10475,15 +10511,48 @@
                 <w:b w:val="0"/>
                 <w:i/>
                 <w:color w:val="F0C040"/>
-                <w:sz w:val="13"/>
-              </w:rPr>
-              <w:t xml:space="preserve"> Java Threads | ExecutorService | ForkJoinPool | JMH Benchmark </w:t>
+                <w:sz w:val="18"/>
+              </w:rPr>
+              <w:t xml:space="preserve">  Java Threads | ExecutorService | ForkJoinPool | JMH Benchmark  </w:t>
+            </w:r>
+          </w:p>
+          <w:p>
+            <w:pPr>
+              <w:spacing w:before="0" w:after="0"/>
+              <w:shd w:val="clear" w:color="auto" w:fill="F0C040"/>
+            </w:pPr>
+            <w:r>
+              <w:rPr>
+                <w:b/>
+                <w:i w:val="0"/>
+                <w:color w:val="1A3A6B"/>
+                <w:sz w:val="18"/>
+              </w:rPr>
+              <w:t xml:space="preserve">  June 2026  —  Gazi University  |  Computer Engineering  </w:t>
             </w:r>
           </w:p>
         </w:tc>
+      </w:tr>
+    </w:tbl>
+    <w:p>
+      <w:r>
+        <w:br w:type="page"/>
+      </w:r>
+    </w:p>
+    <w:tbl>
+      <w:tblPr>
+        <w:tblStyle w:val="TableGrid"/>
+        <w:tblW w:type="auto" w:w="0"/>
+        <w:jc w:val="center"/>
+        <w:tblLook w:firstColumn="1" w:firstRow="1" w:lastColumn="0" w:lastRow="0" w:noHBand="0" w:noVBand="1" w:val="04A0"/>
+      </w:tblPr>
+      <w:tblGrid>
+        <w:gridCol w:w="9072"/>
+      </w:tblGrid>
+      <w:tr>
         <w:tc>
           <w:tcPr>
-            <w:tcW w:type="dxa" w:w="4422"/>
+            <w:tcW w:type="dxa" w:w="9071"/>
             <w:shd w:val="clear" w:color="auto" w:fill="1a3a6b"/>
             <w:tcBorders>
               <w:top w:val="single" w:sz="4" w:space="0" w:color="2e6db4"/>
@@ -10497,6 +10566,28 @@
           <w:p>
             <w:pPr>
               <w:spacing w:before="0" w:after="0"/>
+              <w:shd w:val="clear" w:color="auto" w:fill="F0C040"/>
+            </w:pPr>
+            <w:r>
+              <w:rPr>
+                <w:b/>
+                <w:i w:val="0"/>
+                <w:color w:val="1A3A6B"/>
+                <w:sz w:val="18"/>
+              </w:rPr>
+              <w:t xml:space="preserve">  CENG 479 — Parallel Computing  |  Slide 2 / 10  </w:t>
+            </w:r>
+          </w:p>
+          <w:p>
+            <w:pPr>
+              <w:spacing w:before="0" w:after="0"/>
+              <w:jc w:val="left"/>
+              <w:shd w:val="clear" w:color="auto" w:fill="1a3a6b"/>
+            </w:pPr>
+          </w:p>
+          <w:p>
+            <w:pPr>
+              <w:spacing w:before="0" w:after="80"/>
               <w:shd w:val="clear" w:color="auto" w:fill="0d2244"/>
             </w:pPr>
             <w:r>
@@ -10504,49 +10595,58 @@
                 <w:b/>
                 <w:i w:val="0"/>
                 <w:color w:val="F0C040"/>
-                <w:sz w:val="14"/>
-              </w:rPr>
-              <w:t xml:space="preserve"> 2 </w:t>
+                <w:sz w:val="28"/>
+              </w:rPr>
+              <w:t xml:space="preserve">  2  </w:t>
             </w:r>
             <w:r>
               <w:rPr>
                 <w:b/>
                 <w:i w:val="0"/>
                 <w:color w:val="FFFFFF"/>
-                <w:sz w:val="16"/>
-              </w:rPr>
-              <w:t xml:space="preserve">  Problem &amp; Motivation</w:t>
-            </w:r>
-          </w:p>
-          <w:p>
-            <w:pPr>
-              <w:spacing w:before="0" w:after="0"/>
-              <w:ind w:left="227"/>
+                <w:sz w:val="32"/>
+              </w:rPr>
+              <w:t xml:space="preserve">   Problem &amp; Motivation</w:t>
+            </w:r>
+          </w:p>
+          <w:p>
+            <w:pPr>
+              <w:spacing w:before="0" w:after="120"/>
               <w:shd w:val="clear" w:color="auto" w:fill="1a3a6b"/>
+              <w:pBdr>
+                <w:bottom w:val="single" w:sz="12" w:space="4" w:color="F0C040"/>
+              </w:pBdr>
+            </w:pPr>
+          </w:p>
+          <w:p>
+            <w:pPr>
+              <w:spacing w:before="0" w:after="80"/>
+              <w:ind w:left="680"/>
+              <w:shd w:val="clear" w:color="auto" w:fill="1a3a6b"/>
             </w:pPr>
             <w:r>
               <w:rPr>
                 <w:b w:val="0"/>
                 <w:i w:val="0"/>
                 <w:color w:val="F0C040"/>
-                <w:sz w:val="15"/>
-              </w:rPr>
-              <w:t xml:space="preserve">• </w:t>
+                <w:sz w:val="22"/>
+              </w:rPr>
+              <w:t xml:space="preserve">●  </w:t>
             </w:r>
             <w:r>
               <w:rPr>
                 <w:b w:val="0"/>
                 <w:i w:val="0"/>
                 <w:color w:val="FFFFFF"/>
-                <w:sz w:val="15"/>
+                <w:sz w:val="22"/>
               </w:rPr>
               <w:t>High-resolution image filtering (4K+) is slow on a single thread</w:t>
             </w:r>
           </w:p>
           <w:p>
             <w:pPr>
-              <w:spacing w:before="0" w:after="0"/>
-              <w:ind w:left="227"/>
+              <w:spacing w:before="0" w:after="80"/>
+              <w:ind w:left="680"/>
               <w:shd w:val="clear" w:color="auto" w:fill="1a3a6b"/>
             </w:pPr>
             <w:r>
@@ -10554,24 +10654,24 @@
                 <w:b w:val="0"/>
                 <w:i w:val="0"/>
                 <w:color w:val="F0C040"/>
-                <w:sz w:val="15"/>
-              </w:rPr>
-              <w:t xml:space="preserve">• </w:t>
+                <w:sz w:val="22"/>
+              </w:rPr>
+              <w:t xml:space="preserve">●  </w:t>
             </w:r>
             <w:r>
               <w:rPr>
                 <w:b w:val="0"/>
                 <w:i w:val="0"/>
                 <w:color w:val="FFFFFF"/>
-                <w:sz w:val="15"/>
+                <w:sz w:val="22"/>
               </w:rPr>
               <w:t>Convolution cost: O(W x H x K^2) per filter — bottleneck at scale</w:t>
             </w:r>
           </w:p>
           <w:p>
             <w:pPr>
-              <w:spacing w:before="0" w:after="0"/>
-              <w:ind w:left="227"/>
+              <w:spacing w:before="0" w:after="80"/>
+              <w:ind w:left="680"/>
               <w:shd w:val="clear" w:color="auto" w:fill="1a3a6b"/>
             </w:pPr>
             <w:r>
@@ -10579,24 +10679,24 @@
                 <w:b w:val="0"/>
                 <w:i w:val="0"/>
                 <w:color w:val="F0C040"/>
-                <w:sz w:val="15"/>
-              </w:rPr>
-              <w:t xml:space="preserve">• </w:t>
+                <w:sz w:val="22"/>
+              </w:rPr>
+              <w:t xml:space="preserve">●  </w:t>
             </w:r>
             <w:r>
               <w:rPr>
                 <w:b w:val="0"/>
                 <w:i w:val="0"/>
                 <w:color w:val="FFFFFF"/>
-                <w:sz w:val="15"/>
+                <w:sz w:val="22"/>
               </w:rPr>
               <w:t>Each output pixel is INDEPENDENT — embarrassingly parallel</w:t>
             </w:r>
           </w:p>
           <w:p>
             <w:pPr>
-              <w:spacing w:before="0" w:after="0"/>
-              <w:ind w:left="227"/>
+              <w:spacing w:before="0" w:after="80"/>
+              <w:ind w:left="680"/>
               <w:shd w:val="clear" w:color="auto" w:fill="1a3a6b"/>
             </w:pPr>
             <w:r>
@@ -10604,29 +10704,30 @@
                 <w:b w:val="0"/>
                 <w:i w:val="0"/>
                 <w:color w:val="F0C040"/>
-                <w:sz w:val="15"/>
-              </w:rPr>
-              <w:t xml:space="preserve">• </w:t>
+                <w:sz w:val="22"/>
+              </w:rPr>
+              <w:t xml:space="preserve">●  </w:t>
             </w:r>
             <w:r>
               <w:rPr>
                 <w:b w:val="0"/>
                 <w:i w:val="0"/>
                 <w:color w:val="FFFFFF"/>
-                <w:sz w:val="15"/>
+                <w:sz w:val="22"/>
               </w:rPr>
               <w:t>Goal: multi-threaded speedup with zero correctness compromise</w:t>
             </w:r>
           </w:p>
           <w:p>
             <w:pPr>
-              <w:spacing w:before="0" w:after="20"/>
+              <w:spacing w:before="0" w:after="80"/>
+              <w:jc w:val="left"/>
               <w:shd w:val="clear" w:color="auto" w:fill="1a3a6b"/>
             </w:pPr>
           </w:p>
           <w:p>
             <w:pPr>
-              <w:spacing w:before="0" w:after="0"/>
+              <w:spacing w:before="80" w:after="80"/>
               <w:jc w:val="center"/>
               <w:shd w:val="clear" w:color="auto" w:fill="1a3a6b"/>
             </w:pPr>
@@ -10635,10 +10736,17 @@
                 <w:b w:val="0"/>
                 <w:i/>
                 <w:color w:val="AACCEE"/>
-                <w:sz w:val="14"/>
+                <w:sz w:val="20"/>
               </w:rPr>
               <w:t>Amdahl's Law: S = 1/(1-p)  —  p ~ 0.95 for Gaussian Blur</w:t>
             </w:r>
+          </w:p>
+          <w:p>
+            <w:pPr>
+              <w:spacing w:before="0" w:after="160"/>
+              <w:jc w:val="left"/>
+              <w:shd w:val="clear" w:color="auto" w:fill="1a3a6b"/>
+            </w:pPr>
           </w:p>
           <w:p>
             <w:pPr>
@@ -10651,20 +10759,48 @@
                 <w:b w:val="0"/>
                 <w:i/>
                 <w:color w:val="F0C040"/>
-                <w:sz w:val="13"/>
-              </w:rPr>
-              <w:t xml:space="preserve"> Theoretical max speedup ~20x at p=0.95 </w:t>
+                <w:sz w:val="18"/>
+              </w:rPr>
+              <w:t xml:space="preserve">  Theoretical max speedup ~20x at p=0.95  </w:t>
+            </w:r>
+          </w:p>
+          <w:p>
+            <w:pPr>
+              <w:spacing w:before="0" w:after="0"/>
+              <w:shd w:val="clear" w:color="auto" w:fill="F0C040"/>
+            </w:pPr>
+            <w:r>
+              <w:rPr>
+                <w:b/>
+                <w:i w:val="0"/>
+                <w:color w:val="1A3A6B"/>
+                <w:sz w:val="18"/>
+              </w:rPr>
+              <w:t xml:space="preserve">  June 2026  —  Gazi University  |  Computer Engineering  </w:t>
             </w:r>
           </w:p>
         </w:tc>
       </w:tr>
+    </w:tbl>
+    <w:p>
+      <w:r>
+        <w:br w:type="page"/>
+      </w:r>
+    </w:p>
+    <w:tbl>
+      <w:tblPr>
+        <w:tblStyle w:val="TableGrid"/>
+        <w:tblW w:type="auto" w:w="0"/>
+        <w:jc w:val="center"/>
+        <w:tblLook w:firstColumn="1" w:firstRow="1" w:lastColumn="0" w:lastRow="0" w:noHBand="0" w:noVBand="1" w:val="04A0"/>
+      </w:tblPr>
+      <w:tblGrid>
+        <w:gridCol w:w="9072"/>
+      </w:tblGrid>
       <w:tr>
-        <w:trPr>
-          <w:trHeight w:val="2551"/>
-        </w:trPr>
         <w:tc>
           <w:tcPr>
-            <w:tcW w:type="dxa" w:w="4422"/>
+            <w:tcW w:type="dxa" w:w="9071"/>
             <w:shd w:val="clear" w:color="auto" w:fill="1a3a6b"/>
             <w:tcBorders>
               <w:top w:val="single" w:sz="4" w:space="0" w:color="2e6db4"/>
@@ -10678,6 +10814,28 @@
           <w:p>
             <w:pPr>
               <w:spacing w:before="0" w:after="0"/>
+              <w:shd w:val="clear" w:color="auto" w:fill="F0C040"/>
+            </w:pPr>
+            <w:r>
+              <w:rPr>
+                <w:b/>
+                <w:i w:val="0"/>
+                <w:color w:val="1A3A6B"/>
+                <w:sz w:val="18"/>
+              </w:rPr>
+              <w:t xml:space="preserve">  CENG 479 — Parallel Computing  |  Slide 3 / 10  </w:t>
+            </w:r>
+          </w:p>
+          <w:p>
+            <w:pPr>
+              <w:spacing w:before="0" w:after="0"/>
+              <w:jc w:val="left"/>
+              <w:shd w:val="clear" w:color="auto" w:fill="1a3a6b"/>
+            </w:pPr>
+          </w:p>
+          <w:p>
+            <w:pPr>
+              <w:spacing w:before="0" w:after="80"/>
               <w:shd w:val="clear" w:color="auto" w:fill="0d2244"/>
             </w:pPr>
             <w:r>
@@ -10685,40 +10843,49 @@
                 <w:b/>
                 <w:i w:val="0"/>
                 <w:color w:val="F0C040"/>
-                <w:sz w:val="14"/>
-              </w:rPr>
-              <w:t xml:space="preserve"> 3 </w:t>
+                <w:sz w:val="28"/>
+              </w:rPr>
+              <w:t xml:space="preserve">  3  </w:t>
             </w:r>
             <w:r>
               <w:rPr>
                 <w:b/>
                 <w:i w:val="0"/>
                 <w:color w:val="FFFFFF"/>
-                <w:sz w:val="16"/>
-              </w:rPr>
-              <w:t xml:space="preserve">  Architecture Overview</w:t>
-            </w:r>
-          </w:p>
-          <w:p>
-            <w:pPr>
-              <w:spacing w:before="0" w:after="0"/>
-              <w:ind w:left="113"/>
+                <w:sz w:val="32"/>
+              </w:rPr>
+              <w:t xml:space="preserve">   Architecture Overview</w:t>
+            </w:r>
+          </w:p>
+          <w:p>
+            <w:pPr>
+              <w:spacing w:before="0" w:after="120"/>
               <w:shd w:val="clear" w:color="auto" w:fill="1a3a6b"/>
+              <w:pBdr>
+                <w:bottom w:val="single" w:sz="12" w:space="4" w:color="F0C040"/>
+              </w:pBdr>
+            </w:pPr>
+          </w:p>
+          <w:p>
+            <w:pPr>
+              <w:spacing w:before="120" w:after="40"/>
+              <w:ind w:left="340"/>
+              <w:shd w:val="clear" w:color="auto" w:fill="1a3a6b"/>
             </w:pPr>
             <w:r>
               <w:rPr>
                 <w:b/>
                 <w:i w:val="0"/>
                 <w:color w:val="F0C040"/>
-                <w:sz w:val="15"/>
+                <w:sz w:val="22"/>
               </w:rPr>
               <w:t>Filters:</w:t>
             </w:r>
           </w:p>
           <w:p>
             <w:pPr>
-              <w:spacing w:before="0" w:after="0"/>
-              <w:ind w:left="227"/>
+              <w:spacing w:before="0" w:after="80"/>
+              <w:ind w:left="680"/>
               <w:shd w:val="clear" w:color="auto" w:fill="1a3a6b"/>
             </w:pPr>
             <w:r>
@@ -10726,24 +10893,24 @@
                 <w:b w:val="0"/>
                 <w:i w:val="0"/>
                 <w:color w:val="F0C040"/>
-                <w:sz w:val="15"/>
-              </w:rPr>
-              <w:t xml:space="preserve">• </w:t>
+                <w:sz w:val="22"/>
+              </w:rPr>
+              <w:t xml:space="preserve">●  </w:t>
             </w:r>
             <w:r>
               <w:rPr>
                 <w:b w:val="0"/>
                 <w:i w:val="0"/>
                 <w:color w:val="FFFFFF"/>
-                <w:sz w:val="15"/>
+                <w:sz w:val="22"/>
               </w:rPr>
               <w:t>Grayscale (point-wise), Gaussian Blur 5x5, Sobel 3x3</w:t>
             </w:r>
           </w:p>
           <w:p>
             <w:pPr>
-              <w:spacing w:before="0" w:after="0"/>
-              <w:ind w:left="113"/>
+              <w:spacing w:before="120" w:after="40"/>
+              <w:ind w:left="340"/>
               <w:shd w:val="clear" w:color="auto" w:fill="1a3a6b"/>
             </w:pPr>
             <w:r>
@@ -10751,15 +10918,15 @@
                 <w:b/>
                 <w:i w:val="0"/>
                 <w:color w:val="F0C040"/>
-                <w:sz w:val="15"/>
+                <w:sz w:val="22"/>
               </w:rPr>
               <w:t>Implementations:</w:t>
             </w:r>
           </w:p>
           <w:p>
             <w:pPr>
-              <w:spacing w:before="0" w:after="0"/>
-              <w:ind w:left="227"/>
+              <w:spacing w:before="0" w:after="80"/>
+              <w:ind w:left="680"/>
               <w:shd w:val="clear" w:color="auto" w:fill="1a3a6b"/>
             </w:pPr>
             <w:r>
@@ -10767,24 +10934,24 @@
                 <w:b w:val="0"/>
                 <w:i w:val="0"/>
                 <w:color w:val="F0C040"/>
-                <w:sz w:val="15"/>
-              </w:rPr>
-              <w:t xml:space="preserve">• </w:t>
+                <w:sz w:val="22"/>
+              </w:rPr>
+              <w:t xml:space="preserve">●  </w:t>
             </w:r>
             <w:r>
               <w:rPr>
                 <w:b w:val="0"/>
                 <w:i w:val="0"/>
                 <w:color w:val="FFFFFF"/>
-                <w:sz w:val="15"/>
+                <w:sz w:val="22"/>
               </w:rPr>
               <w:t>SequentialProcessor — single-thread baseline</w:t>
             </w:r>
           </w:p>
           <w:p>
             <w:pPr>
-              <w:spacing w:before="0" w:after="0"/>
-              <w:ind w:left="227"/>
+              <w:spacing w:before="0" w:after="80"/>
+              <w:ind w:left="680"/>
               <w:shd w:val="clear" w:color="auto" w:fill="1a3a6b"/>
             </w:pPr>
             <w:r>
@@ -10792,24 +10959,24 @@
                 <w:b w:val="0"/>
                 <w:i w:val="0"/>
                 <w:color w:val="F0C040"/>
-                <w:sz w:val="15"/>
-              </w:rPr>
-              <w:t xml:space="preserve">• </w:t>
+                <w:sz w:val="22"/>
+              </w:rPr>
+              <w:t xml:space="preserve">●  </w:t>
             </w:r>
             <w:r>
               <w:rPr>
                 <w:b w:val="0"/>
                 <w:i w:val="0"/>
                 <w:color w:val="FFFFFF"/>
-                <w:sz w:val="15"/>
+                <w:sz w:val="22"/>
               </w:rPr>
               <w:t>ExecutorParallelProcessor — fixed pool + horizontal strips</w:t>
             </w:r>
           </w:p>
           <w:p>
             <w:pPr>
-              <w:spacing w:before="0" w:after="0"/>
-              <w:ind w:left="227"/>
+              <w:spacing w:before="0" w:after="80"/>
+              <w:ind w:left="680"/>
               <w:shd w:val="clear" w:color="auto" w:fill="1a3a6b"/>
             </w:pPr>
             <w:r>
@@ -10817,24 +10984,24 @@
                 <w:b w:val="0"/>
                 <w:i w:val="0"/>
                 <w:color w:val="F0C040"/>
-                <w:sz w:val="15"/>
-              </w:rPr>
-              <w:t xml:space="preserve">• </w:t>
+                <w:sz w:val="22"/>
+              </w:rPr>
+              <w:t xml:space="preserve">●  </w:t>
             </w:r>
             <w:r>
               <w:rPr>
                 <w:b w:val="0"/>
                 <w:i w:val="0"/>
                 <w:color w:val="FFFFFF"/>
-                <w:sz w:val="15"/>
+                <w:sz w:val="22"/>
               </w:rPr>
               <w:t>ForkJoinParallelProcessor — RecursiveAction + work-stealing</w:t>
             </w:r>
           </w:p>
           <w:p>
             <w:pPr>
-              <w:spacing w:before="0" w:after="0"/>
-              <w:ind w:left="113"/>
+              <w:spacing w:before="120" w:after="40"/>
+              <w:ind w:left="340"/>
               <w:shd w:val="clear" w:color="auto" w:fill="1a3a6b"/>
             </w:pPr>
             <w:r>
@@ -10842,15 +11009,15 @@
                 <w:b/>
                 <w:i w:val="0"/>
                 <w:color w:val="F0C040"/>
-                <w:sz w:val="15"/>
+                <w:sz w:val="22"/>
               </w:rPr>
               <w:t>Tools:</w:t>
             </w:r>
           </w:p>
           <w:p>
             <w:pPr>
-              <w:spacing w:before="0" w:after="0"/>
-              <w:ind w:left="227"/>
+              <w:spacing w:before="0" w:after="80"/>
+              <w:ind w:left="680"/>
               <w:shd w:val="clear" w:color="auto" w:fill="1a3a6b"/>
             </w:pPr>
             <w:r>
@@ -10858,19 +11025,26 @@
                 <w:b w:val="0"/>
                 <w:i w:val="0"/>
                 <w:color w:val="F0C040"/>
-                <w:sz w:val="15"/>
-              </w:rPr>
-              <w:t xml:space="preserve">• </w:t>
+                <w:sz w:val="22"/>
+              </w:rPr>
+              <w:t xml:space="preserve">●  </w:t>
             </w:r>
             <w:r>
               <w:rPr>
                 <w:b w:val="0"/>
                 <w:i w:val="0"/>
                 <w:color w:val="FFFFFF"/>
-                <w:sz w:val="15"/>
+                <w:sz w:val="22"/>
               </w:rPr>
               <w:t>CorrectnessVerifier + JMH Benchmark</w:t>
             </w:r>
+          </w:p>
+          <w:p>
+            <w:pPr>
+              <w:spacing w:before="0" w:after="160"/>
+              <w:jc w:val="left"/>
+              <w:shd w:val="clear" w:color="auto" w:fill="1a3a6b"/>
+            </w:pPr>
           </w:p>
           <w:p>
             <w:pPr>
@@ -10883,15 +11057,48 @@
                 <w:b w:val="0"/>
                 <w:i/>
                 <w:color w:val="F0C040"/>
-                <w:sz w:val="13"/>
-              </w:rPr>
-              <w:t xml:space="preserve"> All source code publicly available on GitHub </w:t>
+                <w:sz w:val="18"/>
+              </w:rPr>
+              <w:t xml:space="preserve">  All source code publicly available on GitHub  </w:t>
+            </w:r>
+          </w:p>
+          <w:p>
+            <w:pPr>
+              <w:spacing w:before="0" w:after="0"/>
+              <w:shd w:val="clear" w:color="auto" w:fill="F0C040"/>
+            </w:pPr>
+            <w:r>
+              <w:rPr>
+                <w:b/>
+                <w:i w:val="0"/>
+                <w:color w:val="1A3A6B"/>
+                <w:sz w:val="18"/>
+              </w:rPr>
+              <w:t xml:space="preserve">  June 2026  —  Gazi University  |  Computer Engineering  </w:t>
             </w:r>
           </w:p>
         </w:tc>
+      </w:tr>
+    </w:tbl>
+    <w:p>
+      <w:r>
+        <w:br w:type="page"/>
+      </w:r>
+    </w:p>
+    <w:tbl>
+      <w:tblPr>
+        <w:tblStyle w:val="TableGrid"/>
+        <w:tblW w:type="auto" w:w="0"/>
+        <w:jc w:val="center"/>
+        <w:tblLook w:firstColumn="1" w:firstRow="1" w:lastColumn="0" w:lastRow="0" w:noHBand="0" w:noVBand="1" w:val="04A0"/>
+      </w:tblPr>
+      <w:tblGrid>
+        <w:gridCol w:w="9072"/>
+      </w:tblGrid>
+      <w:tr>
         <w:tc>
           <w:tcPr>
-            <w:tcW w:type="dxa" w:w="4422"/>
+            <w:tcW w:type="dxa" w:w="9071"/>
             <w:shd w:val="clear" w:color="auto" w:fill="1a3a6b"/>
             <w:tcBorders>
               <w:top w:val="single" w:sz="4" w:space="0" w:color="2e6db4"/>
@@ -10905,6 +11112,28 @@
           <w:p>
             <w:pPr>
               <w:spacing w:before="0" w:after="0"/>
+              <w:shd w:val="clear" w:color="auto" w:fill="F0C040"/>
+            </w:pPr>
+            <w:r>
+              <w:rPr>
+                <w:b/>
+                <w:i w:val="0"/>
+                <w:color w:val="1A3A6B"/>
+                <w:sz w:val="18"/>
+              </w:rPr>
+              <w:t xml:space="preserve">  CENG 479 — Parallel Computing  |  Slide 4 / 10  </w:t>
+            </w:r>
+          </w:p>
+          <w:p>
+            <w:pPr>
+              <w:spacing w:before="0" w:after="0"/>
+              <w:jc w:val="left"/>
+              <w:shd w:val="clear" w:color="auto" w:fill="1a3a6b"/>
+            </w:pPr>
+          </w:p>
+          <w:p>
+            <w:pPr>
+              <w:spacing w:before="0" w:after="80"/>
               <w:shd w:val="clear" w:color="auto" w:fill="0d2244"/>
             </w:pPr>
             <w:r>
@@ -10912,49 +11141,58 @@
                 <w:b/>
                 <w:i w:val="0"/>
                 <w:color w:val="F0C040"/>
-                <w:sz w:val="14"/>
-              </w:rPr>
-              <w:t xml:space="preserve"> 4 </w:t>
+                <w:sz w:val="28"/>
+              </w:rPr>
+              <w:t xml:space="preserve">  4  </w:t>
             </w:r>
             <w:r>
               <w:rPr>
                 <w:b/>
                 <w:i w:val="0"/>
                 <w:color w:val="FFFFFF"/>
-                <w:sz w:val="16"/>
-              </w:rPr>
-              <w:t xml:space="preserve">  ExecutorService Design</w:t>
-            </w:r>
-          </w:p>
-          <w:p>
-            <w:pPr>
-              <w:spacing w:before="0" w:after="0"/>
-              <w:ind w:left="227"/>
+                <w:sz w:val="32"/>
+              </w:rPr>
+              <w:t xml:space="preserve">   ExecutorService Design</w:t>
+            </w:r>
+          </w:p>
+          <w:p>
+            <w:pPr>
+              <w:spacing w:before="0" w:after="120"/>
               <w:shd w:val="clear" w:color="auto" w:fill="1a3a6b"/>
+              <w:pBdr>
+                <w:bottom w:val="single" w:sz="12" w:space="4" w:color="F0C040"/>
+              </w:pBdr>
+            </w:pPr>
+          </w:p>
+          <w:p>
+            <w:pPr>
+              <w:spacing w:before="0" w:after="80"/>
+              <w:ind w:left="680"/>
+              <w:shd w:val="clear" w:color="auto" w:fill="1a3a6b"/>
             </w:pPr>
             <w:r>
               <w:rPr>
                 <w:b w:val="0"/>
                 <w:i w:val="0"/>
                 <w:color w:val="F0C040"/>
-                <w:sz w:val="15"/>
-              </w:rPr>
-              <w:t xml:space="preserve">• </w:t>
+                <w:sz w:val="22"/>
+              </w:rPr>
+              <w:t xml:space="preserve">●  </w:t>
             </w:r>
             <w:r>
               <w:rPr>
                 <w:b w:val="0"/>
                 <w:i w:val="0"/>
                 <w:color w:val="FFFFFF"/>
-                <w:sz w:val="15"/>
+                <w:sz w:val="22"/>
               </w:rPr>
               <w:t>Image split into N equal horizontal strips (N = thread count)</w:t>
             </w:r>
           </w:p>
           <w:p>
             <w:pPr>
-              <w:spacing w:before="0" w:after="0"/>
-              <w:ind w:left="227"/>
+              <w:spacing w:before="0" w:after="80"/>
+              <w:ind w:left="680"/>
               <w:shd w:val="clear" w:color="auto" w:fill="1a3a6b"/>
             </w:pPr>
             <w:r>
@@ -10962,24 +11200,24 @@
                 <w:b w:val="0"/>
                 <w:i w:val="0"/>
                 <w:color w:val="F0C040"/>
-                <w:sz w:val="15"/>
-              </w:rPr>
-              <w:t xml:space="preserve">• </w:t>
+                <w:sz w:val="22"/>
+              </w:rPr>
+              <w:t xml:space="preserve">●  </w:t>
             </w:r>
             <w:r>
               <w:rPr>
                 <w:b w:val="0"/>
                 <w:i w:val="0"/>
                 <w:color w:val="FFFFFF"/>
-                <w:sz w:val="15"/>
+                <w:sz w:val="22"/>
               </w:rPr>
               <w:t>Each Callable processes rows [start, end) with no locking</w:t>
             </w:r>
           </w:p>
           <w:p>
             <w:pPr>
-              <w:spacing w:before="0" w:after="0"/>
-              <w:ind w:left="227"/>
+              <w:spacing w:before="0" w:after="80"/>
+              <w:ind w:left="680"/>
               <w:shd w:val="clear" w:color="auto" w:fill="1a3a6b"/>
             </w:pPr>
             <w:r>
@@ -10987,24 +11225,24 @@
                 <w:b w:val="0"/>
                 <w:i w:val="0"/>
                 <w:color w:val="F0C040"/>
-                <w:sz w:val="15"/>
-              </w:rPr>
-              <w:t xml:space="preserve">• </w:t>
+                <w:sz w:val="22"/>
+              </w:rPr>
+              <w:t xml:space="preserve">●  </w:t>
             </w:r>
             <w:r>
               <w:rPr>
                 <w:b w:val="0"/>
                 <w:i w:val="0"/>
                 <w:color w:val="FFFFFF"/>
-                <w:sz w:val="15"/>
+                <w:sz w:val="22"/>
               </w:rPr>
               <w:t>Source array is READ-ONLY — zero synchronisation overhead</w:t>
             </w:r>
           </w:p>
           <w:p>
             <w:pPr>
-              <w:spacing w:before="0" w:after="0"/>
-              <w:ind w:left="227"/>
+              <w:spacing w:before="0" w:after="80"/>
+              <w:ind w:left="680"/>
               <w:shd w:val="clear" w:color="auto" w:fill="1a3a6b"/>
             </w:pPr>
             <w:r>
@@ -11012,29 +11250,30 @@
                 <w:b w:val="0"/>
                 <w:i w:val="0"/>
                 <w:color w:val="F0C040"/>
-                <w:sz w:val="15"/>
-              </w:rPr>
-              <w:t xml:space="preserve">• </w:t>
+                <w:sz w:val="22"/>
+              </w:rPr>
+              <w:t xml:space="preserve">●  </w:t>
             </w:r>
             <w:r>
               <w:rPr>
                 <w:b w:val="0"/>
                 <w:i w:val="0"/>
                 <w:color w:val="FFFFFF"/>
-                <w:sz w:val="15"/>
+                <w:sz w:val="22"/>
               </w:rPr>
               <w:t>Thread pool created once, reused via try-with-resources</w:t>
             </w:r>
           </w:p>
           <w:p>
             <w:pPr>
-              <w:spacing w:before="0" w:after="20"/>
+              <w:spacing w:before="0" w:after="80"/>
+              <w:jc w:val="left"/>
               <w:shd w:val="clear" w:color="auto" w:fill="1a3a6b"/>
             </w:pPr>
           </w:p>
           <w:p>
             <w:pPr>
-              <w:spacing w:before="0" w:after="0"/>
+              <w:spacing w:before="80" w:after="80"/>
               <w:jc w:val="center"/>
               <w:shd w:val="clear" w:color="auto" w:fill="1a3a6b"/>
             </w:pPr>
@@ -11043,10 +11282,17 @@
                 <w:b w:val="0"/>
                 <w:i/>
                 <w:color w:val="AACCEE"/>
-                <w:sz w:val="14"/>
+                <w:sz w:val="20"/>
               </w:rPr>
               <w:t>Strip[i] covers rows:  i*(H/N)  to  (i+1)*(H/N)</w:t>
             </w:r>
+          </w:p>
+          <w:p>
+            <w:pPr>
+              <w:spacing w:before="0" w:after="160"/>
+              <w:jc w:val="left"/>
+              <w:shd w:val="clear" w:color="auto" w:fill="1a3a6b"/>
+            </w:pPr>
           </w:p>
           <w:p>
             <w:pPr>
@@ -11059,20 +11305,48 @@
                 <w:b w:val="0"/>
                 <w:i/>
                 <w:color w:val="F0C040"/>
-                <w:sz w:val="13"/>
-              </w:rPr>
-              <w:t xml:space="preserve"> Static decomposition — optimal for uniform workloads </w:t>
+                <w:sz w:val="18"/>
+              </w:rPr>
+              <w:t xml:space="preserve">  Static decomposition — optimal for uniform workloads  </w:t>
+            </w:r>
+          </w:p>
+          <w:p>
+            <w:pPr>
+              <w:spacing w:before="0" w:after="0"/>
+              <w:shd w:val="clear" w:color="auto" w:fill="F0C040"/>
+            </w:pPr>
+            <w:r>
+              <w:rPr>
+                <w:b/>
+                <w:i w:val="0"/>
+                <w:color w:val="1A3A6B"/>
+                <w:sz w:val="18"/>
+              </w:rPr>
+              <w:t xml:space="preserve">  June 2026  —  Gazi University  |  Computer Engineering  </w:t>
             </w:r>
           </w:p>
         </w:tc>
       </w:tr>
+    </w:tbl>
+    <w:p>
+      <w:r>
+        <w:br w:type="page"/>
+      </w:r>
+    </w:p>
+    <w:tbl>
+      <w:tblPr>
+        <w:tblStyle w:val="TableGrid"/>
+        <w:tblW w:type="auto" w:w="0"/>
+        <w:jc w:val="center"/>
+        <w:tblLook w:firstColumn="1" w:firstRow="1" w:lastColumn="0" w:lastRow="0" w:noHBand="0" w:noVBand="1" w:val="04A0"/>
+      </w:tblPr>
+      <w:tblGrid>
+        <w:gridCol w:w="9072"/>
+      </w:tblGrid>
       <w:tr>
-        <w:trPr>
-          <w:trHeight w:val="2551"/>
-        </w:trPr>
         <w:tc>
           <w:tcPr>
-            <w:tcW w:type="dxa" w:w="4422"/>
+            <w:tcW w:type="dxa" w:w="9071"/>
             <w:shd w:val="clear" w:color="auto" w:fill="1a3a6b"/>
             <w:tcBorders>
               <w:top w:val="single" w:sz="4" w:space="0" w:color="2e6db4"/>
@@ -11086,6 +11360,28 @@
           <w:p>
             <w:pPr>
               <w:spacing w:before="0" w:after="0"/>
+              <w:shd w:val="clear" w:color="auto" w:fill="F0C040"/>
+            </w:pPr>
+            <w:r>
+              <w:rPr>
+                <w:b/>
+                <w:i w:val="0"/>
+                <w:color w:val="1A3A6B"/>
+                <w:sz w:val="18"/>
+              </w:rPr>
+              <w:t xml:space="preserve">  CENG 479 — Parallel Computing  |  Slide 5 / 10  </w:t>
+            </w:r>
+          </w:p>
+          <w:p>
+            <w:pPr>
+              <w:spacing w:before="0" w:after="0"/>
+              <w:jc w:val="left"/>
+              <w:shd w:val="clear" w:color="auto" w:fill="1a3a6b"/>
+            </w:pPr>
+          </w:p>
+          <w:p>
+            <w:pPr>
+              <w:spacing w:before="0" w:after="80"/>
               <w:shd w:val="clear" w:color="auto" w:fill="0d2244"/>
             </w:pPr>
             <w:r>
@@ -11093,49 +11389,58 @@
                 <w:b/>
                 <w:i w:val="0"/>
                 <w:color w:val="F0C040"/>
-                <w:sz w:val="14"/>
-              </w:rPr>
-              <w:t xml:space="preserve"> 5 </w:t>
+                <w:sz w:val="28"/>
+              </w:rPr>
+              <w:t xml:space="preserve">  5  </w:t>
             </w:r>
             <w:r>
               <w:rPr>
                 <w:b/>
                 <w:i w:val="0"/>
                 <w:color w:val="FFFFFF"/>
-                <w:sz w:val="16"/>
-              </w:rPr>
-              <w:t xml:space="preserve">  ForkJoinPool Design</w:t>
-            </w:r>
-          </w:p>
-          <w:p>
-            <w:pPr>
-              <w:spacing w:before="0" w:after="0"/>
-              <w:ind w:left="227"/>
+                <w:sz w:val="32"/>
+              </w:rPr>
+              <w:t xml:space="preserve">   ForkJoinPool Design</w:t>
+            </w:r>
+          </w:p>
+          <w:p>
+            <w:pPr>
+              <w:spacing w:before="0" w:after="120"/>
               <w:shd w:val="clear" w:color="auto" w:fill="1a3a6b"/>
+              <w:pBdr>
+                <w:bottom w:val="single" w:sz="12" w:space="4" w:color="F0C040"/>
+              </w:pBdr>
+            </w:pPr>
+          </w:p>
+          <w:p>
+            <w:pPr>
+              <w:spacing w:before="0" w:after="80"/>
+              <w:ind w:left="680"/>
+              <w:shd w:val="clear" w:color="auto" w:fill="1a3a6b"/>
             </w:pPr>
             <w:r>
               <w:rPr>
                 <w:b w:val="0"/>
                 <w:i w:val="0"/>
                 <w:color w:val="F0C040"/>
-                <w:sz w:val="15"/>
-              </w:rPr>
-              <w:t xml:space="preserve">• </w:t>
+                <w:sz w:val="22"/>
+              </w:rPr>
+              <w:t xml:space="preserve">●  </w:t>
             </w:r>
             <w:r>
               <w:rPr>
                 <w:b w:val="0"/>
                 <w:i w:val="0"/>
                 <w:color w:val="FFFFFF"/>
-                <w:sz w:val="15"/>
+                <w:sz w:val="22"/>
               </w:rPr>
               <w:t>RecursiveAction splits row range in half recursively</w:t>
             </w:r>
           </w:p>
           <w:p>
             <w:pPr>
-              <w:spacing w:before="0" w:after="0"/>
-              <w:ind w:left="227"/>
+              <w:spacing w:before="0" w:after="80"/>
+              <w:ind w:left="680"/>
               <w:shd w:val="clear" w:color="auto" w:fill="1a3a6b"/>
             </w:pPr>
             <w:r>
@@ -11143,24 +11448,24 @@
                 <w:b w:val="0"/>
                 <w:i w:val="0"/>
                 <w:color w:val="F0C040"/>
-                <w:sz w:val="15"/>
-              </w:rPr>
-              <w:t xml:space="preserve">• </w:t>
+                <w:sz w:val="22"/>
+              </w:rPr>
+              <w:t xml:space="preserve">●  </w:t>
             </w:r>
             <w:r>
               <w:rPr>
                 <w:b w:val="0"/>
                 <w:i w:val="0"/>
                 <w:color w:val="FFFFFF"/>
-                <w:sz w:val="15"/>
+                <w:sz w:val="22"/>
               </w:rPr>
               <w:t>Base case: range &lt;= 64 rows — process sequentially</w:t>
             </w:r>
           </w:p>
           <w:p>
             <w:pPr>
-              <w:spacing w:before="0" w:after="0"/>
-              <w:ind w:left="227"/>
+              <w:spacing w:before="0" w:after="80"/>
+              <w:ind w:left="680"/>
               <w:shd w:val="clear" w:color="auto" w:fill="1a3a6b"/>
             </w:pPr>
             <w:r>
@@ -11168,24 +11473,24 @@
                 <w:b w:val="0"/>
                 <w:i w:val="0"/>
                 <w:color w:val="F0C040"/>
-                <w:sz w:val="15"/>
-              </w:rPr>
-              <w:t xml:space="preserve">• </w:t>
+                <w:sz w:val="22"/>
+              </w:rPr>
+              <w:t xml:space="preserve">●  </w:t>
             </w:r>
             <w:r>
               <w:rPr>
                 <w:b w:val="0"/>
                 <w:i w:val="0"/>
                 <w:color w:val="FFFFFF"/>
-                <w:sz w:val="15"/>
+                <w:sz w:val="22"/>
               </w:rPr>
               <w:t>Work-stealing: idle threads steal tasks from busy queues</w:t>
             </w:r>
           </w:p>
           <w:p>
             <w:pPr>
-              <w:spacing w:before="0" w:after="0"/>
-              <w:ind w:left="227"/>
+              <w:spacing w:before="0" w:after="80"/>
+              <w:ind w:left="680"/>
               <w:shd w:val="clear" w:color="auto" w:fill="1a3a6b"/>
             </w:pPr>
             <w:r>
@@ -11193,30 +11498,31 @@
                 <w:b w:val="0"/>
                 <w:i w:val="0"/>
                 <w:color w:val="F0C040"/>
-                <w:sz w:val="15"/>
-              </w:rPr>
-              <w:t xml:space="preserve">• </w:t>
+                <w:sz w:val="22"/>
+              </w:rPr>
+              <w:t xml:space="preserve">●  </w:t>
             </w:r>
             <w:r>
               <w:rPr>
                 <w:b w:val="0"/>
                 <w:i w:val="0"/>
                 <w:color w:val="FFFFFF"/>
-                <w:sz w:val="15"/>
+                <w:sz w:val="22"/>
               </w:rPr>
               <w:t>Better dynamic load balance than static strips for large images</w:t>
             </w:r>
           </w:p>
           <w:p>
             <w:pPr>
-              <w:spacing w:before="0" w:after="20"/>
+              <w:spacing w:before="0" w:after="80"/>
+              <w:jc w:val="left"/>
               <w:shd w:val="clear" w:color="auto" w:fill="1a3a6b"/>
             </w:pPr>
           </w:p>
           <w:p>
             <w:pPr>
-              <w:spacing w:before="0" w:after="0"/>
-              <w:ind w:left="227"/>
+              <w:spacing w:before="0" w:after="80"/>
+              <w:ind w:left="680"/>
               <w:shd w:val="clear" w:color="auto" w:fill="1a3a6b"/>
             </w:pPr>
             <w:r>
@@ -11224,19 +11530,26 @@
                 <w:b w:val="0"/>
                 <w:i w:val="0"/>
                 <w:color w:val="F0C040"/>
-                <w:sz w:val="15"/>
-              </w:rPr>
-              <w:t xml:space="preserve">• </w:t>
+                <w:sz w:val="22"/>
+              </w:rPr>
+              <w:t xml:space="preserve">●  </w:t>
             </w:r>
             <w:r>
               <w:rPr>
                 <w:b w:val="0"/>
                 <w:i w:val="0"/>
                 <w:color w:val="FFFFFF"/>
-                <w:sz w:val="15"/>
+                <w:sz w:val="22"/>
               </w:rPr>
               <w:t>ForkJoin outperforms Executor on 2048x2048 (Gaussian: 4.81x vs 4.30x)</w:t>
             </w:r>
+          </w:p>
+          <w:p>
+            <w:pPr>
+              <w:spacing w:before="0" w:after="160"/>
+              <w:jc w:val="left"/>
+              <w:shd w:val="clear" w:color="auto" w:fill="1a3a6b"/>
+            </w:pPr>
           </w:p>
           <w:p>
             <w:pPr>
@@ -11249,15 +11562,48 @@
                 <w:b w:val="0"/>
                 <w:i/>
                 <w:color w:val="F0C040"/>
-                <w:sz w:val="13"/>
-              </w:rPr>
-              <w:t xml:space="preserve"> Dynamic decomposition — adapts to runtime load imbalance </w:t>
+                <w:sz w:val="18"/>
+              </w:rPr>
+              <w:t xml:space="preserve">  Dynamic decomposition — adapts to runtime load imbalance  </w:t>
+            </w:r>
+          </w:p>
+          <w:p>
+            <w:pPr>
+              <w:spacing w:before="0" w:after="0"/>
+              <w:shd w:val="clear" w:color="auto" w:fill="F0C040"/>
+            </w:pPr>
+            <w:r>
+              <w:rPr>
+                <w:b/>
+                <w:i w:val="0"/>
+                <w:color w:val="1A3A6B"/>
+                <w:sz w:val="18"/>
+              </w:rPr>
+              <w:t xml:space="preserve">  June 2026  —  Gazi University  |  Computer Engineering  </w:t>
             </w:r>
           </w:p>
         </w:tc>
+      </w:tr>
+    </w:tbl>
+    <w:p>
+      <w:r>
+        <w:br w:type="page"/>
+      </w:r>
+    </w:p>
+    <w:tbl>
+      <w:tblPr>
+        <w:tblStyle w:val="TableGrid"/>
+        <w:tblW w:type="auto" w:w="0"/>
+        <w:jc w:val="center"/>
+        <w:tblLook w:firstColumn="1" w:firstRow="1" w:lastColumn="0" w:lastRow="0" w:noHBand="0" w:noVBand="1" w:val="04A0"/>
+      </w:tblPr>
+      <w:tblGrid>
+        <w:gridCol w:w="9072"/>
+      </w:tblGrid>
+      <w:tr>
         <w:tc>
           <w:tcPr>
-            <w:tcW w:type="dxa" w:w="4422"/>
+            <w:tcW w:type="dxa" w:w="9071"/>
             <w:shd w:val="clear" w:color="auto" w:fill="1a3a6b"/>
             <w:tcBorders>
               <w:top w:val="single" w:sz="4" w:space="0" w:color="2e6db4"/>
@@ -11271,6 +11617,28 @@
           <w:p>
             <w:pPr>
               <w:spacing w:before="0" w:after="0"/>
+              <w:shd w:val="clear" w:color="auto" w:fill="F0C040"/>
+            </w:pPr>
+            <w:r>
+              <w:rPr>
+                <w:b/>
+                <w:i w:val="0"/>
+                <w:color w:val="1A3A6B"/>
+                <w:sz w:val="18"/>
+              </w:rPr>
+              <w:t xml:space="preserve">  CENG 479 — Parallel Computing  |  Slide 6 / 10  </w:t>
+            </w:r>
+          </w:p>
+          <w:p>
+            <w:pPr>
+              <w:spacing w:before="0" w:after="0"/>
+              <w:jc w:val="left"/>
+              <w:shd w:val="clear" w:color="auto" w:fill="1a3a6b"/>
+            </w:pPr>
+          </w:p>
+          <w:p>
+            <w:pPr>
+              <w:spacing w:before="0" w:after="80"/>
               <w:shd w:val="clear" w:color="auto" w:fill="0d2244"/>
             </w:pPr>
             <w:r>
@@ -11278,23 +11646,32 @@
                 <w:b/>
                 <w:i w:val="0"/>
                 <w:color w:val="F0C040"/>
-                <w:sz w:val="14"/>
-              </w:rPr>
-              <w:t xml:space="preserve"> 6 </w:t>
+                <w:sz w:val="28"/>
+              </w:rPr>
+              <w:t xml:space="preserve">  6  </w:t>
             </w:r>
             <w:r>
               <w:rPr>
                 <w:b/>
                 <w:i w:val="0"/>
                 <w:color w:val="FFFFFF"/>
-                <w:sz w:val="16"/>
-              </w:rPr>
-              <w:t xml:space="preserve">  Correctness Verification</w:t>
-            </w:r>
-          </w:p>
-          <w:p>
-            <w:pPr>
-              <w:spacing w:before="0" w:after="0"/>
+                <w:sz w:val="32"/>
+              </w:rPr>
+              <w:t xml:space="preserve">   Correctness Verification</w:t>
+            </w:r>
+          </w:p>
+          <w:p>
+            <w:pPr>
+              <w:spacing w:before="0" w:after="120"/>
+              <w:shd w:val="clear" w:color="auto" w:fill="1a3a6b"/>
+              <w:pBdr>
+                <w:bottom w:val="single" w:sz="12" w:space="4" w:color="F0C040"/>
+              </w:pBdr>
+            </w:pPr>
+          </w:p>
+          <w:p>
+            <w:pPr>
+              <w:spacing w:before="80" w:after="80"/>
               <w:jc w:val="center"/>
               <w:shd w:val="clear" w:color="auto" w:fill="1a3a6b"/>
             </w:pPr>
@@ -11303,20 +11680,21 @@
                 <w:b w:val="0"/>
                 <w:i/>
                 <w:color w:val="AACCEE"/>
-                <w:sz w:val="14"/>
+                <w:sz w:val="20"/>
               </w:rPr>
               <w:t>CorrectnessVerifier.firstDifference() — pixel-by-pixel scan</w:t>
             </w:r>
           </w:p>
           <w:p>
             <w:pPr>
-              <w:spacing w:before="0" w:after="20"/>
+              <w:spacing w:before="0" w:after="80"/>
+              <w:jc w:val="left"/>
               <w:shd w:val="clear" w:color="auto" w:fill="1a3a6b"/>
             </w:pPr>
           </w:p>
           <w:p>
             <w:pPr>
-              <w:spacing w:before="0" w:after="0"/>
+              <w:spacing w:before="80" w:after="80"/>
               <w:jc w:val="center"/>
               <w:shd w:val="clear" w:color="auto" w:fill="1a3a6b"/>
             </w:pPr>
@@ -11325,21 +11703,22 @@
                 <w:b w:val="0"/>
                 <w:i/>
                 <w:color w:val="AACCEE"/>
-                <w:sz w:val="14"/>
+                <w:sz w:val="20"/>
               </w:rPr>
               <w:t>Tested on 2048x2048 synthetic image — ALL 6 combinations PASS</w:t>
             </w:r>
           </w:p>
           <w:p>
             <w:pPr>
-              <w:spacing w:before="0" w:after="20"/>
+              <w:spacing w:before="0" w:after="80"/>
+              <w:jc w:val="left"/>
               <w:shd w:val="clear" w:color="auto" w:fill="1a3a6b"/>
             </w:pPr>
           </w:p>
           <w:p>
             <w:pPr>
-              <w:spacing w:before="0" w:after="0"/>
-              <w:ind w:left="227"/>
+              <w:spacing w:before="0" w:after="80"/>
+              <w:ind w:left="680"/>
               <w:shd w:val="clear" w:color="auto" w:fill="1a3a6b"/>
             </w:pPr>
             <w:r>
@@ -11347,24 +11726,24 @@
                 <w:b w:val="0"/>
                 <w:i w:val="0"/>
                 <w:color w:val="F0C040"/>
-                <w:sz w:val="15"/>
-              </w:rPr>
-              <w:t xml:space="preserve">• </w:t>
+                <w:sz w:val="22"/>
+              </w:rPr>
+              <w:t xml:space="preserve">●  </w:t>
             </w:r>
             <w:r>
               <w:rPr>
                 <w:b w:val="0"/>
                 <w:i w:val="0"/>
                 <w:color w:val="FFFFFF"/>
-                <w:sz w:val="15"/>
+                <w:sz w:val="22"/>
               </w:rPr>
               <w:t>Grayscale:       Executor PASS  |  ForkJoin PASS</w:t>
             </w:r>
           </w:p>
           <w:p>
             <w:pPr>
-              <w:spacing w:before="0" w:after="0"/>
-              <w:ind w:left="227"/>
+              <w:spacing w:before="0" w:after="80"/>
+              <w:ind w:left="680"/>
               <w:shd w:val="clear" w:color="auto" w:fill="1a3a6b"/>
             </w:pPr>
             <w:r>
@@ -11372,24 +11751,24 @@
                 <w:b w:val="0"/>
                 <w:i w:val="0"/>
                 <w:color w:val="F0C040"/>
-                <w:sz w:val="15"/>
-              </w:rPr>
-              <w:t xml:space="preserve">• </w:t>
+                <w:sz w:val="22"/>
+              </w:rPr>
+              <w:t xml:space="preserve">●  </w:t>
             </w:r>
             <w:r>
               <w:rPr>
                 <w:b w:val="0"/>
                 <w:i w:val="0"/>
                 <w:color w:val="FFFFFF"/>
-                <w:sz w:val="15"/>
+                <w:sz w:val="22"/>
               </w:rPr>
               <w:t>GaussianBlur5x5: Executor PASS  |  ForkJoin PASS</w:t>
             </w:r>
           </w:p>
           <w:p>
             <w:pPr>
-              <w:spacing w:before="0" w:after="0"/>
-              <w:ind w:left="227"/>
+              <w:spacing w:before="0" w:after="80"/>
+              <w:ind w:left="680"/>
               <w:shd w:val="clear" w:color="auto" w:fill="1a3a6b"/>
             </w:pPr>
             <w:r>
@@ -11397,19 +11776,26 @@
                 <w:b w:val="0"/>
                 <w:i w:val="0"/>
                 <w:color w:val="F0C040"/>
-                <w:sz w:val="15"/>
-              </w:rPr>
-              <w:t xml:space="preserve">• </w:t>
+                <w:sz w:val="22"/>
+              </w:rPr>
+              <w:t xml:space="preserve">●  </w:t>
             </w:r>
             <w:r>
               <w:rPr>
                 <w:b w:val="0"/>
                 <w:i w:val="0"/>
                 <w:color w:val="FFFFFF"/>
-                <w:sz w:val="15"/>
+                <w:sz w:val="22"/>
               </w:rPr>
               <w:t>Sobel3x3:        Executor PASS  |  ForkJoin PASS</w:t>
             </w:r>
+          </w:p>
+          <w:p>
+            <w:pPr>
+              <w:spacing w:before="0" w:after="160"/>
+              <w:jc w:val="left"/>
+              <w:shd w:val="clear" w:color="auto" w:fill="1a3a6b"/>
+            </w:pPr>
           </w:p>
           <w:p>
             <w:pPr>
@@ -11422,20 +11808,48 @@
                 <w:b w:val="0"/>
                 <w:i/>
                 <w:color w:val="F0C040"/>
-                <w:sz w:val="13"/>
-              </w:rPr>
-              <w:t xml:space="preserve"> Bit-identical output to sequential baseline in all cases </w:t>
+                <w:sz w:val="18"/>
+              </w:rPr>
+              <w:t xml:space="preserve">  Bit-identical output to sequential baseline in all cases  </w:t>
+            </w:r>
+          </w:p>
+          <w:p>
+            <w:pPr>
+              <w:spacing w:before="0" w:after="0"/>
+              <w:shd w:val="clear" w:color="auto" w:fill="F0C040"/>
+            </w:pPr>
+            <w:r>
+              <w:rPr>
+                <w:b/>
+                <w:i w:val="0"/>
+                <w:color w:val="1A3A6B"/>
+                <w:sz w:val="18"/>
+              </w:rPr>
+              <w:t xml:space="preserve">  June 2026  —  Gazi University  |  Computer Engineering  </w:t>
             </w:r>
           </w:p>
         </w:tc>
       </w:tr>
+    </w:tbl>
+    <w:p>
+      <w:r>
+        <w:br w:type="page"/>
+      </w:r>
+    </w:p>
+    <w:tbl>
+      <w:tblPr>
+        <w:tblStyle w:val="TableGrid"/>
+        <w:tblW w:type="auto" w:w="0"/>
+        <w:jc w:val="center"/>
+        <w:tblLook w:firstColumn="1" w:firstRow="1" w:lastColumn="0" w:lastRow="0" w:noHBand="0" w:noVBand="1" w:val="04A0"/>
+      </w:tblPr>
+      <w:tblGrid>
+        <w:gridCol w:w="9072"/>
+      </w:tblGrid>
       <w:tr>
-        <w:trPr>
-          <w:trHeight w:val="2551"/>
-        </w:trPr>
         <w:tc>
           <w:tcPr>
-            <w:tcW w:type="dxa" w:w="4422"/>
+            <w:tcW w:type="dxa" w:w="9071"/>
             <w:shd w:val="clear" w:color="auto" w:fill="1a3a6b"/>
             <w:tcBorders>
               <w:top w:val="single" w:sz="4" w:space="0" w:color="2e6db4"/>
@@ -11449,6 +11863,28 @@
           <w:p>
             <w:pPr>
               <w:spacing w:before="0" w:after="0"/>
+              <w:shd w:val="clear" w:color="auto" w:fill="F0C040"/>
+            </w:pPr>
+            <w:r>
+              <w:rPr>
+                <w:b/>
+                <w:i w:val="0"/>
+                <w:color w:val="1A3A6B"/>
+                <w:sz w:val="18"/>
+              </w:rPr>
+              <w:t xml:space="preserve">  CENG 479 — Parallel Computing  |  Slide 7 / 10  </w:t>
+            </w:r>
+          </w:p>
+          <w:p>
+            <w:pPr>
+              <w:spacing w:before="0" w:after="0"/>
+              <w:jc w:val="left"/>
+              <w:shd w:val="clear" w:color="auto" w:fill="1a3a6b"/>
+            </w:pPr>
+          </w:p>
+          <w:p>
+            <w:pPr>
+              <w:spacing w:before="0" w:after="80"/>
               <w:shd w:val="clear" w:color="auto" w:fill="0d2244"/>
             </w:pPr>
             <w:r>
@@ -11456,40 +11892,49 @@
                 <w:b/>
                 <w:i w:val="0"/>
                 <w:color w:val="F0C040"/>
-                <w:sz w:val="14"/>
-              </w:rPr>
-              <w:t xml:space="preserve"> 7 </w:t>
+                <w:sz w:val="28"/>
+              </w:rPr>
+              <w:t xml:space="preserve">  7  </w:t>
             </w:r>
             <w:r>
               <w:rPr>
                 <w:b/>
                 <w:i w:val="0"/>
                 <w:color w:val="FFFFFF"/>
-                <w:sz w:val="16"/>
-              </w:rPr>
-              <w:t xml:space="preserve">  Performance Results (8 threads, 2048x2048)</w:t>
-            </w:r>
-          </w:p>
-          <w:p>
-            <w:pPr>
-              <w:spacing w:before="0" w:after="0"/>
-              <w:ind w:left="113"/>
+                <w:sz w:val="32"/>
+              </w:rPr>
+              <w:t xml:space="preserve">   Performance Results (8 threads, 2048x2048)</w:t>
+            </w:r>
+          </w:p>
+          <w:p>
+            <w:pPr>
+              <w:spacing w:before="0" w:after="120"/>
               <w:shd w:val="clear" w:color="auto" w:fill="1a3a6b"/>
+              <w:pBdr>
+                <w:bottom w:val="single" w:sz="12" w:space="4" w:color="F0C040"/>
+              </w:pBdr>
+            </w:pPr>
+          </w:p>
+          <w:p>
+            <w:pPr>
+              <w:spacing w:before="120" w:after="40"/>
+              <w:ind w:left="340"/>
+              <w:shd w:val="clear" w:color="auto" w:fill="1a3a6b"/>
             </w:pPr>
             <w:r>
               <w:rPr>
                 <w:b/>
                 <w:i w:val="0"/>
                 <w:color w:val="F0C040"/>
-                <w:sz w:val="15"/>
+                <w:sz w:val="22"/>
               </w:rPr>
               <w:t>Compute-bound (scales well):</w:t>
             </w:r>
           </w:p>
           <w:p>
             <w:pPr>
-              <w:spacing w:before="0" w:after="0"/>
-              <w:ind w:left="227"/>
+              <w:spacing w:before="0" w:after="80"/>
+              <w:ind w:left="680"/>
               <w:shd w:val="clear" w:color="auto" w:fill="1a3a6b"/>
             </w:pPr>
             <w:r>
@@ -11497,24 +11942,24 @@
                 <w:b w:val="0"/>
                 <w:i w:val="0"/>
                 <w:color w:val="F0C040"/>
-                <w:sz w:val="15"/>
-              </w:rPr>
-              <w:t xml:space="preserve">• </w:t>
+                <w:sz w:val="22"/>
+              </w:rPr>
+              <w:t xml:space="preserve">●  </w:t>
             </w:r>
             <w:r>
               <w:rPr>
                 <w:b w:val="0"/>
                 <w:i w:val="0"/>
                 <w:color w:val="FFFFFF"/>
-                <w:sz w:val="15"/>
+                <w:sz w:val="22"/>
               </w:rPr>
               <w:t>Gaussian Blur:  Executor 4.30x  |  ForkJoin 4.81x</w:t>
             </w:r>
           </w:p>
           <w:p>
             <w:pPr>
-              <w:spacing w:before="0" w:after="0"/>
-              <w:ind w:left="227"/>
+              <w:spacing w:before="0" w:after="80"/>
+              <w:ind w:left="680"/>
               <w:shd w:val="clear" w:color="auto" w:fill="1a3a6b"/>
             </w:pPr>
             <w:r>
@@ -11522,30 +11967,31 @@
                 <w:b w:val="0"/>
                 <w:i w:val="0"/>
                 <w:color w:val="F0C040"/>
-                <w:sz w:val="15"/>
-              </w:rPr>
-              <w:t xml:space="preserve">• </w:t>
+                <w:sz w:val="22"/>
+              </w:rPr>
+              <w:t xml:space="preserve">●  </w:t>
             </w:r>
             <w:r>
               <w:rPr>
                 <w:b w:val="0"/>
                 <w:i w:val="0"/>
                 <w:color w:val="FFFFFF"/>
-                <w:sz w:val="15"/>
+                <w:sz w:val="22"/>
               </w:rPr>
               <w:t>Sobel 3x3:      Executor 4.49x  |  ForkJoin 5.10x</w:t>
             </w:r>
           </w:p>
           <w:p>
             <w:pPr>
-              <w:spacing w:before="0" w:after="20"/>
+              <w:spacing w:before="0" w:after="80"/>
+              <w:jc w:val="left"/>
               <w:shd w:val="clear" w:color="auto" w:fill="1a3a6b"/>
             </w:pPr>
           </w:p>
           <w:p>
             <w:pPr>
-              <w:spacing w:before="0" w:after="0"/>
-              <w:ind w:left="113"/>
+              <w:spacing w:before="120" w:after="40"/>
+              <w:ind w:left="340"/>
               <w:shd w:val="clear" w:color="auto" w:fill="1a3a6b"/>
             </w:pPr>
             <w:r>
@@ -11553,15 +11999,15 @@
                 <w:b/>
                 <w:i w:val="0"/>
                 <w:color w:val="F0C040"/>
-                <w:sz w:val="15"/>
+                <w:sz w:val="22"/>
               </w:rPr>
               <w:t>Memory-bound (bandwidth limited):</w:t>
             </w:r>
           </w:p>
           <w:p>
             <w:pPr>
-              <w:spacing w:before="0" w:after="0"/>
-              <w:ind w:left="227"/>
+              <w:spacing w:before="0" w:after="80"/>
+              <w:ind w:left="680"/>
               <w:shd w:val="clear" w:color="auto" w:fill="1a3a6b"/>
             </w:pPr>
             <w:r>
@@ -11569,19 +12015,26 @@
                 <w:b w:val="0"/>
                 <w:i w:val="0"/>
                 <w:color w:val="F0C040"/>
-                <w:sz w:val="15"/>
-              </w:rPr>
-              <w:t xml:space="preserve">• </w:t>
+                <w:sz w:val="22"/>
+              </w:rPr>
+              <w:t xml:space="preserve">●  </w:t>
             </w:r>
             <w:r>
               <w:rPr>
                 <w:b w:val="0"/>
                 <w:i w:val="0"/>
                 <w:color w:val="FFFFFF"/>
-                <w:sz w:val="15"/>
+                <w:sz w:val="22"/>
               </w:rPr>
               <w:t>Grayscale:      Executor 1.55x  |  ForkJoin 1.54x</w:t>
             </w:r>
+          </w:p>
+          <w:p>
+            <w:pPr>
+              <w:spacing w:before="0" w:after="160"/>
+              <w:jc w:val="left"/>
+              <w:shd w:val="clear" w:color="auto" w:fill="1a3a6b"/>
+            </w:pPr>
           </w:p>
           <w:p>
             <w:pPr>
@@ -11594,15 +12047,48 @@
                 <w:b w:val="0"/>
                 <w:i/>
                 <w:color w:val="F0C040"/>
-                <w:sz w:val="13"/>
-              </w:rPr>
-              <w:t xml:space="preserve"> JMH | 10 warm-up + 10 measurement iterations | AverageTime ms/op </w:t>
+                <w:sz w:val="18"/>
+              </w:rPr>
+              <w:t xml:space="preserve">  JMH | 10 warm-up + 10 measurement iterations | AverageTime ms/op  </w:t>
+            </w:r>
+          </w:p>
+          <w:p>
+            <w:pPr>
+              <w:spacing w:before="0" w:after="0"/>
+              <w:shd w:val="clear" w:color="auto" w:fill="F0C040"/>
+            </w:pPr>
+            <w:r>
+              <w:rPr>
+                <w:b/>
+                <w:i w:val="0"/>
+                <w:color w:val="1A3A6B"/>
+                <w:sz w:val="18"/>
+              </w:rPr>
+              <w:t xml:space="preserve">  June 2026  —  Gazi University  |  Computer Engineering  </w:t>
             </w:r>
           </w:p>
         </w:tc>
+      </w:tr>
+    </w:tbl>
+    <w:p>
+      <w:r>
+        <w:br w:type="page"/>
+      </w:r>
+    </w:p>
+    <w:tbl>
+      <w:tblPr>
+        <w:tblStyle w:val="TableGrid"/>
+        <w:tblW w:type="auto" w:w="0"/>
+        <w:jc w:val="center"/>
+        <w:tblLook w:firstColumn="1" w:firstRow="1" w:lastColumn="0" w:lastRow="0" w:noHBand="0" w:noVBand="1" w:val="04A0"/>
+      </w:tblPr>
+      <w:tblGrid>
+        <w:gridCol w:w="9072"/>
+      </w:tblGrid>
+      <w:tr>
         <w:tc>
           <w:tcPr>
-            <w:tcW w:type="dxa" w:w="4422"/>
+            <w:tcW w:type="dxa" w:w="9071"/>
             <w:shd w:val="clear" w:color="auto" w:fill="1a3a6b"/>
             <w:tcBorders>
               <w:top w:val="single" w:sz="4" w:space="0" w:color="2e6db4"/>
@@ -11616,6 +12102,28 @@
           <w:p>
             <w:pPr>
               <w:spacing w:before="0" w:after="0"/>
+              <w:shd w:val="clear" w:color="auto" w:fill="F0C040"/>
+            </w:pPr>
+            <w:r>
+              <w:rPr>
+                <w:b/>
+                <w:i w:val="0"/>
+                <w:color w:val="1A3A6B"/>
+                <w:sz w:val="18"/>
+              </w:rPr>
+              <w:t xml:space="preserve">  CENG 479 — Parallel Computing  |  Slide 8 / 10  </w:t>
+            </w:r>
+          </w:p>
+          <w:p>
+            <w:pPr>
+              <w:spacing w:before="0" w:after="0"/>
+              <w:jc w:val="left"/>
+              <w:shd w:val="clear" w:color="auto" w:fill="1a3a6b"/>
+            </w:pPr>
+          </w:p>
+          <w:p>
+            <w:pPr>
+              <w:spacing w:before="0" w:after="80"/>
               <w:shd w:val="clear" w:color="auto" w:fill="0d2244"/>
             </w:pPr>
             <w:r>
@@ -11623,29 +12131,39 @@
                 <w:b/>
                 <w:i w:val="0"/>
                 <w:color w:val="F0C040"/>
-                <w:sz w:val="14"/>
-              </w:rPr>
-              <w:t xml:space="preserve"> 8 </w:t>
+                <w:sz w:val="28"/>
+              </w:rPr>
+              <w:t xml:space="preserve">  8  </w:t>
             </w:r>
             <w:r>
               <w:rPr>
                 <w:b/>
                 <w:i w:val="0"/>
                 <w:color w:val="FFFFFF"/>
-                <w:sz w:val="16"/>
-              </w:rPr>
-              <w:t xml:space="preserve">  Speedup Charts</w:t>
-            </w:r>
-          </w:p>
-          <w:p>
-            <w:pPr>
-              <w:spacing w:before="0" w:after="20"/>
+                <w:sz w:val="32"/>
+              </w:rPr>
+              <w:t xml:space="preserve">   Speedup Charts</w:t>
+            </w:r>
+          </w:p>
+          <w:p>
+            <w:pPr>
+              <w:spacing w:before="0" w:after="120"/>
               <w:shd w:val="clear" w:color="auto" w:fill="1a3a6b"/>
-            </w:pPr>
-          </w:p>
-          <w:p>
-            <w:pPr>
-              <w:spacing w:before="0" w:after="0"/>
+              <w:pBdr>
+                <w:bottom w:val="single" w:sz="12" w:space="4" w:color="F0C040"/>
+              </w:pBdr>
+            </w:pPr>
+          </w:p>
+          <w:p>
+            <w:pPr>
+              <w:spacing w:before="0" w:after="80"/>
+              <w:jc w:val="left"/>
+              <w:shd w:val="clear" w:color="auto" w:fill="1a3a6b"/>
+            </w:pPr>
+          </w:p>
+          <w:p>
+            <w:pPr>
+              <w:spacing w:before="80" w:after="80"/>
               <w:jc w:val="center"/>
               <w:shd w:val="clear" w:color="auto" w:fill="1a3a6b"/>
             </w:pPr>
@@ -11654,14 +12172,14 @@
                 <w:b w:val="0"/>
                 <w:i/>
                 <w:color w:val="AACCEE"/>
-                <w:sz w:val="14"/>
+                <w:sz w:val="20"/>
               </w:rPr>
               <w:t>GaussianBlur5x5 &amp; Sobel — near-linear scaling up to 4-5x at 8 threads</w:t>
             </w:r>
           </w:p>
           <w:p>
             <w:pPr>
-              <w:spacing w:before="0" w:after="0"/>
+              <w:spacing w:before="80" w:after="80"/>
               <w:jc w:val="center"/>
               <w:shd w:val="clear" w:color="auto" w:fill="1a3a6b"/>
             </w:pPr>
@@ -11670,14 +12188,14 @@
                 <w:b w:val="0"/>
                 <w:i/>
                 <w:color w:val="AACCEE"/>
-                <w:sz w:val="14"/>
+                <w:sz w:val="20"/>
               </w:rPr>
               <w:t>Grayscale — memory bandwidth saturation caps speedup at ~1.5x</w:t>
             </w:r>
           </w:p>
           <w:p>
             <w:pPr>
-              <w:spacing w:before="0" w:after="0"/>
+              <w:spacing w:before="80" w:after="80"/>
               <w:jc w:val="center"/>
               <w:shd w:val="clear" w:color="auto" w:fill="1a3a6b"/>
             </w:pPr>
@@ -11686,20 +12204,21 @@
                 <w:b w:val="0"/>
                 <w:i/>
                 <w:color w:val="AACCEE"/>
-                <w:sz w:val="14"/>
+                <w:sz w:val="20"/>
               </w:rPr>
               <w:t>ForkJoin advantage grows with image size (work-stealing benefit)</w:t>
             </w:r>
           </w:p>
           <w:p>
             <w:pPr>
-              <w:spacing w:before="0" w:after="20"/>
+              <w:spacing w:before="0" w:after="80"/>
+              <w:jc w:val="left"/>
               <w:shd w:val="clear" w:color="auto" w:fill="1a3a6b"/>
             </w:pPr>
           </w:p>
           <w:p>
             <w:pPr>
-              <w:spacing w:before="0" w:after="0"/>
+              <w:spacing w:before="80" w:after="80"/>
               <w:jc w:val="center"/>
               <w:shd w:val="clear" w:color="auto" w:fill="1a3a6b"/>
             </w:pPr>
@@ -11708,10 +12227,17 @@
                 <w:b w:val="0"/>
                 <w:i/>
                 <w:color w:val="AACCEE"/>
-                <w:sz w:val="14"/>
+                <w:sz w:val="20"/>
               </w:rPr>
               <w:t>[See Figures 1-4 in the report section for full charts]</w:t>
             </w:r>
+          </w:p>
+          <w:p>
+            <w:pPr>
+              <w:spacing w:before="0" w:after="160"/>
+              <w:jc w:val="left"/>
+              <w:shd w:val="clear" w:color="auto" w:fill="1a3a6b"/>
+            </w:pPr>
           </w:p>
           <w:p>
             <w:pPr>
@@ -11724,20 +12250,48 @@
                 <w:b w:val="0"/>
                 <w:i/>
                 <w:color w:val="F0C040"/>
-                <w:sz w:val="13"/>
-              </w:rPr>
-              <w:t xml:space="preserve"> Roofline Model: compute-bound = scales | memory-bound = does not </w:t>
+                <w:sz w:val="18"/>
+              </w:rPr>
+              <w:t xml:space="preserve">  Roofline Model: compute-bound = scales | memory-bound = does not  </w:t>
+            </w:r>
+          </w:p>
+          <w:p>
+            <w:pPr>
+              <w:spacing w:before="0" w:after="0"/>
+              <w:shd w:val="clear" w:color="auto" w:fill="F0C040"/>
+            </w:pPr>
+            <w:r>
+              <w:rPr>
+                <w:b/>
+                <w:i w:val="0"/>
+                <w:color w:val="1A3A6B"/>
+                <w:sz w:val="18"/>
+              </w:rPr>
+              <w:t xml:space="preserve">  June 2026  —  Gazi University  |  Computer Engineering  </w:t>
             </w:r>
           </w:p>
         </w:tc>
       </w:tr>
+    </w:tbl>
+    <w:p>
+      <w:r>
+        <w:br w:type="page"/>
+      </w:r>
+    </w:p>
+    <w:tbl>
+      <w:tblPr>
+        <w:tblStyle w:val="TableGrid"/>
+        <w:tblW w:type="auto" w:w="0"/>
+        <w:jc w:val="center"/>
+        <w:tblLook w:firstColumn="1" w:firstRow="1" w:lastColumn="0" w:lastRow="0" w:noHBand="0" w:noVBand="1" w:val="04A0"/>
+      </w:tblPr>
+      <w:tblGrid>
+        <w:gridCol w:w="9072"/>
+      </w:tblGrid>
       <w:tr>
-        <w:trPr>
-          <w:trHeight w:val="2551"/>
-        </w:trPr>
         <w:tc>
           <w:tcPr>
-            <w:tcW w:type="dxa" w:w="4422"/>
+            <w:tcW w:type="dxa" w:w="9071"/>
             <w:shd w:val="clear" w:color="auto" w:fill="1a3a6b"/>
             <w:tcBorders>
               <w:top w:val="single" w:sz="4" w:space="0" w:color="2e6db4"/>
@@ -11751,6 +12305,28 @@
           <w:p>
             <w:pPr>
               <w:spacing w:before="0" w:after="0"/>
+              <w:shd w:val="clear" w:color="auto" w:fill="F0C040"/>
+            </w:pPr>
+            <w:r>
+              <w:rPr>
+                <w:b/>
+                <w:i w:val="0"/>
+                <w:color w:val="1A3A6B"/>
+                <w:sz w:val="18"/>
+              </w:rPr>
+              <w:t xml:space="preserve">  CENG 479 — Parallel Computing  |  Slide 9 / 10  </w:t>
+            </w:r>
+          </w:p>
+          <w:p>
+            <w:pPr>
+              <w:spacing w:before="0" w:after="0"/>
+              <w:jc w:val="left"/>
+              <w:shd w:val="clear" w:color="auto" w:fill="1a3a6b"/>
+            </w:pPr>
+          </w:p>
+          <w:p>
+            <w:pPr>
+              <w:spacing w:before="0" w:after="80"/>
               <w:shd w:val="clear" w:color="auto" w:fill="0d2244"/>
             </w:pPr>
             <w:r>
@@ -11758,49 +12334,58 @@
                 <w:b/>
                 <w:i w:val="0"/>
                 <w:color w:val="F0C040"/>
-                <w:sz w:val="14"/>
-              </w:rPr>
-              <w:t xml:space="preserve"> 9 </w:t>
+                <w:sz w:val="28"/>
+              </w:rPr>
+              <w:t xml:space="preserve">  9  </w:t>
             </w:r>
             <w:r>
               <w:rPr>
                 <w:b/>
                 <w:i w:val="0"/>
                 <w:color w:val="FFFFFF"/>
-                <w:sz w:val="16"/>
-              </w:rPr>
-              <w:t xml:space="preserve">  Challenges &amp; Key Findings</w:t>
-            </w:r>
-          </w:p>
-          <w:p>
-            <w:pPr>
-              <w:spacing w:before="0" w:after="0"/>
-              <w:ind w:left="227"/>
+                <w:sz w:val="32"/>
+              </w:rPr>
+              <w:t xml:space="preserve">   Challenges &amp; Key Findings</w:t>
+            </w:r>
+          </w:p>
+          <w:p>
+            <w:pPr>
+              <w:spacing w:before="0" w:after="120"/>
               <w:shd w:val="clear" w:color="auto" w:fill="1a3a6b"/>
+              <w:pBdr>
+                <w:bottom w:val="single" w:sz="12" w:space="4" w:color="F0C040"/>
+              </w:pBdr>
+            </w:pPr>
+          </w:p>
+          <w:p>
+            <w:pPr>
+              <w:spacing w:before="0" w:after="80"/>
+              <w:ind w:left="680"/>
+              <w:shd w:val="clear" w:color="auto" w:fill="1a3a6b"/>
             </w:pPr>
             <w:r>
               <w:rPr>
                 <w:b w:val="0"/>
                 <w:i w:val="0"/>
                 <w:color w:val="F0C040"/>
-                <w:sz w:val="15"/>
-              </w:rPr>
-              <w:t xml:space="preserve">• </w:t>
+                <w:sz w:val="22"/>
+              </w:rPr>
+              <w:t xml:space="preserve">●  </w:t>
             </w:r>
             <w:r>
               <w:rPr>
                 <w:b w:val="0"/>
                 <w:i w:val="0"/>
                 <w:color w:val="FFFFFF"/>
-                <w:sz w:val="15"/>
+                <w:sz w:val="22"/>
               </w:rPr>
               <w:t>JIT warm-up noise — solved with JMH (fork-per-config, 10 warm-up iters)</w:t>
             </w:r>
           </w:p>
           <w:p>
             <w:pPr>
-              <w:spacing w:before="0" w:after="0"/>
-              <w:ind w:left="227"/>
+              <w:spacing w:before="0" w:after="80"/>
+              <w:ind w:left="680"/>
               <w:shd w:val="clear" w:color="auto" w:fill="1a3a6b"/>
             </w:pPr>
             <w:r>
@@ -11808,24 +12393,24 @@
                 <w:b w:val="0"/>
                 <w:i w:val="0"/>
                 <w:color w:val="F0C040"/>
-                <w:sz w:val="15"/>
-              </w:rPr>
-              <w:t xml:space="preserve">• </w:t>
+                <w:sz w:val="22"/>
+              </w:rPr>
+              <w:t xml:space="preserve">●  </w:t>
             </w:r>
             <w:r>
               <w:rPr>
                 <w:b w:val="0"/>
                 <w:i w:val="0"/>
                 <w:color w:val="FFFFFF"/>
-                <w:sz w:val="15"/>
+                <w:sz w:val="22"/>
               </w:rPr>
               <w:t>Correctness — clamped edges + pixel-for-pixel CorrectnessVerifier</w:t>
             </w:r>
           </w:p>
           <w:p>
             <w:pPr>
-              <w:spacing w:before="0" w:after="0"/>
-              <w:ind w:left="227"/>
+              <w:spacing w:before="0" w:after="80"/>
+              <w:ind w:left="680"/>
               <w:shd w:val="clear" w:color="auto" w:fill="1a3a6b"/>
             </w:pPr>
             <w:r>
@@ -11833,24 +12418,24 @@
                 <w:b w:val="0"/>
                 <w:i w:val="0"/>
                 <w:color w:val="F0C040"/>
-                <w:sz w:val="15"/>
-              </w:rPr>
-              <w:t xml:space="preserve">• </w:t>
+                <w:sz w:val="22"/>
+              </w:rPr>
+              <w:t xml:space="preserve">●  </w:t>
             </w:r>
             <w:r>
               <w:rPr>
                 <w:b w:val="0"/>
                 <w:i w:val="0"/>
                 <w:color w:val="FFFFFF"/>
-                <w:sz w:val="15"/>
+                <w:sz w:val="22"/>
               </w:rPr>
               <w:t>Grayscale bottleneck — memory bandwidth saturated (Roofline Model)</w:t>
             </w:r>
           </w:p>
           <w:p>
             <w:pPr>
-              <w:spacing w:before="0" w:after="0"/>
-              <w:ind w:left="227"/>
+              <w:spacing w:before="0" w:after="80"/>
+              <w:ind w:left="680"/>
               <w:shd w:val="clear" w:color="auto" w:fill="1a3a6b"/>
             </w:pPr>
             <w:r>
@@ -11858,29 +12443,30 @@
                 <w:b w:val="0"/>
                 <w:i w:val="0"/>
                 <w:color w:val="F0C040"/>
-                <w:sz w:val="15"/>
-              </w:rPr>
-              <w:t xml:space="preserve">• </w:t>
+                <w:sz w:val="22"/>
+              </w:rPr>
+              <w:t xml:space="preserve">●  </w:t>
             </w:r>
             <w:r>
               <w:rPr>
                 <w:b w:val="0"/>
                 <w:i w:val="0"/>
                 <w:color w:val="FFFFFF"/>
-                <w:sz w:val="15"/>
+                <w:sz w:val="22"/>
               </w:rPr>
               <w:t>ForkJoin overhead on small images — tuned threshold to 64 rows</w:t>
             </w:r>
           </w:p>
           <w:p>
             <w:pPr>
-              <w:spacing w:before="0" w:after="20"/>
+              <w:spacing w:before="0" w:after="80"/>
+              <w:jc w:val="left"/>
               <w:shd w:val="clear" w:color="auto" w:fill="1a3a6b"/>
             </w:pPr>
           </w:p>
           <w:p>
             <w:pPr>
-              <w:spacing w:before="0" w:after="0"/>
+              <w:spacing w:before="80" w:after="80"/>
               <w:jc w:val="center"/>
               <w:shd w:val="clear" w:color="auto" w:fill="1a3a6b"/>
             </w:pPr>
@@ -11889,10 +12475,17 @@
                 <w:b w:val="0"/>
                 <w:i/>
                 <w:color w:val="AACCEE"/>
-                <w:sz w:val="14"/>
+                <w:sz w:val="20"/>
               </w:rPr>
               <w:t>Key insight: speedup is FILTER-DEPENDENT — arithmetic intensity determines scalability</w:t>
             </w:r>
+          </w:p>
+          <w:p>
+            <w:pPr>
+              <w:spacing w:before="0" w:after="160"/>
+              <w:jc w:val="left"/>
+              <w:shd w:val="clear" w:color="auto" w:fill="1a3a6b"/>
+            </w:pPr>
           </w:p>
           <w:p>
             <w:pPr>
@@ -11905,15 +12498,48 @@
                 <w:b w:val="0"/>
                 <w:i/>
                 <w:color w:val="F0C040"/>
-                <w:sz w:val="13"/>
-              </w:rPr>
-              <w:t xml:space="preserve"> Benchmark: 12 logical cores, JDK 17, Maven 3.6 </w:t>
+                <w:sz w:val="18"/>
+              </w:rPr>
+              <w:t xml:space="preserve">  Benchmark: 12 logical cores, JDK 17, Maven 3.6  </w:t>
+            </w:r>
+          </w:p>
+          <w:p>
+            <w:pPr>
+              <w:spacing w:before="0" w:after="0"/>
+              <w:shd w:val="clear" w:color="auto" w:fill="F0C040"/>
+            </w:pPr>
+            <w:r>
+              <w:rPr>
+                <w:b/>
+                <w:i w:val="0"/>
+                <w:color w:val="1A3A6B"/>
+                <w:sz w:val="18"/>
+              </w:rPr>
+              <w:t xml:space="preserve">  June 2026  —  Gazi University  |  Computer Engineering  </w:t>
             </w:r>
           </w:p>
         </w:tc>
+      </w:tr>
+    </w:tbl>
+    <w:p>
+      <w:r>
+        <w:br w:type="page"/>
+      </w:r>
+    </w:p>
+    <w:tbl>
+      <w:tblPr>
+        <w:tblStyle w:val="TableGrid"/>
+        <w:tblW w:type="auto" w:w="0"/>
+        <w:jc w:val="center"/>
+        <w:tblLook w:firstColumn="1" w:firstRow="1" w:lastColumn="0" w:lastRow="0" w:noHBand="0" w:noVBand="1" w:val="04A0"/>
+      </w:tblPr>
+      <w:tblGrid>
+        <w:gridCol w:w="9072"/>
+      </w:tblGrid>
+      <w:tr>
         <w:tc>
           <w:tcPr>
-            <w:tcW w:type="dxa" w:w="4422"/>
+            <w:tcW w:type="dxa" w:w="9071"/>
             <w:shd w:val="clear" w:color="auto" w:fill="1a3a6b"/>
             <w:tcBorders>
               <w:top w:val="single" w:sz="4" w:space="0" w:color="2e6db4"/>
@@ -11927,6 +12553,28 @@
           <w:p>
             <w:pPr>
               <w:spacing w:before="0" w:after="0"/>
+              <w:shd w:val="clear" w:color="auto" w:fill="F0C040"/>
+            </w:pPr>
+            <w:r>
+              <w:rPr>
+                <w:b/>
+                <w:i w:val="0"/>
+                <w:color w:val="1A3A6B"/>
+                <w:sz w:val="18"/>
+              </w:rPr>
+              <w:t xml:space="preserve">  CENG 479 — Parallel Computing  |  Slide 10 / 10  </w:t>
+            </w:r>
+          </w:p>
+          <w:p>
+            <w:pPr>
+              <w:spacing w:before="0" w:after="0"/>
+              <w:jc w:val="left"/>
+              <w:shd w:val="clear" w:color="auto" w:fill="1a3a6b"/>
+            </w:pPr>
+          </w:p>
+          <w:p>
+            <w:pPr>
+              <w:spacing w:before="0" w:after="80"/>
               <w:shd w:val="clear" w:color="auto" w:fill="0d2244"/>
             </w:pPr>
             <w:r>
@@ -11934,49 +12582,58 @@
                 <w:b/>
                 <w:i w:val="0"/>
                 <w:color w:val="F0C040"/>
-                <w:sz w:val="14"/>
-              </w:rPr>
-              <w:t xml:space="preserve"> 10 </w:t>
+                <w:sz w:val="28"/>
+              </w:rPr>
+              <w:t xml:space="preserve">  10  </w:t>
             </w:r>
             <w:r>
               <w:rPr>
                 <w:b/>
                 <w:i w:val="0"/>
                 <w:color w:val="FFFFFF"/>
-                <w:sz w:val="16"/>
-              </w:rPr>
-              <w:t xml:space="preserve">  Conclusion &amp; Future Work</w:t>
-            </w:r>
-          </w:p>
-          <w:p>
-            <w:pPr>
-              <w:spacing w:before="0" w:after="0"/>
-              <w:ind w:left="227"/>
+                <w:sz w:val="32"/>
+              </w:rPr>
+              <w:t xml:space="preserve">   Conclusion &amp; Future Work</w:t>
+            </w:r>
+          </w:p>
+          <w:p>
+            <w:pPr>
+              <w:spacing w:before="0" w:after="120"/>
               <w:shd w:val="clear" w:color="auto" w:fill="1a3a6b"/>
+              <w:pBdr>
+                <w:bottom w:val="single" w:sz="12" w:space="4" w:color="F0C040"/>
+              </w:pBdr>
+            </w:pPr>
+          </w:p>
+          <w:p>
+            <w:pPr>
+              <w:spacing w:before="0" w:after="80"/>
+              <w:ind w:left="680"/>
+              <w:shd w:val="clear" w:color="auto" w:fill="1a3a6b"/>
             </w:pPr>
             <w:r>
               <w:rPr>
                 <w:b w:val="0"/>
                 <w:i w:val="0"/>
                 <w:color w:val="F0C040"/>
-                <w:sz w:val="15"/>
-              </w:rPr>
-              <w:t xml:space="preserve">• </w:t>
+                <w:sz w:val="22"/>
+              </w:rPr>
+              <w:t xml:space="preserve">●  </w:t>
             </w:r>
             <w:r>
               <w:rPr>
                 <w:b w:val="0"/>
                 <w:i w:val="0"/>
                 <w:color w:val="FFFFFF"/>
-                <w:sz w:val="15"/>
+                <w:sz w:val="22"/>
               </w:rPr>
               <w:t>Parallelised 3 convolution filters with 2 Java concurrency strategies</w:t>
             </w:r>
           </w:p>
           <w:p>
             <w:pPr>
-              <w:spacing w:before="0" w:after="0"/>
-              <w:ind w:left="227"/>
+              <w:spacing w:before="0" w:after="80"/>
+              <w:ind w:left="680"/>
               <w:shd w:val="clear" w:color="auto" w:fill="1a3a6b"/>
             </w:pPr>
             <w:r>
@@ -11984,24 +12641,24 @@
                 <w:b w:val="0"/>
                 <w:i w:val="0"/>
                 <w:color w:val="F0C040"/>
-                <w:sz w:val="15"/>
-              </w:rPr>
-              <w:t xml:space="preserve">• </w:t>
+                <w:sz w:val="22"/>
+              </w:rPr>
+              <w:t xml:space="preserve">●  </w:t>
             </w:r>
             <w:r>
               <w:rPr>
                 <w:b w:val="0"/>
                 <w:i w:val="0"/>
                 <w:color w:val="FFFFFF"/>
-                <w:sz w:val="15"/>
+                <w:sz w:val="22"/>
               </w:rPr>
               <w:t>Up to 5.10x speedup (Sobel, ForkJoin, 8 threads, 2048x2048)</w:t>
             </w:r>
           </w:p>
           <w:p>
             <w:pPr>
-              <w:spacing w:before="0" w:after="0"/>
-              <w:ind w:left="227"/>
+              <w:spacing w:before="0" w:after="80"/>
+              <w:ind w:left="680"/>
               <w:shd w:val="clear" w:color="auto" w:fill="1a3a6b"/>
             </w:pPr>
             <w:r>
@@ -12009,24 +12666,24 @@
                 <w:b w:val="0"/>
                 <w:i w:val="0"/>
                 <w:color w:val="F0C040"/>
-                <w:sz w:val="15"/>
-              </w:rPr>
-              <w:t xml:space="preserve">• </w:t>
+                <w:sz w:val="22"/>
+              </w:rPr>
+              <w:t xml:space="preserve">●  </w:t>
             </w:r>
             <w:r>
               <w:rPr>
                 <w:b w:val="0"/>
                 <w:i w:val="0"/>
                 <w:color w:val="FFFFFF"/>
-                <w:sz w:val="15"/>
+                <w:sz w:val="22"/>
               </w:rPr>
               <w:t>Memory-bound filters need different strategy (not thread-level parallelism)</w:t>
             </w:r>
           </w:p>
           <w:p>
             <w:pPr>
-              <w:spacing w:before="0" w:after="0"/>
-              <w:ind w:left="113"/>
+              <w:spacing w:before="120" w:after="40"/>
+              <w:ind w:left="340"/>
               <w:shd w:val="clear" w:color="auto" w:fill="1a3a6b"/>
             </w:pPr>
             <w:r>
@@ -12034,15 +12691,15 @@
                 <w:b/>
                 <w:i w:val="0"/>
                 <w:color w:val="F0C040"/>
-                <w:sz w:val="15"/>
+                <w:sz w:val="22"/>
               </w:rPr>
               <w:t>Future Work:</w:t>
             </w:r>
           </w:p>
           <w:p>
             <w:pPr>
-              <w:spacing w:before="0" w:after="0"/>
-              <w:ind w:left="227"/>
+              <w:spacing w:before="0" w:after="80"/>
+              <w:ind w:left="680"/>
               <w:shd w:val="clear" w:color="auto" w:fill="1a3a6b"/>
             </w:pPr>
             <w:r>
@@ -12050,24 +12707,24 @@
                 <w:b w:val="0"/>
                 <w:i w:val="0"/>
                 <w:color w:val="F0C040"/>
-                <w:sz w:val="15"/>
-              </w:rPr>
-              <w:t xml:space="preserve">• </w:t>
+                <w:sz w:val="22"/>
+              </w:rPr>
+              <w:t xml:space="preserve">●  </w:t>
             </w:r>
             <w:r>
               <w:rPr>
                 <w:b w:val="0"/>
                 <w:i w:val="0"/>
                 <w:color w:val="FFFFFF"/>
-                <w:sz w:val="15"/>
+                <w:sz w:val="22"/>
               </w:rPr>
               <w:t>GPU/CUDA — thousands of concurrent cores for pixel-independent kernels</w:t>
             </w:r>
           </w:p>
           <w:p>
             <w:pPr>
-              <w:spacing w:before="0" w:after="0"/>
-              <w:ind w:left="227"/>
+              <w:spacing w:before="0" w:after="80"/>
+              <w:ind w:left="680"/>
               <w:shd w:val="clear" w:color="auto" w:fill="1a3a6b"/>
             </w:pPr>
             <w:r>
@@ -12075,24 +12732,24 @@
                 <w:b w:val="0"/>
                 <w:i w:val="0"/>
                 <w:color w:val="F0C040"/>
-                <w:sz w:val="15"/>
-              </w:rPr>
-              <w:t xml:space="preserve">• </w:t>
+                <w:sz w:val="22"/>
+              </w:rPr>
+              <w:t xml:space="preserve">●  </w:t>
             </w:r>
             <w:r>
               <w:rPr>
                 <w:b w:val="0"/>
                 <w:i w:val="0"/>
                 <w:color w:val="FFFFFF"/>
-                <w:sz w:val="15"/>
+                <w:sz w:val="22"/>
               </w:rPr>
               <w:t>SIMD vectorisation (AVX2/AVX-512) for intra-core throughput</w:t>
             </w:r>
           </w:p>
           <w:p>
             <w:pPr>
-              <w:spacing w:before="0" w:after="0"/>
-              <w:ind w:left="227"/>
+              <w:spacing w:before="0" w:after="80"/>
+              <w:ind w:left="680"/>
               <w:shd w:val="clear" w:color="auto" w:fill="1a3a6b"/>
             </w:pPr>
             <w:r>
@@ -12100,19 +12757,26 @@
                 <w:b w:val="0"/>
                 <w:i w:val="0"/>
                 <w:color w:val="F0C040"/>
-                <w:sz w:val="15"/>
-              </w:rPr>
-              <w:t xml:space="preserve">• </w:t>
+                <w:sz w:val="22"/>
+              </w:rPr>
+              <w:t xml:space="preserve">●  </w:t>
             </w:r>
             <w:r>
               <w:rPr>
                 <w:b w:val="0"/>
                 <w:i w:val="0"/>
                 <w:color w:val="FFFFFF"/>
-                <w:sz w:val="15"/>
+                <w:sz w:val="22"/>
               </w:rPr>
               <w:t>Adaptive thread pool — dynamic tuning per image size and hardware</w:t>
             </w:r>
+          </w:p>
+          <w:p>
+            <w:pPr>
+              <w:spacing w:before="0" w:after="160"/>
+              <w:jc w:val="left"/>
+              <w:shd w:val="clear" w:color="auto" w:fill="1a3a6b"/>
+            </w:pPr>
           </w:p>
           <w:p>
             <w:pPr>
@@ -12125,9 +12789,24 @@
                 <w:b w:val="0"/>
                 <w:i/>
                 <w:color w:val="F0C040"/>
-                <w:sz w:val="13"/>
-              </w:rPr>
-              <w:t xml:space="preserve"> https://github.com/Muhammedcakirgoz/parallel-image-processing </w:t>
+                <w:sz w:val="18"/>
+              </w:rPr>
+              <w:t xml:space="preserve">  https://github.com/Muhammedcakirgoz/parallel-image-processing  </w:t>
+            </w:r>
+          </w:p>
+          <w:p>
+            <w:pPr>
+              <w:spacing w:before="0" w:after="0"/>
+              <w:shd w:val="clear" w:color="auto" w:fill="F0C040"/>
+            </w:pPr>
+            <w:r>
+              <w:rPr>
+                <w:b/>
+                <w:i w:val="0"/>
+                <w:color w:val="1A3A6B"/>
+                <w:sz w:val="18"/>
+              </w:rPr>
+              <w:t xml:space="preserve">  June 2026  —  Gazi University  |  Computer Engineering  </w:t>
             </w:r>
           </w:p>
         </w:tc>

</xml_diff>